<commit_message>
New fonts (Drogolin titles, FrankRuehl DP text, Livorna lead word), no stray lines, authors with הרב
- fonts: prepare_fonts.py builds Unicode / geresh-fixed copies of the client's fonts (not committed); Word: ASCII quotes, Arial for × √
- engine: strict widow / orphan rules everywhere (no relaxed mode), a last line never holds a single word, no forced column break,
  pages may end right after a table; build.js checks stray lines (all 0)
- running head: whole words only, no ellipsis, never ends on a dangling word; explicit short title for the long one
- authors: "הרב" before every author without a title; Livorna bold first word (synthetic bold), fontWeights per role

Co-Authored-By: Claude Sonnet 5.5 <noreply@anthropic.com>
Claude-Session: https://claude.ai/code/session_0161ijXJJcwCxR7y44e5HXLU
</commit_message>
<xml_diff>
--- a/output/doch-shiluv-chavurot.docx
+++ b/output/doch-shiluv-chavurot.docx
@@ -208,7 +208,7 @@
                 <w:sz w:val="19"/>
                 <w:rtl/>
               </w:rPr>
-              <w:t>74</w:t>
+              <w:t>71</w:t>
             </w:r>
           </w:p>
         </w:tc>
@@ -335,7 +335,7 @@
                 <w:sz w:val="19"/>
                 <w:rtl/>
               </w:rPr>
-              <w:t>94</w:t>
+              <w:t>91</w:t>
             </w:r>
           </w:p>
         </w:tc>
@@ -463,7 +463,7 @@
                 <w:sz w:val="19"/>
                 <w:rtl/>
               </w:rPr>
-              <w:t>159</w:t>
+              <w:t>151</w:t>
             </w:r>
           </w:p>
         </w:tc>
@@ -526,7 +526,7 @@
                 <w:sz w:val="19"/>
                 <w:rtl/>
               </w:rPr>
-              <w:t>אברהם יהונתן ניסן שליט״א</w:t>
+              <w:t>הרב אברהם יהונתן ניסן שליט״א</w:t>
             </w:r>
           </w:p>
         </w:tc>
@@ -590,7 +590,7 @@
                 <w:sz w:val="19"/>
                 <w:rtl/>
               </w:rPr>
-              <w:t>162</w:t>
+              <w:t>154</w:t>
             </w:r>
           </w:p>
         </w:tc>
@@ -653,7 +653,7 @@
                 <w:sz w:val="19"/>
                 <w:rtl/>
               </w:rPr>
-              <w:t>אברהם יהונתן ניסן שליט״א</w:t>
+              <w:t>הרב אברהם יהונתן ניסן שליט״א</w:t>
             </w:r>
           </w:p>
         </w:tc>
@@ -717,7 +717,7 @@
                 <w:sz w:val="19"/>
                 <w:rtl/>
               </w:rPr>
-              <w:t>164</w:t>
+              <w:t>156</w:t>
             </w:r>
           </w:p>
         </w:tc>
@@ -780,7 +780,7 @@
                 <w:sz w:val="19"/>
                 <w:rtl/>
               </w:rPr>
-              <w:t>נח קליין שליט״א</w:t>
+              <w:t>הרב נח קליין שליט״א</w:t>
             </w:r>
           </w:p>
         </w:tc>
@@ -844,7 +844,7 @@
                 <w:sz w:val="19"/>
                 <w:rtl/>
               </w:rPr>
-              <w:t>167</w:t>
+              <w:t>159</w:t>
             </w:r>
           </w:p>
         </w:tc>
@@ -971,7 +971,7 @@
                 <w:sz w:val="19"/>
                 <w:rtl/>
               </w:rPr>
-              <w:t>171</w:t>
+              <w:t>163</w:t>
             </w:r>
           </w:p>
         </w:tc>
@@ -1099,7 +1099,7 @@
                 <w:sz w:val="19"/>
                 <w:rtl/>
               </w:rPr>
-              <w:t>185</w:t>
+              <w:t>177</w:t>
             </w:r>
           </w:p>
         </w:tc>
@@ -1162,7 +1162,7 @@
                 <w:sz w:val="19"/>
                 <w:rtl/>
               </w:rPr>
-              <w:t>אלרועי משה דדוש שליט״א</w:t>
+              <w:t>הרב אלרועי משה דדוש שליט״א</w:t>
             </w:r>
           </w:p>
         </w:tc>
@@ -1227,7 +1227,7 @@
                 <w:sz w:val="19"/>
                 <w:rtl/>
               </w:rPr>
-              <w:t>187</w:t>
+              <w:t>179</w:t>
             </w:r>
           </w:p>
         </w:tc>
@@ -1290,7 +1290,7 @@
                 <w:sz w:val="19"/>
                 <w:rtl/>
               </w:rPr>
-              <w:t>אליעזר רוטנברג שליט״א</w:t>
+              <w:t>הרב אליעזר רוטנברג שליט״א</w:t>
             </w:r>
           </w:p>
         </w:tc>
@@ -1354,7 +1354,7 @@
                 <w:sz w:val="19"/>
                 <w:rtl/>
               </w:rPr>
-              <w:t>190</w:t>
+              <w:t>182</w:t>
             </w:r>
           </w:p>
         </w:tc>
@@ -1417,7 +1417,7 @@
                 <w:sz w:val="19"/>
                 <w:rtl/>
               </w:rPr>
-              <w:t>אליעזר רוטנברג שליט״א</w:t>
+              <w:t>הרב אליעזר רוטנברג שליט״א</w:t>
             </w:r>
           </w:p>
         </w:tc>
@@ -1481,7 +1481,7 @@
                 <w:sz w:val="19"/>
                 <w:rtl/>
               </w:rPr>
-              <w:t>192</w:t>
+              <w:t>184</w:t>
             </w:r>
           </w:p>
         </w:tc>
@@ -1608,7 +1608,7 @@
                 <w:sz w:val="19"/>
                 <w:rtl/>
               </w:rPr>
-              <w:t>195</w:t>
+              <w:t>187</w:t>
             </w:r>
           </w:p>
         </w:tc>
@@ -1736,7 +1736,7 @@
                 <w:sz w:val="19"/>
                 <w:rtl/>
               </w:rPr>
-              <w:t>200</w:t>
+              <w:t>192</w:t>
             </w:r>
           </w:p>
         </w:tc>
@@ -1799,7 +1799,7 @@
                 <w:sz w:val="19"/>
                 <w:rtl/>
               </w:rPr>
-              <w:t>אלרועי משה דדוש שליט״א</w:t>
+              <w:t>הרב אלרועי משה דדוש שליט״א</w:t>
             </w:r>
           </w:p>
         </w:tc>
@@ -1863,7 +1863,7 @@
                 <w:sz w:val="19"/>
                 <w:rtl/>
               </w:rPr>
-              <w:t>202</w:t>
+              <w:t>194</w:t>
             </w:r>
           </w:p>
         </w:tc>
@@ -1926,7 +1926,7 @@
                 <w:sz w:val="19"/>
                 <w:rtl/>
               </w:rPr>
-              <w:t>אליעזר רוטנברג שליט״א</w:t>
+              <w:t>הרב אליעזר רוטנברג שליט״א</w:t>
             </w:r>
           </w:p>
         </w:tc>
@@ -1990,7 +1990,7 @@
                 <w:sz w:val="19"/>
                 <w:rtl/>
               </w:rPr>
-              <w:t>203</w:t>
+              <w:t>195</w:t>
             </w:r>
           </w:p>
         </w:tc>
@@ -2053,7 +2053,7 @@
                 <w:sz w:val="19"/>
                 <w:rtl/>
               </w:rPr>
-              <w:t>אברהם גוטמן שליט״א</w:t>
+              <w:t>הרב אברהם גוטמן שליט״א</w:t>
             </w:r>
           </w:p>
         </w:tc>
@@ -2117,7 +2117,7 @@
                 <w:sz w:val="19"/>
                 <w:rtl/>
               </w:rPr>
-              <w:t>278</w:t>
+              <w:t>268</w:t>
             </w:r>
           </w:p>
         </w:tc>
@@ -2245,7 +2245,7 @@
                 <w:sz w:val="19"/>
                 <w:rtl/>
               </w:rPr>
-              <w:t>282</w:t>
+              <w:t>272</w:t>
             </w:r>
           </w:p>
         </w:tc>
@@ -2373,7 +2373,7 @@
                 <w:sz w:val="19"/>
                 <w:rtl/>
               </w:rPr>
-              <w:t>286</w:t>
+              <w:t>276</w:t>
             </w:r>
           </w:p>
         </w:tc>
@@ -2501,7 +2501,7 @@
                 <w:sz w:val="19"/>
                 <w:rtl/>
               </w:rPr>
-              <w:t>289</w:t>
+              <w:t>279</w:t>
             </w:r>
           </w:p>
         </w:tc>
@@ -2629,7 +2629,7 @@
                 <w:sz w:val="19"/>
                 <w:rtl/>
               </w:rPr>
-              <w:t>302</w:t>
+              <w:t>292</w:t>
             </w:r>
           </w:p>
         </w:tc>
@@ -2692,7 +2692,7 @@
                 <w:sz w:val="19"/>
                 <w:rtl/>
               </w:rPr>
-              <w:t>משה דוד הופט שליט״א</w:t>
+              <w:t>הרב משה דוד הופט שליט״א</w:t>
             </w:r>
           </w:p>
         </w:tc>
@@ -2757,7 +2757,7 @@
                 <w:sz w:val="19"/>
                 <w:rtl/>
               </w:rPr>
-              <w:t>307</w:t>
+              <w:t>297</w:t>
             </w:r>
           </w:p>
         </w:tc>
@@ -2820,7 +2820,7 @@
                 <w:sz w:val="19"/>
                 <w:rtl/>
               </w:rPr>
-              <w:t>משה דוד הופט שליט״א</w:t>
+              <w:t>הרב משה דוד הופט שליט״א</w:t>
             </w:r>
           </w:p>
         </w:tc>
@@ -2884,7 +2884,7 @@
                 <w:sz w:val="19"/>
                 <w:rtl/>
               </w:rPr>
-              <w:t>311</w:t>
+              <w:t>301</w:t>
             </w:r>
           </w:p>
         </w:tc>
@@ -2947,7 +2947,7 @@
                 <w:sz w:val="19"/>
                 <w:rtl/>
               </w:rPr>
-              <w:t>יעקב גדליהו אייזנשטיין שליט״א</w:t>
+              <w:t>הרב יעקב גדליהו אייזנשטיין שליט״א</w:t>
             </w:r>
           </w:p>
         </w:tc>
@@ -3011,7 +3011,7 @@
                 <w:sz w:val="19"/>
                 <w:rtl/>
               </w:rPr>
-              <w:t>317</w:t>
+              <w:t>307</w:t>
             </w:r>
           </w:p>
         </w:tc>
@@ -3074,7 +3074,7 @@
                 <w:sz w:val="19"/>
                 <w:rtl/>
               </w:rPr>
-              <w:t>יעקב גדליהו אייזנשטיין שליט״א</w:t>
+              <w:t>הרב יעקב גדליהו אייזנשטיין שליט״א</w:t>
             </w:r>
           </w:p>
         </w:tc>
@@ -3138,7 +3138,7 @@
                 <w:sz w:val="19"/>
                 <w:rtl/>
               </w:rPr>
-              <w:t>323</w:t>
+              <w:t>312</w:t>
             </w:r>
           </w:p>
         </w:tc>
@@ -3201,7 +3201,7 @@
                 <w:sz w:val="19"/>
                 <w:rtl/>
               </w:rPr>
-              <w:t>משה דוד הופט שליט״א</w:t>
+              <w:t>הרב משה דוד הופט שליט״א</w:t>
             </w:r>
           </w:p>
         </w:tc>
@@ -3265,7 +3265,7 @@
                 <w:sz w:val="19"/>
                 <w:rtl/>
               </w:rPr>
-              <w:t>329</w:t>
+              <w:t>318</w:t>
             </w:r>
           </w:p>
         </w:tc>
@@ -3328,7 +3328,7 @@
                 <w:sz w:val="19"/>
                 <w:rtl/>
               </w:rPr>
-              <w:t>אברהם יהונתן ניסן שליט״א</w:t>
+              <w:t>הרב אברהם יהונתן ניסן שליט״א</w:t>
             </w:r>
           </w:p>
         </w:tc>
@@ -3392,7 +3392,7 @@
                 <w:sz w:val="19"/>
                 <w:rtl/>
               </w:rPr>
-              <w:t>340</w:t>
+              <w:t>328</w:t>
             </w:r>
           </w:p>
         </w:tc>
@@ -3455,7 +3455,7 @@
                 <w:sz w:val="19"/>
                 <w:rtl/>
               </w:rPr>
-              <w:t>יעקב ישראל שטרן שליט״א</w:t>
+              <w:t>הרב יעקב ישראל שטרן שליט״א</w:t>
             </w:r>
           </w:p>
         </w:tc>
@@ -3519,7 +3519,7 @@
                 <w:sz w:val="19"/>
                 <w:rtl/>
               </w:rPr>
-              <w:t>346</w:t>
+              <w:t>334</w:t>
             </w:r>
           </w:p>
         </w:tc>
@@ -3646,7 +3646,7 @@
                 <w:sz w:val="19"/>
                 <w:rtl/>
               </w:rPr>
-              <w:t>358</w:t>
+              <w:t>345</w:t>
             </w:r>
           </w:p>
         </w:tc>
@@ -3773,7 +3773,7 @@
                 <w:sz w:val="19"/>
                 <w:rtl/>
               </w:rPr>
-              <w:t>370</w:t>
+              <w:t>356</w:t>
             </w:r>
           </w:p>
         </w:tc>
@@ -3836,7 +3836,7 @@
                 <w:sz w:val="19"/>
                 <w:rtl/>
               </w:rPr>
-              <w:t>משה דוד הופט שליט״א</w:t>
+              <w:t>הרב משה דוד הופט שליט״א</w:t>
             </w:r>
           </w:p>
         </w:tc>
@@ -3900,7 +3900,7 @@
                 <w:sz w:val="19"/>
                 <w:rtl/>
               </w:rPr>
-              <w:t>373</w:t>
+              <w:t>359</w:t>
             </w:r>
           </w:p>
         </w:tc>
@@ -4028,7 +4028,7 @@
                 <w:sz w:val="19"/>
                 <w:rtl/>
               </w:rPr>
-              <w:t>388</w:t>
+              <w:t>373</w:t>
             </w:r>
           </w:p>
         </w:tc>
@@ -4091,7 +4091,7 @@
                 <w:sz w:val="19"/>
                 <w:rtl/>
               </w:rPr>
-              <w:t>עזרא בטאט שליט״א</w:t>
+              <w:t>הרב עזרא בטאט שליט״א</w:t>
             </w:r>
           </w:p>
         </w:tc>
@@ -4155,7 +4155,7 @@
                 <w:sz w:val="19"/>
                 <w:rtl/>
               </w:rPr>
-              <w:t>392</w:t>
+              <w:t>377</w:t>
             </w:r>
           </w:p>
         </w:tc>
@@ -4218,7 +4218,7 @@
                 <w:sz w:val="19"/>
                 <w:rtl/>
               </w:rPr>
-              <w:t>אברהם יהונתן ניסן שליט״א</w:t>
+              <w:t>הרב אברהם יהונתן ניסן שליט״א</w:t>
             </w:r>
           </w:p>
         </w:tc>
@@ -4283,7 +4283,7 @@
                 <w:sz w:val="19"/>
                 <w:rtl/>
               </w:rPr>
-              <w:t>395</w:t>
+              <w:t>380</w:t>
             </w:r>
           </w:p>
         </w:tc>
@@ -4346,7 +4346,7 @@
                 <w:sz w:val="19"/>
                 <w:rtl/>
               </w:rPr>
-              <w:t>עזרא בטאט שליט״א</w:t>
+              <w:t>הרב עזרא בטאט שליט״א</w:t>
             </w:r>
           </w:p>
         </w:tc>
@@ -4410,7 +4410,7 @@
                 <w:sz w:val="19"/>
                 <w:rtl/>
               </w:rPr>
-              <w:t>399</w:t>
+              <w:t>384</w:t>
             </w:r>
           </w:p>
         </w:tc>
@@ -4538,7 +4538,7 @@
                 <w:sz w:val="19"/>
                 <w:rtl/>
               </w:rPr>
-              <w:t>402</w:t>
+              <w:t>387</w:t>
             </w:r>
           </w:p>
         </w:tc>
@@ -4601,7 +4601,7 @@
                 <w:sz w:val="19"/>
                 <w:rtl/>
               </w:rPr>
-              <w:t>נח קליין שליט״א</w:t>
+              <w:t>הרב נח קליין שליט״א</w:t>
             </w:r>
           </w:p>
         </w:tc>
@@ -4665,7 +4665,7 @@
                 <w:sz w:val="19"/>
                 <w:rtl/>
               </w:rPr>
-              <w:t>405</w:t>
+              <w:t>390</w:t>
             </w:r>
           </w:p>
         </w:tc>
@@ -4728,7 +4728,7 @@
                 <w:sz w:val="19"/>
                 <w:rtl/>
               </w:rPr>
-              <w:t>אליעזר רוטנברג שליט״א</w:t>
+              <w:t>הרב אליעזר רוטנברג שליט״א</w:t>
             </w:r>
           </w:p>
         </w:tc>
@@ -4793,7 +4793,7 @@
                 <w:sz w:val="19"/>
                 <w:rtl/>
               </w:rPr>
-              <w:t>408</w:t>
+              <w:t>393</w:t>
             </w:r>
           </w:p>
         </w:tc>
@@ -4856,7 +4856,7 @@
                 <w:sz w:val="19"/>
                 <w:rtl/>
               </w:rPr>
-              <w:t>אליעזר רוטנברג שליט״א</w:t>
+              <w:t>הרב אליעזר רוטנברג שליט״א</w:t>
             </w:r>
           </w:p>
         </w:tc>
@@ -4920,7 +4920,7 @@
                 <w:sz w:val="19"/>
                 <w:rtl/>
               </w:rPr>
-              <w:t>411</w:t>
+              <w:t>396</w:t>
             </w:r>
           </w:p>
         </w:tc>
@@ -4983,7 +4983,7 @@
                 <w:sz w:val="19"/>
                 <w:rtl/>
               </w:rPr>
-              <w:t>עזרא בטאט שליט״א</w:t>
+              <w:t>הרב עזרא בטאט שליט״א</w:t>
             </w:r>
           </w:p>
         </w:tc>
@@ -5047,7 +5047,7 @@
                 <w:sz w:val="19"/>
                 <w:rtl/>
               </w:rPr>
-              <w:t>417</w:t>
+              <w:t>402</w:t>
             </w:r>
           </w:p>
         </w:tc>
@@ -5110,7 +5110,7 @@
                 <w:sz w:val="19"/>
                 <w:rtl/>
               </w:rPr>
-              <w:t>אליעזר רוטנברג שליט״א</w:t>
+              <w:t>הרב אליעזר רוטנברג שליט״א</w:t>
             </w:r>
           </w:p>
         </w:tc>
@@ -5174,7 +5174,7 @@
                 <w:sz w:val="19"/>
                 <w:rtl/>
               </w:rPr>
-              <w:t>420</w:t>
+              <w:t>405</w:t>
             </w:r>
           </w:p>
         </w:tc>
@@ -5237,7 +5237,7 @@
                 <w:sz w:val="19"/>
                 <w:rtl/>
               </w:rPr>
-              <w:t>יעקב ישראל שטרן שליט״א</w:t>
+              <w:t>הרב יעקב ישראל שטרן שליט״א</w:t>
             </w:r>
           </w:p>
         </w:tc>
@@ -5301,7 +5301,7 @@
                 <w:sz w:val="19"/>
                 <w:rtl/>
               </w:rPr>
-              <w:t>423</w:t>
+              <w:t>408</w:t>
             </w:r>
           </w:p>
         </w:tc>
@@ -5364,7 +5364,7 @@
                 <w:sz w:val="19"/>
                 <w:rtl/>
               </w:rPr>
-              <w:t>נח קליין שליט״א</w:t>
+              <w:t>הרב נח קליין שליט״א</w:t>
             </w:r>
           </w:p>
         </w:tc>
@@ -5428,7 +5428,7 @@
                 <w:sz w:val="19"/>
                 <w:rtl/>
               </w:rPr>
-              <w:t>427</w:t>
+              <w:t>411</w:t>
             </w:r>
           </w:p>
         </w:tc>
@@ -5491,7 +5491,7 @@
                 <w:sz w:val="19"/>
                 <w:rtl/>
               </w:rPr>
-              <w:t>משה דוד הופט שליט״א</w:t>
+              <w:t>הרב משה דוד הופט שליט״א</w:t>
             </w:r>
           </w:p>
         </w:tc>
@@ -5555,7 +5555,7 @@
                 <w:sz w:val="19"/>
                 <w:rtl/>
               </w:rPr>
-              <w:t>431</w:t>
+              <w:t>415</w:t>
             </w:r>
           </w:p>
         </w:tc>
@@ -5618,7 +5618,7 @@
                 <w:sz w:val="19"/>
                 <w:rtl/>
               </w:rPr>
-              <w:t>יעקב ישראל שטרן שליט״א</w:t>
+              <w:t>הרב יעקב ישראל שטרן שליט״א</w:t>
             </w:r>
           </w:p>
         </w:tc>
@@ -5682,7 +5682,7 @@
                 <w:sz w:val="19"/>
                 <w:rtl/>
               </w:rPr>
-              <w:t>444</w:t>
+              <w:t>428</w:t>
             </w:r>
           </w:p>
         </w:tc>
@@ -5745,7 +5745,7 @@
                 <w:sz w:val="19"/>
                 <w:rtl/>
               </w:rPr>
-              <w:t>עזרא בטאט שליט״א</w:t>
+              <w:t>הרב עזרא בטאט שליט״א</w:t>
             </w:r>
           </w:p>
         </w:tc>
@@ -5809,7 +5809,7 @@
                 <w:sz w:val="19"/>
                 <w:rtl/>
               </w:rPr>
-              <w:t>448</w:t>
+              <w:t>432</w:t>
             </w:r>
           </w:p>
         </w:tc>
@@ -5937,7 +5937,7 @@
                 <w:sz w:val="19"/>
                 <w:rtl/>
               </w:rPr>
-              <w:t>517</w:t>
+              <w:t>497</w:t>
             </w:r>
           </w:p>
         </w:tc>
@@ -6000,7 +6000,7 @@
                 <w:sz w:val="19"/>
                 <w:rtl/>
               </w:rPr>
-              <w:t>יעקב ישראל שטרן שליט״א</w:t>
+              <w:t>הרב יעקב ישראל שטרן שליט״א</w:t>
             </w:r>
           </w:p>
         </w:tc>
@@ -6064,7 +6064,7 @@
                 <w:sz w:val="19"/>
                 <w:rtl/>
               </w:rPr>
-              <w:t>526</w:t>
+              <w:t>505</w:t>
             </w:r>
           </w:p>
         </w:tc>
@@ -6191,7 +6191,7 @@
                 <w:sz w:val="19"/>
                 <w:rtl/>
               </w:rPr>
-              <w:t>536</w:t>
+              <w:t>515</w:t>
             </w:r>
           </w:p>
         </w:tc>
@@ -6319,7 +6319,7 @@
                 <w:sz w:val="19"/>
                 <w:rtl/>
               </w:rPr>
-              <w:t>544</w:t>
+              <w:t>522</w:t>
             </w:r>
           </w:p>
         </w:tc>
@@ -6382,7 +6382,7 @@
                 <w:sz w:val="19"/>
                 <w:rtl/>
               </w:rPr>
-              <w:t>עזרא בטאט שליט״א</w:t>
+              <w:t>הרב עזרא בטאט שליט״א</w:t>
             </w:r>
           </w:p>
         </w:tc>
@@ -6446,7 +6446,7 @@
                 <w:sz w:val="19"/>
                 <w:rtl/>
               </w:rPr>
-              <w:t>549</w:t>
+              <w:t>527</w:t>
             </w:r>
           </w:p>
         </w:tc>
@@ -6509,7 +6509,7 @@
                 <w:sz w:val="19"/>
                 <w:rtl/>
               </w:rPr>
-              <w:t>עזרא בטאט שליט״א</w:t>
+              <w:t>הרב עזרא בטאט שליט״א</w:t>
             </w:r>
           </w:p>
         </w:tc>
@@ -6573,7 +6573,7 @@
                 <w:sz w:val="19"/>
                 <w:rtl/>
               </w:rPr>
-              <w:t>565</w:t>
+              <w:t>542</w:t>
             </w:r>
           </w:p>
         </w:tc>
@@ -6700,7 +6700,7 @@
                 <w:sz w:val="19"/>
                 <w:rtl/>
               </w:rPr>
-              <w:t>569</w:t>
+              <w:t>545</w:t>
             </w:r>
           </w:p>
         </w:tc>
@@ -6763,7 +6763,7 @@
                 <w:sz w:val="19"/>
                 <w:rtl/>
               </w:rPr>
-              <w:t>עזרא בטאט שליט״א</w:t>
+              <w:t>הרב עזרא בטאט שליט״א</w:t>
             </w:r>
           </w:p>
         </w:tc>
@@ -6827,7 +6827,7 @@
                 <w:sz w:val="19"/>
                 <w:rtl/>
               </w:rPr>
-              <w:t>573</w:t>
+              <w:t>549</w:t>
             </w:r>
           </w:p>
         </w:tc>
@@ -6890,7 +6890,7 @@
                 <w:sz w:val="19"/>
                 <w:rtl/>
               </w:rPr>
-              <w:t>עזרא בטאט שליט״א</w:t>
+              <w:t>הרב עזרא בטאט שליט״א</w:t>
             </w:r>
           </w:p>
         </w:tc>
@@ -6954,7 +6954,7 @@
                 <w:sz w:val="19"/>
                 <w:rtl/>
               </w:rPr>
-              <w:t>577</w:t>
+              <w:t>553</w:t>
             </w:r>
           </w:p>
         </w:tc>
@@ -7017,7 +7017,7 @@
                 <w:sz w:val="19"/>
                 <w:rtl/>
               </w:rPr>
-              <w:t>עזרא בטאט שליט״א</w:t>
+              <w:t>הרב עזרא בטאט שליט״א</w:t>
             </w:r>
           </w:p>
         </w:tc>
@@ -7081,7 +7081,7 @@
                 <w:sz w:val="19"/>
                 <w:rtl/>
               </w:rPr>
-              <w:t>580</w:t>
+              <w:t>556</w:t>
             </w:r>
           </w:p>
         </w:tc>
@@ -7144,7 +7144,7 @@
                 <w:sz w:val="19"/>
                 <w:rtl/>
               </w:rPr>
-              <w:t>עזרא בטאט שליט״א</w:t>
+              <w:t>הרב עזרא בטאט שליט״א</w:t>
             </w:r>
           </w:p>
         </w:tc>
@@ -7208,7 +7208,7 @@
                 <w:sz w:val="19"/>
                 <w:rtl/>
               </w:rPr>
-              <w:t>584</w:t>
+              <w:t>560</w:t>
             </w:r>
           </w:p>
         </w:tc>
@@ -7271,7 +7271,7 @@
                 <w:sz w:val="19"/>
                 <w:rtl/>
               </w:rPr>
-              <w:t>עזרא בטאט שליט״א</w:t>
+              <w:t>הרב עזרא בטאט שליט״א</w:t>
             </w:r>
           </w:p>
         </w:tc>
@@ -7336,7 +7336,7 @@
                 <w:sz w:val="19"/>
                 <w:rtl/>
               </w:rPr>
-              <w:t>588</w:t>
+              <w:t>564</w:t>
             </w:r>
           </w:p>
         </w:tc>
@@ -7399,7 +7399,7 @@
                 <w:sz w:val="19"/>
                 <w:rtl/>
               </w:rPr>
-              <w:t>עזרא בטאט שליט״א</w:t>
+              <w:t>הרב עזרא בטאט שליט״א</w:t>
             </w:r>
           </w:p>
         </w:tc>
@@ -7463,7 +7463,7 @@
                 <w:sz w:val="19"/>
                 <w:rtl/>
               </w:rPr>
-              <w:t>592</w:t>
+              <w:t>568</w:t>
             </w:r>
           </w:p>
         </w:tc>
@@ -7590,7 +7590,7 @@
                 <w:sz w:val="19"/>
                 <w:rtl/>
               </w:rPr>
-              <w:t>597</w:t>
+              <w:t>573</w:t>
             </w:r>
           </w:p>
         </w:tc>
@@ -7653,7 +7653,7 @@
                 <w:sz w:val="19"/>
                 <w:rtl/>
               </w:rPr>
-              <w:t>עזרא בטאט שליט״א</w:t>
+              <w:t>הרב עזרא בטאט שליט״א</w:t>
             </w:r>
           </w:p>
         </w:tc>
@@ -7717,7 +7717,7 @@
                 <w:sz w:val="19"/>
                 <w:rtl/>
               </w:rPr>
-              <w:t>605</w:t>
+              <w:t>581</w:t>
             </w:r>
           </w:p>
         </w:tc>
@@ -7780,7 +7780,7 @@
                 <w:sz w:val="19"/>
                 <w:rtl/>
               </w:rPr>
-              <w:t>אברהם יהונתן ניסן שליט״א</w:t>
+              <w:t>הרב אברהם יהונתן ניסן שליט״א</w:t>
             </w:r>
           </w:p>
         </w:tc>

</xml_diff>

<commit_message>
Ashcnz for titles / dividers / ToC / cover, Asher for footnotes; centred titles, lower text, lower end ornament
- fonts: Ashcnz (Unicode copy via prepare_fonts.py) and Asher; footnote size 9.4/13.8 configurable in CSS and Word
- engine: title letters centred in the frame by ink (inkShiftPx), running head + rule raised by header.shift (also in Word),
  end ornament gap configurable (endOrnament.gap), footnote title / letters in the notes font
- Word: footnotes keep the Unicode geresh (Asher draws it), header distance follows header.shift

Co-Authored-By: Claude Sonnet 5.5 <noreply@anthropic.com>
Claude-Session: https://claude.ai/code/session_0161ijXJJcwCxR7y44e5HXLU
</commit_message>
<xml_diff>
--- a/output/doch-shiluv-chavurot.docx
+++ b/output/doch-shiluv-chavurot.docx
@@ -335,7 +335,7 @@
                 <w:sz w:val="19"/>
                 <w:rtl/>
               </w:rPr>
-              <w:t>91</w:t>
+              <w:t>90</w:t>
             </w:r>
           </w:p>
         </w:tc>
@@ -463,7 +463,7 @@
                 <w:sz w:val="19"/>
                 <w:rtl/>
               </w:rPr>
-              <w:t>151</w:t>
+              <w:t>149</w:t>
             </w:r>
           </w:p>
         </w:tc>
@@ -590,7 +590,7 @@
                 <w:sz w:val="19"/>
                 <w:rtl/>
               </w:rPr>
-              <w:t>154</w:t>
+              <w:t>152</w:t>
             </w:r>
           </w:p>
         </w:tc>
@@ -717,7 +717,7 @@
                 <w:sz w:val="19"/>
                 <w:rtl/>
               </w:rPr>
-              <w:t>156</w:t>
+              <w:t>154</w:t>
             </w:r>
           </w:p>
         </w:tc>
@@ -844,7 +844,7 @@
                 <w:sz w:val="19"/>
                 <w:rtl/>
               </w:rPr>
-              <w:t>159</w:t>
+              <w:t>157</w:t>
             </w:r>
           </w:p>
         </w:tc>
@@ -971,7 +971,7 @@
                 <w:sz w:val="19"/>
                 <w:rtl/>
               </w:rPr>
-              <w:t>163</w:t>
+              <w:t>161</w:t>
             </w:r>
           </w:p>
         </w:tc>
@@ -1099,7 +1099,7 @@
                 <w:sz w:val="19"/>
                 <w:rtl/>
               </w:rPr>
-              <w:t>177</w:t>
+              <w:t>175</w:t>
             </w:r>
           </w:p>
         </w:tc>
@@ -1227,7 +1227,7 @@
                 <w:sz w:val="19"/>
                 <w:rtl/>
               </w:rPr>
-              <w:t>179</w:t>
+              <w:t>177</w:t>
             </w:r>
           </w:p>
         </w:tc>
@@ -1354,7 +1354,7 @@
                 <w:sz w:val="19"/>
                 <w:rtl/>
               </w:rPr>
-              <w:t>182</w:t>
+              <w:t>180</w:t>
             </w:r>
           </w:p>
         </w:tc>
@@ -1481,7 +1481,7 @@
                 <w:sz w:val="19"/>
                 <w:rtl/>
               </w:rPr>
-              <w:t>184</w:t>
+              <w:t>182</w:t>
             </w:r>
           </w:p>
         </w:tc>
@@ -1608,7 +1608,7 @@
                 <w:sz w:val="19"/>
                 <w:rtl/>
               </w:rPr>
-              <w:t>187</w:t>
+              <w:t>185</w:t>
             </w:r>
           </w:p>
         </w:tc>
@@ -1736,7 +1736,7 @@
                 <w:sz w:val="19"/>
                 <w:rtl/>
               </w:rPr>
-              <w:t>192</w:t>
+              <w:t>190</w:t>
             </w:r>
           </w:p>
         </w:tc>
@@ -1863,7 +1863,7 @@
                 <w:sz w:val="19"/>
                 <w:rtl/>
               </w:rPr>
-              <w:t>194</w:t>
+              <w:t>192</w:t>
             </w:r>
           </w:p>
         </w:tc>
@@ -1990,7 +1990,7 @@
                 <w:sz w:val="19"/>
                 <w:rtl/>
               </w:rPr>
-              <w:t>195</w:t>
+              <w:t>193</w:t>
             </w:r>
           </w:p>
         </w:tc>
@@ -2117,7 +2117,7 @@
                 <w:sz w:val="19"/>
                 <w:rtl/>
               </w:rPr>
-              <w:t>268</w:t>
+              <w:t>266</w:t>
             </w:r>
           </w:p>
         </w:tc>
@@ -2245,7 +2245,7 @@
                 <w:sz w:val="19"/>
                 <w:rtl/>
               </w:rPr>
-              <w:t>272</w:t>
+              <w:t>270</w:t>
             </w:r>
           </w:p>
         </w:tc>
@@ -2373,7 +2373,7 @@
                 <w:sz w:val="19"/>
                 <w:rtl/>
               </w:rPr>
-              <w:t>276</w:t>
+              <w:t>274</w:t>
             </w:r>
           </w:p>
         </w:tc>
@@ -2501,7 +2501,7 @@
                 <w:sz w:val="19"/>
                 <w:rtl/>
               </w:rPr>
-              <w:t>279</w:t>
+              <w:t>277</w:t>
             </w:r>
           </w:p>
         </w:tc>
@@ -2629,7 +2629,7 @@
                 <w:sz w:val="19"/>
                 <w:rtl/>
               </w:rPr>
-              <w:t>292</w:t>
+              <w:t>289</w:t>
             </w:r>
           </w:p>
         </w:tc>
@@ -2757,7 +2757,7 @@
                 <w:sz w:val="19"/>
                 <w:rtl/>
               </w:rPr>
-              <w:t>297</w:t>
+              <w:t>294</w:t>
             </w:r>
           </w:p>
         </w:tc>
@@ -2884,7 +2884,7 @@
                 <w:sz w:val="19"/>
                 <w:rtl/>
               </w:rPr>
-              <w:t>301</w:t>
+              <w:t>298</w:t>
             </w:r>
           </w:p>
         </w:tc>
@@ -3011,7 +3011,7 @@
                 <w:sz w:val="19"/>
                 <w:rtl/>
               </w:rPr>
-              <w:t>307</w:t>
+              <w:t>304</w:t>
             </w:r>
           </w:p>
         </w:tc>
@@ -3138,7 +3138,7 @@
                 <w:sz w:val="19"/>
                 <w:rtl/>
               </w:rPr>
-              <w:t>312</w:t>
+              <w:t>309</w:t>
             </w:r>
           </w:p>
         </w:tc>
@@ -3265,7 +3265,7 @@
                 <w:sz w:val="19"/>
                 <w:rtl/>
               </w:rPr>
-              <w:t>318</w:t>
+              <w:t>315</w:t>
             </w:r>
           </w:p>
         </w:tc>
@@ -3392,7 +3392,7 @@
                 <w:sz w:val="19"/>
                 <w:rtl/>
               </w:rPr>
-              <w:t>328</w:t>
+              <w:t>325</w:t>
             </w:r>
           </w:p>
         </w:tc>
@@ -3519,7 +3519,7 @@
                 <w:sz w:val="19"/>
                 <w:rtl/>
               </w:rPr>
-              <w:t>334</w:t>
+              <w:t>331</w:t>
             </w:r>
           </w:p>
         </w:tc>
@@ -3646,7 +3646,7 @@
                 <w:sz w:val="19"/>
                 <w:rtl/>
               </w:rPr>
-              <w:t>345</w:t>
+              <w:t>342</w:t>
             </w:r>
           </w:p>
         </w:tc>
@@ -3773,7 +3773,7 @@
                 <w:sz w:val="19"/>
                 <w:rtl/>
               </w:rPr>
-              <w:t>356</w:t>
+              <w:t>353</w:t>
             </w:r>
           </w:p>
         </w:tc>
@@ -3900,7 +3900,7 @@
                 <w:sz w:val="19"/>
                 <w:rtl/>
               </w:rPr>
-              <w:t>359</w:t>
+              <w:t>356</w:t>
             </w:r>
           </w:p>
         </w:tc>
@@ -4028,7 +4028,7 @@
                 <w:sz w:val="19"/>
                 <w:rtl/>
               </w:rPr>
-              <w:t>373</w:t>
+              <w:t>370</w:t>
             </w:r>
           </w:p>
         </w:tc>
@@ -4155,7 +4155,7 @@
                 <w:sz w:val="19"/>
                 <w:rtl/>
               </w:rPr>
-              <w:t>377</w:t>
+              <w:t>373</w:t>
             </w:r>
           </w:p>
         </w:tc>
@@ -4283,7 +4283,7 @@
                 <w:sz w:val="19"/>
                 <w:rtl/>
               </w:rPr>
-              <w:t>380</w:t>
+              <w:t>376</w:t>
             </w:r>
           </w:p>
         </w:tc>
@@ -4410,7 +4410,7 @@
                 <w:sz w:val="19"/>
                 <w:rtl/>
               </w:rPr>
-              <w:t>384</w:t>
+              <w:t>380</w:t>
             </w:r>
           </w:p>
         </w:tc>
@@ -4538,7 +4538,7 @@
                 <w:sz w:val="19"/>
                 <w:rtl/>
               </w:rPr>
-              <w:t>387</w:t>
+              <w:t>383</w:t>
             </w:r>
           </w:p>
         </w:tc>
@@ -4665,7 +4665,7 @@
                 <w:sz w:val="19"/>
                 <w:rtl/>
               </w:rPr>
-              <w:t>390</w:t>
+              <w:t>386</w:t>
             </w:r>
           </w:p>
         </w:tc>
@@ -4793,7 +4793,7 @@
                 <w:sz w:val="19"/>
                 <w:rtl/>
               </w:rPr>
-              <w:t>393</w:t>
+              <w:t>389</w:t>
             </w:r>
           </w:p>
         </w:tc>
@@ -4920,7 +4920,7 @@
                 <w:sz w:val="19"/>
                 <w:rtl/>
               </w:rPr>
-              <w:t>396</w:t>
+              <w:t>392</w:t>
             </w:r>
           </w:p>
         </w:tc>
@@ -5047,7 +5047,7 @@
                 <w:sz w:val="19"/>
                 <w:rtl/>
               </w:rPr>
-              <w:t>402</w:t>
+              <w:t>398</w:t>
             </w:r>
           </w:p>
         </w:tc>
@@ -5174,7 +5174,7 @@
                 <w:sz w:val="19"/>
                 <w:rtl/>
               </w:rPr>
-              <w:t>405</w:t>
+              <w:t>401</w:t>
             </w:r>
           </w:p>
         </w:tc>
@@ -5301,7 +5301,7 @@
                 <w:sz w:val="19"/>
                 <w:rtl/>
               </w:rPr>
-              <w:t>408</w:t>
+              <w:t>404</w:t>
             </w:r>
           </w:p>
         </w:tc>
@@ -5428,7 +5428,7 @@
                 <w:sz w:val="19"/>
                 <w:rtl/>
               </w:rPr>
-              <w:t>411</w:t>
+              <w:t>407</w:t>
             </w:r>
           </w:p>
         </w:tc>
@@ -5555,7 +5555,7 @@
                 <w:sz w:val="19"/>
                 <w:rtl/>
               </w:rPr>
-              <w:t>415</w:t>
+              <w:t>411</w:t>
             </w:r>
           </w:p>
         </w:tc>
@@ -5682,7 +5682,7 @@
                 <w:sz w:val="19"/>
                 <w:rtl/>
               </w:rPr>
-              <w:t>428</w:t>
+              <w:t>424</w:t>
             </w:r>
           </w:p>
         </w:tc>
@@ -5809,7 +5809,7 @@
                 <w:sz w:val="19"/>
                 <w:rtl/>
               </w:rPr>
-              <w:t>432</w:t>
+              <w:t>428</w:t>
             </w:r>
           </w:p>
         </w:tc>
@@ -5937,7 +5937,7 @@
                 <w:sz w:val="19"/>
                 <w:rtl/>
               </w:rPr>
-              <w:t>497</w:t>
+              <w:t>492</w:t>
             </w:r>
           </w:p>
         </w:tc>
@@ -6064,7 +6064,7 @@
                 <w:sz w:val="19"/>
                 <w:rtl/>
               </w:rPr>
-              <w:t>505</w:t>
+              <w:t>500</w:t>
             </w:r>
           </w:p>
         </w:tc>
@@ -6191,7 +6191,7 @@
                 <w:sz w:val="19"/>
                 <w:rtl/>
               </w:rPr>
-              <w:t>515</w:t>
+              <w:t>510</w:t>
             </w:r>
           </w:p>
         </w:tc>
@@ -6319,7 +6319,7 @@
                 <w:sz w:val="19"/>
                 <w:rtl/>
               </w:rPr>
-              <w:t>522</w:t>
+              <w:t>517</w:t>
             </w:r>
           </w:p>
         </w:tc>
@@ -6446,7 +6446,7 @@
                 <w:sz w:val="19"/>
                 <w:rtl/>
               </w:rPr>
-              <w:t>527</w:t>
+              <w:t>522</w:t>
             </w:r>
           </w:p>
         </w:tc>
@@ -6573,7 +6573,7 @@
                 <w:sz w:val="19"/>
                 <w:rtl/>
               </w:rPr>
-              <w:t>542</w:t>
+              <w:t>537</w:t>
             </w:r>
           </w:p>
         </w:tc>
@@ -6700,7 +6700,7 @@
                 <w:sz w:val="19"/>
                 <w:rtl/>
               </w:rPr>
-              <w:t>545</w:t>
+              <w:t>540</w:t>
             </w:r>
           </w:p>
         </w:tc>
@@ -6827,7 +6827,7 @@
                 <w:sz w:val="19"/>
                 <w:rtl/>
               </w:rPr>
-              <w:t>549</w:t>
+              <w:t>544</w:t>
             </w:r>
           </w:p>
         </w:tc>
@@ -6954,7 +6954,7 @@
                 <w:sz w:val="19"/>
                 <w:rtl/>
               </w:rPr>
-              <w:t>553</w:t>
+              <w:t>548</w:t>
             </w:r>
           </w:p>
         </w:tc>
@@ -7081,7 +7081,7 @@
                 <w:sz w:val="19"/>
                 <w:rtl/>
               </w:rPr>
-              <w:t>556</w:t>
+              <w:t>551</w:t>
             </w:r>
           </w:p>
         </w:tc>
@@ -7208,7 +7208,7 @@
                 <w:sz w:val="19"/>
                 <w:rtl/>
               </w:rPr>
-              <w:t>560</w:t>
+              <w:t>555</w:t>
             </w:r>
           </w:p>
         </w:tc>
@@ -7336,7 +7336,7 @@
                 <w:sz w:val="19"/>
                 <w:rtl/>
               </w:rPr>
-              <w:t>564</w:t>
+              <w:t>559</w:t>
             </w:r>
           </w:p>
         </w:tc>
@@ -7463,7 +7463,7 @@
                 <w:sz w:val="19"/>
                 <w:rtl/>
               </w:rPr>
-              <w:t>568</w:t>
+              <w:t>563</w:t>
             </w:r>
           </w:p>
         </w:tc>
@@ -7590,7 +7590,7 @@
                 <w:sz w:val="19"/>
                 <w:rtl/>
               </w:rPr>
-              <w:t>573</w:t>
+              <w:t>568</w:t>
             </w:r>
           </w:p>
         </w:tc>
@@ -7717,7 +7717,7 @@
                 <w:sz w:val="19"/>
                 <w:rtl/>
               </w:rPr>
-              <w:t>581</w:t>
+              <w:t>576</w:t>
             </w:r>
           </w:p>
         </w:tc>

</xml_diff>

<commit_message>
Fix Ashcnz titles falling back to FrankRuehl in the PDF
The FrankRuehl DP face of the composite "Ashcnz Title" family covered the
Hebrew letters and, being declared last, won over the Ashcnz face. Its
unicode-range now excludes U+05D0-05EA. Also: section headings (c-h2) use the
display weight instead of bold, and ToC entries are set in the display font.
Adds a DUMP_FONTS debugging aid and a README note.

Co-Authored-By: Claude Sonnet 5.5 <noreply@anthropic.com>
Claude-Session: https://claude.ai/code/session_0161ijXJJcwCxR7y44e5HXLU
</commit_message>
<xml_diff>
--- a/output/doch-shiluv-chavurot.docx
+++ b/output/doch-shiluv-chavurot.docx
@@ -2117,7 +2117,7 @@
                 <w:sz w:val="19"/>
                 <w:rtl/>
               </w:rPr>
-              <w:t>266</w:t>
+              <w:t>267</w:t>
             </w:r>
           </w:p>
         </w:tc>
@@ -2245,7 +2245,7 @@
                 <w:sz w:val="19"/>
                 <w:rtl/>
               </w:rPr>
-              <w:t>270</w:t>
+              <w:t>271</w:t>
             </w:r>
           </w:p>
         </w:tc>
@@ -2373,7 +2373,7 @@
                 <w:sz w:val="19"/>
                 <w:rtl/>
               </w:rPr>
-              <w:t>274</w:t>
+              <w:t>275</w:t>
             </w:r>
           </w:p>
         </w:tc>
@@ -2501,7 +2501,7 @@
                 <w:sz w:val="19"/>
                 <w:rtl/>
               </w:rPr>
-              <w:t>277</w:t>
+              <w:t>278</w:t>
             </w:r>
           </w:p>
         </w:tc>
@@ -2629,7 +2629,7 @@
                 <w:sz w:val="19"/>
                 <w:rtl/>
               </w:rPr>
-              <w:t>289</w:t>
+              <w:t>290</w:t>
             </w:r>
           </w:p>
         </w:tc>
@@ -2757,7 +2757,7 @@
                 <w:sz w:val="19"/>
                 <w:rtl/>
               </w:rPr>
-              <w:t>294</w:t>
+              <w:t>295</w:t>
             </w:r>
           </w:p>
         </w:tc>
@@ -2884,7 +2884,7 @@
                 <w:sz w:val="19"/>
                 <w:rtl/>
               </w:rPr>
-              <w:t>298</w:t>
+              <w:t>299</w:t>
             </w:r>
           </w:p>
         </w:tc>
@@ -3011,7 +3011,7 @@
                 <w:sz w:val="19"/>
                 <w:rtl/>
               </w:rPr>
-              <w:t>304</w:t>
+              <w:t>305</w:t>
             </w:r>
           </w:p>
         </w:tc>
@@ -3138,7 +3138,7 @@
                 <w:sz w:val="19"/>
                 <w:rtl/>
               </w:rPr>
-              <w:t>309</w:t>
+              <w:t>310</w:t>
             </w:r>
           </w:p>
         </w:tc>
@@ -3265,7 +3265,7 @@
                 <w:sz w:val="19"/>
                 <w:rtl/>
               </w:rPr>
-              <w:t>315</w:t>
+              <w:t>316</w:t>
             </w:r>
           </w:p>
         </w:tc>
@@ -3392,7 +3392,7 @@
                 <w:sz w:val="19"/>
                 <w:rtl/>
               </w:rPr>
-              <w:t>325</w:t>
+              <w:t>326</w:t>
             </w:r>
           </w:p>
         </w:tc>
@@ -3519,7 +3519,7 @@
                 <w:sz w:val="19"/>
                 <w:rtl/>
               </w:rPr>
-              <w:t>331</w:t>
+              <w:t>332</w:t>
             </w:r>
           </w:p>
         </w:tc>
@@ -3646,7 +3646,7 @@
                 <w:sz w:val="19"/>
                 <w:rtl/>
               </w:rPr>
-              <w:t>342</w:t>
+              <w:t>343</w:t>
             </w:r>
           </w:p>
         </w:tc>
@@ -3773,7 +3773,7 @@
                 <w:sz w:val="19"/>
                 <w:rtl/>
               </w:rPr>
-              <w:t>353</w:t>
+              <w:t>354</w:t>
             </w:r>
           </w:p>
         </w:tc>
@@ -3900,7 +3900,7 @@
                 <w:sz w:val="19"/>
                 <w:rtl/>
               </w:rPr>
-              <w:t>356</w:t>
+              <w:t>357</w:t>
             </w:r>
           </w:p>
         </w:tc>
@@ -4028,7 +4028,7 @@
                 <w:sz w:val="19"/>
                 <w:rtl/>
               </w:rPr>
-              <w:t>370</w:t>
+              <w:t>371</w:t>
             </w:r>
           </w:p>
         </w:tc>
@@ -4155,7 +4155,7 @@
                 <w:sz w:val="19"/>
                 <w:rtl/>
               </w:rPr>
-              <w:t>373</w:t>
+              <w:t>374</w:t>
             </w:r>
           </w:p>
         </w:tc>
@@ -4283,7 +4283,7 @@
                 <w:sz w:val="19"/>
                 <w:rtl/>
               </w:rPr>
-              <w:t>376</w:t>
+              <w:t>377</w:t>
             </w:r>
           </w:p>
         </w:tc>
@@ -4410,7 +4410,7 @@
                 <w:sz w:val="19"/>
                 <w:rtl/>
               </w:rPr>
-              <w:t>380</w:t>
+              <w:t>381</w:t>
             </w:r>
           </w:p>
         </w:tc>
@@ -4538,7 +4538,7 @@
                 <w:sz w:val="19"/>
                 <w:rtl/>
               </w:rPr>
-              <w:t>383</w:t>
+              <w:t>384</w:t>
             </w:r>
           </w:p>
         </w:tc>
@@ -4665,7 +4665,7 @@
                 <w:sz w:val="19"/>
                 <w:rtl/>
               </w:rPr>
-              <w:t>386</w:t>
+              <w:t>387</w:t>
             </w:r>
           </w:p>
         </w:tc>
@@ -4793,7 +4793,7 @@
                 <w:sz w:val="19"/>
                 <w:rtl/>
               </w:rPr>
-              <w:t>389</w:t>
+              <w:t>390</w:t>
             </w:r>
           </w:p>
         </w:tc>
@@ -4920,7 +4920,7 @@
                 <w:sz w:val="19"/>
                 <w:rtl/>
               </w:rPr>
-              <w:t>392</w:t>
+              <w:t>393</w:t>
             </w:r>
           </w:p>
         </w:tc>
@@ -5047,7 +5047,7 @@
                 <w:sz w:val="19"/>
                 <w:rtl/>
               </w:rPr>
-              <w:t>398</w:t>
+              <w:t>399</w:t>
             </w:r>
           </w:p>
         </w:tc>
@@ -5174,7 +5174,7 @@
                 <w:sz w:val="19"/>
                 <w:rtl/>
               </w:rPr>
-              <w:t>401</w:t>
+              <w:t>402</w:t>
             </w:r>
           </w:p>
         </w:tc>
@@ -5301,7 +5301,7 @@
                 <w:sz w:val="19"/>
                 <w:rtl/>
               </w:rPr>
-              <w:t>404</w:t>
+              <w:t>405</w:t>
             </w:r>
           </w:p>
         </w:tc>
@@ -5428,7 +5428,7 @@
                 <w:sz w:val="19"/>
                 <w:rtl/>
               </w:rPr>
-              <w:t>407</w:t>
+              <w:t>408</w:t>
             </w:r>
           </w:p>
         </w:tc>
@@ -5555,7 +5555,7 @@
                 <w:sz w:val="19"/>
                 <w:rtl/>
               </w:rPr>
-              <w:t>411</w:t>
+              <w:t>412</w:t>
             </w:r>
           </w:p>
         </w:tc>
@@ -5682,7 +5682,7 @@
                 <w:sz w:val="19"/>
                 <w:rtl/>
               </w:rPr>
-              <w:t>424</w:t>
+              <w:t>425</w:t>
             </w:r>
           </w:p>
         </w:tc>
@@ -5809,7 +5809,7 @@
                 <w:sz w:val="19"/>
                 <w:rtl/>
               </w:rPr>
-              <w:t>428</w:t>
+              <w:t>429</w:t>
             </w:r>
           </w:p>
         </w:tc>
@@ -5937,7 +5937,7 @@
                 <w:sz w:val="19"/>
                 <w:rtl/>
               </w:rPr>
-              <w:t>492</w:t>
+              <w:t>494</w:t>
             </w:r>
           </w:p>
         </w:tc>
@@ -6064,7 +6064,7 @@
                 <w:sz w:val="19"/>
                 <w:rtl/>
               </w:rPr>
-              <w:t>500</w:t>
+              <w:t>502</w:t>
             </w:r>
           </w:p>
         </w:tc>
@@ -6191,7 +6191,7 @@
                 <w:sz w:val="19"/>
                 <w:rtl/>
               </w:rPr>
-              <w:t>510</w:t>
+              <w:t>512</w:t>
             </w:r>
           </w:p>
         </w:tc>
@@ -6319,7 +6319,7 @@
                 <w:sz w:val="19"/>
                 <w:rtl/>
               </w:rPr>
-              <w:t>517</w:t>
+              <w:t>519</w:t>
             </w:r>
           </w:p>
         </w:tc>
@@ -6446,7 +6446,7 @@
                 <w:sz w:val="19"/>
                 <w:rtl/>
               </w:rPr>
-              <w:t>522</w:t>
+              <w:t>524</w:t>
             </w:r>
           </w:p>
         </w:tc>
@@ -6573,7 +6573,7 @@
                 <w:sz w:val="19"/>
                 <w:rtl/>
               </w:rPr>
-              <w:t>537</w:t>
+              <w:t>539</w:t>
             </w:r>
           </w:p>
         </w:tc>
@@ -6700,7 +6700,7 @@
                 <w:sz w:val="19"/>
                 <w:rtl/>
               </w:rPr>
-              <w:t>540</w:t>
+              <w:t>542</w:t>
             </w:r>
           </w:p>
         </w:tc>
@@ -6827,7 +6827,7 @@
                 <w:sz w:val="19"/>
                 <w:rtl/>
               </w:rPr>
-              <w:t>544</w:t>
+              <w:t>546</w:t>
             </w:r>
           </w:p>
         </w:tc>
@@ -6954,7 +6954,7 @@
                 <w:sz w:val="19"/>
                 <w:rtl/>
               </w:rPr>
-              <w:t>548</w:t>
+              <w:t>550</w:t>
             </w:r>
           </w:p>
         </w:tc>
@@ -7081,7 +7081,7 @@
                 <w:sz w:val="19"/>
                 <w:rtl/>
               </w:rPr>
-              <w:t>551</w:t>
+              <w:t>553</w:t>
             </w:r>
           </w:p>
         </w:tc>
@@ -7208,7 +7208,7 @@
                 <w:sz w:val="19"/>
                 <w:rtl/>
               </w:rPr>
-              <w:t>555</w:t>
+              <w:t>557</w:t>
             </w:r>
           </w:p>
         </w:tc>
@@ -7336,7 +7336,7 @@
                 <w:sz w:val="19"/>
                 <w:rtl/>
               </w:rPr>
-              <w:t>559</w:t>
+              <w:t>561</w:t>
             </w:r>
           </w:p>
         </w:tc>
@@ -7463,7 +7463,7 @@
                 <w:sz w:val="19"/>
                 <w:rtl/>
               </w:rPr>
-              <w:t>563</w:t>
+              <w:t>565</w:t>
             </w:r>
           </w:p>
         </w:tc>
@@ -7590,7 +7590,7 @@
                 <w:sz w:val="19"/>
                 <w:rtl/>
               </w:rPr>
-              <w:t>568</w:t>
+              <w:t>570</w:t>
             </w:r>
           </w:p>
         </w:tc>
@@ -7717,7 +7717,7 @@
                 <w:sz w:val="19"/>
                 <w:rtl/>
               </w:rPr>
-              <w:t>576</w:t>
+              <w:t>578</w:t>
             </w:r>
           </w:p>
         </w:tc>

</xml_diff>

<commit_message>
Titles in Ashkenazy (display role); keep the Ashcnz setup as an alternate config
Article titles, divider pages, the ToC heading and the cover use Ashkenazy
Regular (single weight, display weight 400). Word styles use the same font.
config.ashcnz.json preserves the previous Ashcnz configuration.

Co-Authored-By: Claude Sonnet 5.5 <noreply@anthropic.com>
Claude-Session: https://claude.ai/code/session_0161ijXJJcwCxR7y44e5HXLU
</commit_message>
<xml_diff>
--- a/output/doch-shiluv-chavurot.docx
+++ b/output/doch-shiluv-chavurot.docx
@@ -2117,7 +2117,7 @@
                 <w:sz w:val="19"/>
                 <w:rtl/>
               </w:rPr>
-              <w:t>267</w:t>
+              <w:t>266</w:t>
             </w:r>
           </w:p>
         </w:tc>
@@ -2245,7 +2245,7 @@
                 <w:sz w:val="19"/>
                 <w:rtl/>
               </w:rPr>
-              <w:t>271</w:t>
+              <w:t>270</w:t>
             </w:r>
           </w:p>
         </w:tc>
@@ -2373,7 +2373,7 @@
                 <w:sz w:val="19"/>
                 <w:rtl/>
               </w:rPr>
-              <w:t>275</w:t>
+              <w:t>274</w:t>
             </w:r>
           </w:p>
         </w:tc>
@@ -2501,7 +2501,7 @@
                 <w:sz w:val="19"/>
                 <w:rtl/>
               </w:rPr>
-              <w:t>278</w:t>
+              <w:t>277</w:t>
             </w:r>
           </w:p>
         </w:tc>
@@ -2629,7 +2629,7 @@
                 <w:sz w:val="19"/>
                 <w:rtl/>
               </w:rPr>
-              <w:t>290</w:t>
+              <w:t>289</w:t>
             </w:r>
           </w:p>
         </w:tc>
@@ -2757,7 +2757,7 @@
                 <w:sz w:val="19"/>
                 <w:rtl/>
               </w:rPr>
-              <w:t>295</w:t>
+              <w:t>294</w:t>
             </w:r>
           </w:p>
         </w:tc>
@@ -2884,7 +2884,7 @@
                 <w:sz w:val="19"/>
                 <w:rtl/>
               </w:rPr>
-              <w:t>299</w:t>
+              <w:t>298</w:t>
             </w:r>
           </w:p>
         </w:tc>
@@ -3011,7 +3011,7 @@
                 <w:sz w:val="19"/>
                 <w:rtl/>
               </w:rPr>
-              <w:t>305</w:t>
+              <w:t>304</w:t>
             </w:r>
           </w:p>
         </w:tc>
@@ -3138,7 +3138,7 @@
                 <w:sz w:val="19"/>
                 <w:rtl/>
               </w:rPr>
-              <w:t>310</w:t>
+              <w:t>309</w:t>
             </w:r>
           </w:p>
         </w:tc>
@@ -3265,7 +3265,7 @@
                 <w:sz w:val="19"/>
                 <w:rtl/>
               </w:rPr>
-              <w:t>316</w:t>
+              <w:t>315</w:t>
             </w:r>
           </w:p>
         </w:tc>
@@ -3392,7 +3392,7 @@
                 <w:sz w:val="19"/>
                 <w:rtl/>
               </w:rPr>
-              <w:t>326</w:t>
+              <w:t>325</w:t>
             </w:r>
           </w:p>
         </w:tc>
@@ -3519,7 +3519,7 @@
                 <w:sz w:val="19"/>
                 <w:rtl/>
               </w:rPr>
-              <w:t>332</w:t>
+              <w:t>331</w:t>
             </w:r>
           </w:p>
         </w:tc>
@@ -3646,7 +3646,7 @@
                 <w:sz w:val="19"/>
                 <w:rtl/>
               </w:rPr>
-              <w:t>343</w:t>
+              <w:t>342</w:t>
             </w:r>
           </w:p>
         </w:tc>
@@ -3773,7 +3773,7 @@
                 <w:sz w:val="19"/>
                 <w:rtl/>
               </w:rPr>
-              <w:t>354</w:t>
+              <w:t>353</w:t>
             </w:r>
           </w:p>
         </w:tc>
@@ -3900,7 +3900,7 @@
                 <w:sz w:val="19"/>
                 <w:rtl/>
               </w:rPr>
-              <w:t>357</w:t>
+              <w:t>356</w:t>
             </w:r>
           </w:p>
         </w:tc>
@@ -4028,7 +4028,7 @@
                 <w:sz w:val="19"/>
                 <w:rtl/>
               </w:rPr>
-              <w:t>371</w:t>
+              <w:t>370</w:t>
             </w:r>
           </w:p>
         </w:tc>
@@ -4155,7 +4155,7 @@
                 <w:sz w:val="19"/>
                 <w:rtl/>
               </w:rPr>
-              <w:t>374</w:t>
+              <w:t>373</w:t>
             </w:r>
           </w:p>
         </w:tc>
@@ -4283,7 +4283,7 @@
                 <w:sz w:val="19"/>
                 <w:rtl/>
               </w:rPr>
-              <w:t>377</w:t>
+              <w:t>376</w:t>
             </w:r>
           </w:p>
         </w:tc>
@@ -4410,7 +4410,7 @@
                 <w:sz w:val="19"/>
                 <w:rtl/>
               </w:rPr>
-              <w:t>381</w:t>
+              <w:t>380</w:t>
             </w:r>
           </w:p>
         </w:tc>
@@ -4538,7 +4538,7 @@
                 <w:sz w:val="19"/>
                 <w:rtl/>
               </w:rPr>
-              <w:t>384</w:t>
+              <w:t>383</w:t>
             </w:r>
           </w:p>
         </w:tc>
@@ -4665,7 +4665,7 @@
                 <w:sz w:val="19"/>
                 <w:rtl/>
               </w:rPr>
-              <w:t>387</w:t>
+              <w:t>386</w:t>
             </w:r>
           </w:p>
         </w:tc>
@@ -4793,7 +4793,7 @@
                 <w:sz w:val="19"/>
                 <w:rtl/>
               </w:rPr>
-              <w:t>390</w:t>
+              <w:t>389</w:t>
             </w:r>
           </w:p>
         </w:tc>
@@ -4920,7 +4920,7 @@
                 <w:sz w:val="19"/>
                 <w:rtl/>
               </w:rPr>
-              <w:t>393</w:t>
+              <w:t>392</w:t>
             </w:r>
           </w:p>
         </w:tc>
@@ -5047,7 +5047,7 @@
                 <w:sz w:val="19"/>
                 <w:rtl/>
               </w:rPr>
-              <w:t>399</w:t>
+              <w:t>398</w:t>
             </w:r>
           </w:p>
         </w:tc>
@@ -5174,7 +5174,7 @@
                 <w:sz w:val="19"/>
                 <w:rtl/>
               </w:rPr>
-              <w:t>402</w:t>
+              <w:t>401</w:t>
             </w:r>
           </w:p>
         </w:tc>
@@ -5301,7 +5301,7 @@
                 <w:sz w:val="19"/>
                 <w:rtl/>
               </w:rPr>
-              <w:t>405</w:t>
+              <w:t>404</w:t>
             </w:r>
           </w:p>
         </w:tc>
@@ -5428,7 +5428,7 @@
                 <w:sz w:val="19"/>
                 <w:rtl/>
               </w:rPr>
-              <w:t>408</w:t>
+              <w:t>407</w:t>
             </w:r>
           </w:p>
         </w:tc>
@@ -5555,7 +5555,7 @@
                 <w:sz w:val="19"/>
                 <w:rtl/>
               </w:rPr>
-              <w:t>412</w:t>
+              <w:t>411</w:t>
             </w:r>
           </w:p>
         </w:tc>
@@ -5682,7 +5682,7 @@
                 <w:sz w:val="19"/>
                 <w:rtl/>
               </w:rPr>
-              <w:t>425</w:t>
+              <w:t>424</w:t>
             </w:r>
           </w:p>
         </w:tc>
@@ -5809,7 +5809,7 @@
                 <w:sz w:val="19"/>
                 <w:rtl/>
               </w:rPr>
-              <w:t>429</w:t>
+              <w:t>428</w:t>
             </w:r>
           </w:p>
         </w:tc>
@@ -5937,7 +5937,7 @@
                 <w:sz w:val="19"/>
                 <w:rtl/>
               </w:rPr>
-              <w:t>494</w:t>
+              <w:t>492</w:t>
             </w:r>
           </w:p>
         </w:tc>
@@ -6064,7 +6064,7 @@
                 <w:sz w:val="19"/>
                 <w:rtl/>
               </w:rPr>
-              <w:t>502</w:t>
+              <w:t>500</w:t>
             </w:r>
           </w:p>
         </w:tc>
@@ -6191,7 +6191,7 @@
                 <w:sz w:val="19"/>
                 <w:rtl/>
               </w:rPr>
-              <w:t>512</w:t>
+              <w:t>510</w:t>
             </w:r>
           </w:p>
         </w:tc>
@@ -6319,7 +6319,7 @@
                 <w:sz w:val="19"/>
                 <w:rtl/>
               </w:rPr>
-              <w:t>519</w:t>
+              <w:t>517</w:t>
             </w:r>
           </w:p>
         </w:tc>
@@ -6446,7 +6446,7 @@
                 <w:sz w:val="19"/>
                 <w:rtl/>
               </w:rPr>
-              <w:t>524</w:t>
+              <w:t>522</w:t>
             </w:r>
           </w:p>
         </w:tc>
@@ -6573,7 +6573,7 @@
                 <w:sz w:val="19"/>
                 <w:rtl/>
               </w:rPr>
-              <w:t>539</w:t>
+              <w:t>537</w:t>
             </w:r>
           </w:p>
         </w:tc>
@@ -6700,7 +6700,7 @@
                 <w:sz w:val="19"/>
                 <w:rtl/>
               </w:rPr>
-              <w:t>542</w:t>
+              <w:t>540</w:t>
             </w:r>
           </w:p>
         </w:tc>
@@ -6827,7 +6827,7 @@
                 <w:sz w:val="19"/>
                 <w:rtl/>
               </w:rPr>
-              <w:t>546</w:t>
+              <w:t>544</w:t>
             </w:r>
           </w:p>
         </w:tc>
@@ -6954,7 +6954,7 @@
                 <w:sz w:val="19"/>
                 <w:rtl/>
               </w:rPr>
-              <w:t>550</w:t>
+              <w:t>548</w:t>
             </w:r>
           </w:p>
         </w:tc>
@@ -7081,7 +7081,7 @@
                 <w:sz w:val="19"/>
                 <w:rtl/>
               </w:rPr>
-              <w:t>553</w:t>
+              <w:t>551</w:t>
             </w:r>
           </w:p>
         </w:tc>
@@ -7208,7 +7208,7 @@
                 <w:sz w:val="19"/>
                 <w:rtl/>
               </w:rPr>
-              <w:t>557</w:t>
+              <w:t>555</w:t>
             </w:r>
           </w:p>
         </w:tc>
@@ -7336,7 +7336,7 @@
                 <w:sz w:val="19"/>
                 <w:rtl/>
               </w:rPr>
-              <w:t>561</w:t>
+              <w:t>559</w:t>
             </w:r>
           </w:p>
         </w:tc>
@@ -7463,7 +7463,7 @@
                 <w:sz w:val="19"/>
                 <w:rtl/>
               </w:rPr>
-              <w:t>565</w:t>
+              <w:t>563</w:t>
             </w:r>
           </w:p>
         </w:tc>
@@ -7590,7 +7590,7 @@
                 <w:sz w:val="19"/>
                 <w:rtl/>
               </w:rPr>
-              <w:t>570</w:t>
+              <w:t>568</w:t>
             </w:r>
           </w:p>
         </w:tc>
@@ -7717,7 +7717,7 @@
                 <w:sz w:val="19"/>
                 <w:rtl/>
               </w:rPr>
-              <w:t>578</w:t>
+              <w:t>576</w:t>
             </w:r>
           </w:p>
         </w:tc>

</xml_diff>

<commit_message>
Client corrections: ToC (siman bands, running head, end ornament, leader fix), leader titles and order, פתיחות title page, sentence headings
- ToC: running head, clearer siman bands with an ornament, long titles broken so the
  dotted leader and page number sit on the last line (fixes siman 66), end ornament,
  row heights include margins (+ overflow check); Word ToC mirrors it (TOC1 band, TOC2 entry)
- titles: ראש הכולל הרב ר׳ משה זאדה, נשיא הכולל הגאון ר׳ מרדכי פוטש / דוד פוטש
- inside each siman: מרדכי פוטש, דוד פוטש, משה זאדה, then the rest
- the two opening articles get a "פתיחות" title page (also a ToC band)
- bold sentences that belong to the running text are no longer sub-headings

Co-Authored-By: Claude Sonnet 5.5 <noreply@anthropic.com>
Claude-Session: https://claude.ai/code/session_0161ijXJJcwCxR7y44e5HXLU
</commit_message>
<xml_diff>
--- a/output/doch-shiluv-chavurot.docx
+++ b/output/doch-shiluv-chavurot.docx
@@ -208,7 +208,7 @@
                 <w:sz w:val="19"/>
                 <w:rtl/>
               </w:rPr>
-              <w:t>71</w:t>
+              <w:t>23</w:t>
             </w:r>
           </w:p>
         </w:tc>
@@ -271,7 +271,7 @@
                 <w:sz w:val="19"/>
                 <w:rtl/>
               </w:rPr>
-              <w:t>הרב משה זאדה שליט״א</w:t>
+              <w:t>ראש הכולל הרב ר׳ משה זאדה שליט״א</w:t>
             </w:r>
           </w:p>
         </w:tc>
@@ -335,7 +335,7 @@
                 <w:sz w:val="19"/>
                 <w:rtl/>
               </w:rPr>
-              <w:t>90</w:t>
+              <w:t>78</w:t>
             </w:r>
           </w:p>
         </w:tc>
@@ -398,7 +398,7 @@
                 <w:sz w:val="19"/>
                 <w:rtl/>
               </w:rPr>
-              <w:t>הרב משה זאדה שליט״א</w:t>
+              <w:t>ראש הכולל הרב ר׳ משה זאדה שליט״א</w:t>
             </w:r>
           </w:p>
         </w:tc>
@@ -463,7 +463,7 @@
                 <w:sz w:val="19"/>
                 <w:rtl/>
               </w:rPr>
-              <w:t>149</w:t>
+              <w:t>152</w:t>
             </w:r>
           </w:p>
         </w:tc>
@@ -590,7 +590,7 @@
                 <w:sz w:val="19"/>
                 <w:rtl/>
               </w:rPr>
-              <w:t>152</w:t>
+              <w:t>155</w:t>
             </w:r>
           </w:p>
         </w:tc>
@@ -632,49 +632,49 @@
                 <w:sz w:val="19"/>
                 <w:rtl/>
               </w:rPr>
-              <w:t>בדין פשיטת הטלית</w:t>
-            </w:r>
-          </w:p>
-        </w:tc>
-        <w:tc>
-          <w:tcPr>
-            <w:tcW w:type="dxa" w:w="1757"/>
-          </w:tcPr>
-          <w:p>
-            <w:pPr>
-              <w:bidi/>
-              <w:jc w:val="right"/>
-            </w:pPr>
-            <w:r/>
-            <w:r>
-              <w:rPr>
-                <w:rFonts w:ascii="David" w:hAnsi="David" w:cs="David"/>
-                <w:b w:val="0"/>
-                <w:sz w:val="19"/>
-                <w:rtl/>
-              </w:rPr>
-              <w:t>הרב אברהם יהונתן ניסן שליט״א</w:t>
-            </w:r>
-          </w:p>
-        </w:tc>
-        <w:tc>
-          <w:tcPr>
-            <w:tcW w:type="dxa" w:w="1757"/>
-          </w:tcPr>
-          <w:p>
-            <w:pPr>
-              <w:bidi/>
-              <w:jc w:val="right"/>
-            </w:pPr>
-            <w:r/>
-            <w:r>
-              <w:rPr>
-                <w:rFonts w:ascii="David" w:hAnsi="David" w:cs="David"/>
-                <w:b w:val="0"/>
-                <w:sz w:val="19"/>
-                <w:rtl/>
-              </w:rPr>
-              <w:t>חוברת מתוקנת.docx</w:t>
+              <w:t>אופן אמירת ברכת המצות</w:t>
+            </w:r>
+          </w:p>
+        </w:tc>
+        <w:tc>
+          <w:tcPr>
+            <w:tcW w:type="dxa" w:w="1757"/>
+          </w:tcPr>
+          <w:p>
+            <w:pPr>
+              <w:bidi/>
+              <w:jc w:val="right"/>
+            </w:pPr>
+            <w:r/>
+            <w:r>
+              <w:rPr>
+                <w:rFonts w:ascii="David" w:hAnsi="David" w:cs="David"/>
+                <w:b w:val="0"/>
+                <w:sz w:val="19"/>
+                <w:rtl/>
+              </w:rPr>
+              <w:t>ראש הכולל הרב ר׳ משה זאדה שליט״א</w:t>
+            </w:r>
+          </w:p>
+        </w:tc>
+        <w:tc>
+          <w:tcPr>
+            <w:tcW w:type="dxa" w:w="1757"/>
+          </w:tcPr>
+          <w:p>
+            <w:pPr>
+              <w:bidi/>
+              <w:jc w:val="right"/>
+            </w:pPr>
+            <w:r/>
+            <w:r>
+              <w:rPr>
+                <w:rFonts w:ascii="David" w:hAnsi="David" w:cs="David"/>
+                <w:b w:val="0"/>
+                <w:sz w:val="19"/>
+                <w:rtl/>
+              </w:rPr>
+              <w:t>סימן ח.docx</w:t>
             </w:r>
           </w:p>
         </w:tc>
@@ -717,7 +717,7 @@
                 <w:sz w:val="19"/>
                 <w:rtl/>
               </w:rPr>
-              <w:t>154</w:t>
+              <w:t>159</w:t>
             </w:r>
           </w:p>
         </w:tc>
@@ -759,49 +759,49 @@
                 <w:sz w:val="19"/>
                 <w:rtl/>
               </w:rPr>
-              <w:t>בענין ברכת ציצית והעטיפה מעומד</w:t>
-            </w:r>
-          </w:p>
-        </w:tc>
-        <w:tc>
-          <w:tcPr>
-            <w:tcW w:type="dxa" w:w="1757"/>
-          </w:tcPr>
-          <w:p>
-            <w:pPr>
-              <w:bidi/>
-              <w:jc w:val="right"/>
-            </w:pPr>
-            <w:r/>
-            <w:r>
-              <w:rPr>
-                <w:rFonts w:ascii="David" w:hAnsi="David" w:cs="David"/>
-                <w:b w:val="0"/>
-                <w:sz w:val="19"/>
-                <w:rtl/>
-              </w:rPr>
-              <w:t>הרב נח קליין שליט״א</w:t>
-            </w:r>
-          </w:p>
-        </w:tc>
-        <w:tc>
-          <w:tcPr>
-            <w:tcW w:type="dxa" w:w="1757"/>
-          </w:tcPr>
-          <w:p>
-            <w:pPr>
-              <w:bidi/>
-              <w:jc w:val="right"/>
-            </w:pPr>
-            <w:r/>
-            <w:r>
-              <w:rPr>
-                <w:rFonts w:ascii="David" w:hAnsi="David" w:cs="David"/>
-                <w:b w:val="0"/>
-                <w:sz w:val="19"/>
-                <w:rtl/>
-              </w:rPr>
-              <w:t>סימן ח (4).docx</w:t>
+              <w:t>בדין פשיטת הטלית</w:t>
+            </w:r>
+          </w:p>
+        </w:tc>
+        <w:tc>
+          <w:tcPr>
+            <w:tcW w:type="dxa" w:w="1757"/>
+          </w:tcPr>
+          <w:p>
+            <w:pPr>
+              <w:bidi/>
+              <w:jc w:val="right"/>
+            </w:pPr>
+            <w:r/>
+            <w:r>
+              <w:rPr>
+                <w:rFonts w:ascii="David" w:hAnsi="David" w:cs="David"/>
+                <w:b w:val="0"/>
+                <w:sz w:val="19"/>
+                <w:rtl/>
+              </w:rPr>
+              <w:t>הרב אברהם יהונתן ניסן שליט״א</w:t>
+            </w:r>
+          </w:p>
+        </w:tc>
+        <w:tc>
+          <w:tcPr>
+            <w:tcW w:type="dxa" w:w="1757"/>
+          </w:tcPr>
+          <w:p>
+            <w:pPr>
+              <w:bidi/>
+              <w:jc w:val="right"/>
+            </w:pPr>
+            <w:r/>
+            <w:r>
+              <w:rPr>
+                <w:rFonts w:ascii="David" w:hAnsi="David" w:cs="David"/>
+                <w:b w:val="0"/>
+                <w:sz w:val="19"/>
+                <w:rtl/>
+              </w:rPr>
+              <w:t>חוברת מתוקנת.docx</w:t>
             </w:r>
           </w:p>
         </w:tc>
@@ -844,7 +844,7 @@
                 <w:sz w:val="19"/>
                 <w:rtl/>
               </w:rPr>
-              <w:t>157</w:t>
+              <w:t>161</w:t>
             </w:r>
           </w:p>
         </w:tc>
@@ -886,49 +886,49 @@
                 <w:sz w:val="19"/>
                 <w:rtl/>
               </w:rPr>
-              <w:t>אופן אמירת ברכת המצות</w:t>
-            </w:r>
-          </w:p>
-        </w:tc>
-        <w:tc>
-          <w:tcPr>
-            <w:tcW w:type="dxa" w:w="1757"/>
-          </w:tcPr>
-          <w:p>
-            <w:pPr>
-              <w:bidi/>
-              <w:jc w:val="right"/>
-            </w:pPr>
-            <w:r/>
-            <w:r>
-              <w:rPr>
-                <w:rFonts w:ascii="David" w:hAnsi="David" w:cs="David"/>
-                <w:b w:val="0"/>
-                <w:sz w:val="19"/>
-                <w:rtl/>
-              </w:rPr>
-              <w:t>הרב משה זאדה שליט״א</w:t>
-            </w:r>
-          </w:p>
-        </w:tc>
-        <w:tc>
-          <w:tcPr>
-            <w:tcW w:type="dxa" w:w="1757"/>
-          </w:tcPr>
-          <w:p>
-            <w:pPr>
-              <w:bidi/>
-              <w:jc w:val="right"/>
-            </w:pPr>
-            <w:r/>
-            <w:r>
-              <w:rPr>
-                <w:rFonts w:ascii="David" w:hAnsi="David" w:cs="David"/>
-                <w:b w:val="0"/>
-                <w:sz w:val="19"/>
-                <w:rtl/>
-              </w:rPr>
-              <w:t>סימן ח.docx</w:t>
+              <w:t>בענין ברכת ציצית והעטיפה מעומד</w:t>
+            </w:r>
+          </w:p>
+        </w:tc>
+        <w:tc>
+          <w:tcPr>
+            <w:tcW w:type="dxa" w:w="1757"/>
+          </w:tcPr>
+          <w:p>
+            <w:pPr>
+              <w:bidi/>
+              <w:jc w:val="right"/>
+            </w:pPr>
+            <w:r/>
+            <w:r>
+              <w:rPr>
+                <w:rFonts w:ascii="David" w:hAnsi="David" w:cs="David"/>
+                <w:b w:val="0"/>
+                <w:sz w:val="19"/>
+                <w:rtl/>
+              </w:rPr>
+              <w:t>הרב נח קליין שליט״א</w:t>
+            </w:r>
+          </w:p>
+        </w:tc>
+        <w:tc>
+          <w:tcPr>
+            <w:tcW w:type="dxa" w:w="1757"/>
+          </w:tcPr>
+          <w:p>
+            <w:pPr>
+              <w:bidi/>
+              <w:jc w:val="right"/>
+            </w:pPr>
+            <w:r/>
+            <w:r>
+              <w:rPr>
+                <w:rFonts w:ascii="David" w:hAnsi="David" w:cs="David"/>
+                <w:b w:val="0"/>
+                <w:sz w:val="19"/>
+                <w:rtl/>
+              </w:rPr>
+              <w:t>סימן ח (4).docx</w:t>
             </w:r>
           </w:p>
         </w:tc>
@@ -971,7 +971,7 @@
                 <w:sz w:val="19"/>
                 <w:rtl/>
               </w:rPr>
-              <w:t>161</w:t>
+              <w:t>164</w:t>
             </w:r>
           </w:p>
         </w:tc>
@@ -1099,7 +1099,7 @@
                 <w:sz w:val="19"/>
                 <w:rtl/>
               </w:rPr>
-              <w:t>175</w:t>
+              <w:t>178</w:t>
             </w:r>
           </w:p>
         </w:tc>
@@ -1227,7 +1227,7 @@
                 <w:sz w:val="19"/>
                 <w:rtl/>
               </w:rPr>
-              <w:t>177</w:t>
+              <w:t>180</w:t>
             </w:r>
           </w:p>
         </w:tc>
@@ -1354,7 +1354,7 @@
                 <w:sz w:val="19"/>
                 <w:rtl/>
               </w:rPr>
-              <w:t>180</w:t>
+              <w:t>183</w:t>
             </w:r>
           </w:p>
         </w:tc>
@@ -1481,7 +1481,7 @@
                 <w:sz w:val="19"/>
                 <w:rtl/>
               </w:rPr>
-              <w:t>182</w:t>
+              <w:t>185</w:t>
             </w:r>
           </w:p>
         </w:tc>
@@ -1608,7 +1608,7 @@
                 <w:sz w:val="19"/>
                 <w:rtl/>
               </w:rPr>
-              <w:t>185</w:t>
+              <w:t>188</w:t>
             </w:r>
           </w:p>
         </w:tc>
@@ -1671,7 +1671,7 @@
                 <w:sz w:val="19"/>
                 <w:rtl/>
               </w:rPr>
-              <w:t>הרב משה זאדה שליט״א</w:t>
+              <w:t>ראש הכולל הרב ר׳ משה זאדה שליט״א</w:t>
             </w:r>
           </w:p>
         </w:tc>
@@ -1736,7 +1736,7 @@
                 <w:sz w:val="19"/>
                 <w:rtl/>
               </w:rPr>
-              <w:t>190</w:t>
+              <w:t>193</w:t>
             </w:r>
           </w:p>
         </w:tc>
@@ -1863,7 +1863,7 @@
                 <w:sz w:val="19"/>
                 <w:rtl/>
               </w:rPr>
-              <w:t>192</w:t>
+              <w:t>195</w:t>
             </w:r>
           </w:p>
         </w:tc>
@@ -1990,7 +1990,7 @@
                 <w:sz w:val="19"/>
                 <w:rtl/>
               </w:rPr>
-              <w:t>193</w:t>
+              <w:t>196</w:t>
             </w:r>
           </w:p>
         </w:tc>
@@ -2117,7 +2117,7 @@
                 <w:sz w:val="19"/>
                 <w:rtl/>
               </w:rPr>
-              <w:t>266</w:t>
+              <w:t>269</w:t>
             </w:r>
           </w:p>
         </w:tc>
@@ -2245,7 +2245,7 @@
                 <w:sz w:val="19"/>
                 <w:rtl/>
               </w:rPr>
-              <w:t>270</w:t>
+              <w:t>273</w:t>
             </w:r>
           </w:p>
         </w:tc>
@@ -2373,7 +2373,7 @@
                 <w:sz w:val="19"/>
                 <w:rtl/>
               </w:rPr>
-              <w:t>274</w:t>
+              <w:t>277</w:t>
             </w:r>
           </w:p>
         </w:tc>
@@ -2501,7 +2501,7 @@
                 <w:sz w:val="19"/>
                 <w:rtl/>
               </w:rPr>
-              <w:t>277</w:t>
+              <w:t>280</w:t>
             </w:r>
           </w:p>
         </w:tc>
@@ -2629,7 +2629,7 @@
                 <w:sz w:val="19"/>
                 <w:rtl/>
               </w:rPr>
-              <w:t>289</w:t>
+              <w:t>292</w:t>
             </w:r>
           </w:p>
         </w:tc>
@@ -2757,7 +2757,7 @@
                 <w:sz w:val="19"/>
                 <w:rtl/>
               </w:rPr>
-              <w:t>294</w:t>
+              <w:t>297</w:t>
             </w:r>
           </w:p>
         </w:tc>
@@ -2884,7 +2884,7 @@
                 <w:sz w:val="19"/>
                 <w:rtl/>
               </w:rPr>
-              <w:t>298</w:t>
+              <w:t>301</w:t>
             </w:r>
           </w:p>
         </w:tc>
@@ -3011,7 +3011,7 @@
                 <w:sz w:val="19"/>
                 <w:rtl/>
               </w:rPr>
-              <w:t>304</w:t>
+              <w:t>315</w:t>
             </w:r>
           </w:p>
         </w:tc>
@@ -3138,7 +3138,7 @@
                 <w:sz w:val="19"/>
                 <w:rtl/>
               </w:rPr>
-              <w:t>309</w:t>
+              <w:t>320</w:t>
             </w:r>
           </w:p>
         </w:tc>
@@ -3265,7 +3265,7 @@
                 <w:sz w:val="19"/>
                 <w:rtl/>
               </w:rPr>
-              <w:t>315</w:t>
+              <w:t>326</w:t>
             </w:r>
           </w:p>
         </w:tc>
@@ -3392,7 +3392,7 @@
                 <w:sz w:val="19"/>
                 <w:rtl/>
               </w:rPr>
-              <w:t>325</w:t>
+              <w:t>328</w:t>
             </w:r>
           </w:p>
         </w:tc>
@@ -3519,7 +3519,7 @@
                 <w:sz w:val="19"/>
                 <w:rtl/>
               </w:rPr>
-              <w:t>331</w:t>
+              <w:t>334</w:t>
             </w:r>
           </w:p>
         </w:tc>
@@ -3582,7 +3582,7 @@
                 <w:sz w:val="19"/>
                 <w:rtl/>
               </w:rPr>
-              <w:t>הרב משה זאדה שליט״א</w:t>
+              <w:t>ראש הכולל הרב ר׳ משה זאדה שליט״א</w:t>
             </w:r>
           </w:p>
         </w:tc>
@@ -3646,7 +3646,7 @@
                 <w:sz w:val="19"/>
                 <w:rtl/>
               </w:rPr>
-              <w:t>342</w:t>
+              <w:t>345</w:t>
             </w:r>
           </w:p>
         </w:tc>
@@ -3709,7 +3709,7 @@
                 <w:sz w:val="19"/>
                 <w:rtl/>
               </w:rPr>
-              <w:t>הרב משה זאדה שליט״א</w:t>
+              <w:t>ראש הכולל הרב ר׳ משה זאדה שליט״א</w:t>
             </w:r>
           </w:p>
         </w:tc>
@@ -3773,7 +3773,7 @@
                 <w:sz w:val="19"/>
                 <w:rtl/>
               </w:rPr>
-              <w:t>353</w:t>
+              <w:t>356</w:t>
             </w:r>
           </w:p>
         </w:tc>
@@ -3900,7 +3900,7 @@
                 <w:sz w:val="19"/>
                 <w:rtl/>
               </w:rPr>
-              <w:t>356</w:t>
+              <w:t>359</w:t>
             </w:r>
           </w:p>
         </w:tc>
@@ -4028,7 +4028,7 @@
                 <w:sz w:val="19"/>
                 <w:rtl/>
               </w:rPr>
-              <w:t>370</w:t>
+              <w:t>373</w:t>
             </w:r>
           </w:p>
         </w:tc>
@@ -4155,7 +4155,7 @@
                 <w:sz w:val="19"/>
                 <w:rtl/>
               </w:rPr>
-              <w:t>373</w:t>
+              <w:t>376</w:t>
             </w:r>
           </w:p>
         </w:tc>
@@ -4283,7 +4283,7 @@
                 <w:sz w:val="19"/>
                 <w:rtl/>
               </w:rPr>
-              <w:t>376</w:t>
+              <w:t>379</w:t>
             </w:r>
           </w:p>
         </w:tc>
@@ -4410,7 +4410,7 @@
                 <w:sz w:val="19"/>
                 <w:rtl/>
               </w:rPr>
-              <w:t>380</w:t>
+              <w:t>383</w:t>
             </w:r>
           </w:p>
         </w:tc>
@@ -4538,7 +4538,7 @@
                 <w:sz w:val="19"/>
                 <w:rtl/>
               </w:rPr>
-              <w:t>383</w:t>
+              <w:t>386</w:t>
             </w:r>
           </w:p>
         </w:tc>
@@ -4665,7 +4665,7 @@
                 <w:sz w:val="19"/>
                 <w:rtl/>
               </w:rPr>
-              <w:t>386</w:t>
+              <w:t>389</w:t>
             </w:r>
           </w:p>
         </w:tc>
@@ -4793,7 +4793,7 @@
                 <w:sz w:val="19"/>
                 <w:rtl/>
               </w:rPr>
-              <w:t>389</w:t>
+              <w:t>392</w:t>
             </w:r>
           </w:p>
         </w:tc>
@@ -4920,7 +4920,7 @@
                 <w:sz w:val="19"/>
                 <w:rtl/>
               </w:rPr>
-              <w:t>392</w:t>
+              <w:t>395</w:t>
             </w:r>
           </w:p>
         </w:tc>
@@ -5047,7 +5047,7 @@
                 <w:sz w:val="19"/>
                 <w:rtl/>
               </w:rPr>
-              <w:t>398</w:t>
+              <w:t>401</w:t>
             </w:r>
           </w:p>
         </w:tc>
@@ -5089,69 +5089,70 @@
                 <w:sz w:val="19"/>
                 <w:rtl/>
               </w:rPr>
-              <w:t>הגדרת מחלוקת השיטות במצוות צריכות כונה ועפי״ז להבין הדינים שמצאנו בפוסקים</w:t>
-            </w:r>
-          </w:p>
-        </w:tc>
-        <w:tc>
-          <w:tcPr>
-            <w:tcW w:type="dxa" w:w="1757"/>
-          </w:tcPr>
-          <w:p>
-            <w:pPr>
-              <w:bidi/>
-              <w:jc w:val="right"/>
-            </w:pPr>
-            <w:r/>
-            <w:r>
-              <w:rPr>
-                <w:rFonts w:ascii="David" w:hAnsi="David" w:cs="David"/>
-                <w:b w:val="0"/>
-                <w:sz w:val="19"/>
-                <w:rtl/>
-              </w:rPr>
-              <w:t>הרב אליעזר רוטנברג שליט״א</w:t>
-            </w:r>
-          </w:p>
-        </w:tc>
-        <w:tc>
-          <w:tcPr>
-            <w:tcW w:type="dxa" w:w="1757"/>
-          </w:tcPr>
-          <w:p>
-            <w:pPr>
-              <w:bidi/>
-              <w:jc w:val="right"/>
-            </w:pPr>
-            <w:r/>
-            <w:r>
-              <w:rPr>
-                <w:rFonts w:ascii="David" w:hAnsi="David" w:cs="David"/>
-                <w:b w:val="0"/>
-                <w:sz w:val="19"/>
-                <w:rtl/>
-              </w:rPr>
-              <w:t>אליעזר רוטנברג סימן ס סעיף ד.docx</w:t>
-            </w:r>
-          </w:p>
-        </w:tc>
-        <w:tc>
-          <w:tcPr>
-            <w:tcW w:type="dxa" w:w="1757"/>
-          </w:tcPr>
-          <w:p>
-            <w:pPr>
-              <w:bidi/>
-              <w:jc w:val="right"/>
-            </w:pPr>
-            <w:r/>
-            <w:r>
-              <w:rPr>
-                <w:rFonts w:ascii="David" w:hAnsi="David" w:cs="David"/>
-                <w:b w:val="0"/>
-                <w:sz w:val="19"/>
-                <w:rtl/>
-              </w:rPr>
+              <w:t>עיקרי הדברים לספר בענין מצוות צריכות כוונה</w:t>
+            </w:r>
+          </w:p>
+        </w:tc>
+        <w:tc>
+          <w:tcPr>
+            <w:tcW w:type="dxa" w:w="1757"/>
+          </w:tcPr>
+          <w:p>
+            <w:pPr>
+              <w:bidi/>
+              <w:jc w:val="right"/>
+            </w:pPr>
+            <w:r/>
+            <w:r>
+              <w:rPr>
+                <w:rFonts w:ascii="David" w:hAnsi="David" w:cs="David"/>
+                <w:b w:val="0"/>
+                <w:sz w:val="19"/>
+                <w:rtl/>
+              </w:rPr>
+              <w:t>ראש הכולל הרב ר׳ משה זאדה שליט״א</w:t>
+            </w:r>
+          </w:p>
+        </w:tc>
+        <w:tc>
+          <w:tcPr>
+            <w:tcW w:type="dxa" w:w="1757"/>
+          </w:tcPr>
+          <w:p>
+            <w:pPr>
+              <w:bidi/>
+              <w:jc w:val="right"/>
+            </w:pPr>
+            <w:r/>
+            <w:r>
+              <w:rPr>
+                <w:rFonts w:ascii="David" w:hAnsi="David" w:cs="David"/>
+                <w:b w:val="0"/>
+                <w:sz w:val="19"/>
+                <w:rtl/>
+              </w:rPr>
+              <w:t>עיקרי הדברים לספר בענין מצות צריכות כוונה.docx</w:t>
+            </w:r>
+          </w:p>
+        </w:tc>
+        <w:tc>
+          <w:tcPr>
+            <w:tcW w:type="dxa" w:w="1757"/>
+          </w:tcPr>
+          <w:p>
+            <w:pPr>
+              <w:bidi/>
+              <w:jc w:val="right"/>
+            </w:pPr>
+            <w:r/>
+            <w:r>
+              <w:rPr>
+                <w:rFonts w:ascii="David" w:hAnsi="David" w:cs="David"/>
+                <w:b w:val="0"/>
+                <w:sz w:val="19"/>
+                <w:rtl/>
+              </w:rPr>
+              <w:t>טיוטת ספר (כ-21,000 מילים) – נכלל כי נמצא בתיקיית החבורות; קל להוציאו</w:t>
             </w:r>
           </w:p>
         </w:tc>
@@ -5174,7 +5175,7 @@
                 <w:sz w:val="19"/>
                 <w:rtl/>
               </w:rPr>
-              <w:t>401</w:t>
+              <w:t>454</w:t>
             </w:r>
           </w:p>
         </w:tc>
@@ -5216,49 +5217,49 @@
                 <w:sz w:val="19"/>
                 <w:rtl/>
               </w:rPr>
-              <w:t>ביסוד הדין דמצוות צריכות כוונה</w:t>
-            </w:r>
-          </w:p>
-        </w:tc>
-        <w:tc>
-          <w:tcPr>
-            <w:tcW w:type="dxa" w:w="1757"/>
-          </w:tcPr>
-          <w:p>
-            <w:pPr>
-              <w:bidi/>
-              <w:jc w:val="right"/>
-            </w:pPr>
-            <w:r/>
-            <w:r>
-              <w:rPr>
-                <w:rFonts w:ascii="David" w:hAnsi="David" w:cs="David"/>
-                <w:b w:val="0"/>
-                <w:sz w:val="19"/>
-                <w:rtl/>
-              </w:rPr>
-              <w:t>הרב יעקב ישראל שטרן שליט״א</w:t>
-            </w:r>
-          </w:p>
-        </w:tc>
-        <w:tc>
-          <w:tcPr>
-            <w:tcW w:type="dxa" w:w="1757"/>
-          </w:tcPr>
-          <w:p>
-            <w:pPr>
-              <w:bidi/>
-              <w:jc w:val="right"/>
-            </w:pPr>
-            <w:r/>
-            <w:r>
-              <w:rPr>
-                <w:rFonts w:ascii="David" w:hAnsi="David" w:cs="David"/>
-                <w:b w:val="0"/>
-                <w:sz w:val="19"/>
-                <w:rtl/>
-              </w:rPr>
-              <w:t>יעקב ישראל שטרן סימן ס סעיף ד.docx</w:t>
+              <w:t>הגדרת מחלוקת השיטות במצוות צריכות כונה ועפי״ז להבין הדינים שמצאנו בפוסקים</w:t>
+            </w:r>
+          </w:p>
+        </w:tc>
+        <w:tc>
+          <w:tcPr>
+            <w:tcW w:type="dxa" w:w="1757"/>
+          </w:tcPr>
+          <w:p>
+            <w:pPr>
+              <w:bidi/>
+              <w:jc w:val="right"/>
+            </w:pPr>
+            <w:r/>
+            <w:r>
+              <w:rPr>
+                <w:rFonts w:ascii="David" w:hAnsi="David" w:cs="David"/>
+                <w:b w:val="0"/>
+                <w:sz w:val="19"/>
+                <w:rtl/>
+              </w:rPr>
+              <w:t>הרב אליעזר רוטנברג שליט״א</w:t>
+            </w:r>
+          </w:p>
+        </w:tc>
+        <w:tc>
+          <w:tcPr>
+            <w:tcW w:type="dxa" w:w="1757"/>
+          </w:tcPr>
+          <w:p>
+            <w:pPr>
+              <w:bidi/>
+              <w:jc w:val="right"/>
+            </w:pPr>
+            <w:r/>
+            <w:r>
+              <w:rPr>
+                <w:rFonts w:ascii="David" w:hAnsi="David" w:cs="David"/>
+                <w:b w:val="0"/>
+                <w:sz w:val="19"/>
+                <w:rtl/>
+              </w:rPr>
+              <w:t>אליעזר רוטנברג סימן ס סעיף ד.docx</w:t>
             </w:r>
           </w:p>
         </w:tc>
@@ -5301,7 +5302,7 @@
                 <w:sz w:val="19"/>
                 <w:rtl/>
               </w:rPr>
-              <w:t>404</w:t>
+              <w:t>457</w:t>
             </w:r>
           </w:p>
         </w:tc>
@@ -5343,49 +5344,49 @@
                 <w:sz w:val="19"/>
                 <w:rtl/>
               </w:rPr>
-              <w:t>מצוות צריכות כוונה</w:t>
-            </w:r>
-          </w:p>
-        </w:tc>
-        <w:tc>
-          <w:tcPr>
-            <w:tcW w:type="dxa" w:w="1757"/>
-          </w:tcPr>
-          <w:p>
-            <w:pPr>
-              <w:bidi/>
-              <w:jc w:val="right"/>
-            </w:pPr>
-            <w:r/>
-            <w:r>
-              <w:rPr>
-                <w:rFonts w:ascii="David" w:hAnsi="David" w:cs="David"/>
-                <w:b w:val="0"/>
-                <w:sz w:val="19"/>
-                <w:rtl/>
-              </w:rPr>
-              <w:t>הרב נח קליין שליט״א</w:t>
-            </w:r>
-          </w:p>
-        </w:tc>
-        <w:tc>
-          <w:tcPr>
-            <w:tcW w:type="dxa" w:w="1757"/>
-          </w:tcPr>
-          <w:p>
-            <w:pPr>
-              <w:bidi/>
-              <w:jc w:val="right"/>
-            </w:pPr>
-            <w:r/>
-            <w:r>
-              <w:rPr>
-                <w:rFonts w:ascii="David" w:hAnsi="David" w:cs="David"/>
-                <w:b w:val="0"/>
-                <w:sz w:val="19"/>
-                <w:rtl/>
-              </w:rPr>
-              <w:t>נח קליין סימן ס סעיף ד.docx</w:t>
+              <w:t>ביסוד הדין דמצוות צריכות כוונה</w:t>
+            </w:r>
+          </w:p>
+        </w:tc>
+        <w:tc>
+          <w:tcPr>
+            <w:tcW w:type="dxa" w:w="1757"/>
+          </w:tcPr>
+          <w:p>
+            <w:pPr>
+              <w:bidi/>
+              <w:jc w:val="right"/>
+            </w:pPr>
+            <w:r/>
+            <w:r>
+              <w:rPr>
+                <w:rFonts w:ascii="David" w:hAnsi="David" w:cs="David"/>
+                <w:b w:val="0"/>
+                <w:sz w:val="19"/>
+                <w:rtl/>
+              </w:rPr>
+              <w:t>הרב יעקב ישראל שטרן שליט״א</w:t>
+            </w:r>
+          </w:p>
+        </w:tc>
+        <w:tc>
+          <w:tcPr>
+            <w:tcW w:type="dxa" w:w="1757"/>
+          </w:tcPr>
+          <w:p>
+            <w:pPr>
+              <w:bidi/>
+              <w:jc w:val="right"/>
+            </w:pPr>
+            <w:r/>
+            <w:r>
+              <w:rPr>
+                <w:rFonts w:ascii="David" w:hAnsi="David" w:cs="David"/>
+                <w:b w:val="0"/>
+                <w:sz w:val="19"/>
+                <w:rtl/>
+              </w:rPr>
+              <w:t>יעקב ישראל שטרן סימן ס סעיף ד.docx</w:t>
             </w:r>
           </w:p>
         </w:tc>
@@ -5428,7 +5429,7 @@
                 <w:sz w:val="19"/>
                 <w:rtl/>
               </w:rPr>
-              <w:t>407</w:t>
+              <w:t>460</w:t>
             </w:r>
           </w:p>
         </w:tc>
@@ -5470,49 +5471,49 @@
                 <w:sz w:val="19"/>
                 <w:rtl/>
               </w:rPr>
-              <w:t>סיכום משנ״ב סימן ס׳ סעיף ד׳</w:t>
-            </w:r>
-          </w:p>
-        </w:tc>
-        <w:tc>
-          <w:tcPr>
-            <w:tcW w:type="dxa" w:w="1757"/>
-          </w:tcPr>
-          <w:p>
-            <w:pPr>
-              <w:bidi/>
-              <w:jc w:val="right"/>
-            </w:pPr>
-            <w:r/>
-            <w:r>
-              <w:rPr>
-                <w:rFonts w:ascii="David" w:hAnsi="David" w:cs="David"/>
-                <w:b w:val="0"/>
-                <w:sz w:val="19"/>
-                <w:rtl/>
-              </w:rPr>
-              <w:t>הרב משה דוד הופט שליט״א</w:t>
-            </w:r>
-          </w:p>
-        </w:tc>
-        <w:tc>
-          <w:tcPr>
-            <w:tcW w:type="dxa" w:w="1757"/>
-          </w:tcPr>
-          <w:p>
-            <w:pPr>
-              <w:bidi/>
-              <w:jc w:val="right"/>
-            </w:pPr>
-            <w:r/>
-            <w:r>
-              <w:rPr>
-                <w:rFonts w:ascii="David" w:hAnsi="David" w:cs="David"/>
-                <w:b w:val="0"/>
-                <w:sz w:val="19"/>
-                <w:rtl/>
-              </w:rPr>
-              <w:t>משה דוד הופט סימן ס סעיף ד.docx</w:t>
+              <w:t>מצוות צריכות כוונה</w:t>
+            </w:r>
+          </w:p>
+        </w:tc>
+        <w:tc>
+          <w:tcPr>
+            <w:tcW w:type="dxa" w:w="1757"/>
+          </w:tcPr>
+          <w:p>
+            <w:pPr>
+              <w:bidi/>
+              <w:jc w:val="right"/>
+            </w:pPr>
+            <w:r/>
+            <w:r>
+              <w:rPr>
+                <w:rFonts w:ascii="David" w:hAnsi="David" w:cs="David"/>
+                <w:b w:val="0"/>
+                <w:sz w:val="19"/>
+                <w:rtl/>
+              </w:rPr>
+              <w:t>הרב נח קליין שליט״א</w:t>
+            </w:r>
+          </w:p>
+        </w:tc>
+        <w:tc>
+          <w:tcPr>
+            <w:tcW w:type="dxa" w:w="1757"/>
+          </w:tcPr>
+          <w:p>
+            <w:pPr>
+              <w:bidi/>
+              <w:jc w:val="right"/>
+            </w:pPr>
+            <w:r/>
+            <w:r>
+              <w:rPr>
+                <w:rFonts w:ascii="David" w:hAnsi="David" w:cs="David"/>
+                <w:b w:val="0"/>
+                <w:sz w:val="19"/>
+                <w:rtl/>
+              </w:rPr>
+              <w:t>נח קליין סימן ס סעיף ד.docx</w:t>
             </w:r>
           </w:p>
         </w:tc>
@@ -5555,7 +5556,7 @@
                 <w:sz w:val="19"/>
                 <w:rtl/>
               </w:rPr>
-              <w:t>411</w:t>
+              <w:t>463</w:t>
             </w:r>
           </w:p>
         </w:tc>
@@ -5597,49 +5598,49 @@
                 <w:sz w:val="19"/>
                 <w:rtl/>
               </w:rPr>
-              <w:t>בענין אם השומע ברכה מאחר יש לו לחוש דיצא יד״ח</w:t>
-            </w:r>
-          </w:p>
-        </w:tc>
-        <w:tc>
-          <w:tcPr>
-            <w:tcW w:type="dxa" w:w="1757"/>
-          </w:tcPr>
-          <w:p>
-            <w:pPr>
-              <w:bidi/>
-              <w:jc w:val="right"/>
-            </w:pPr>
-            <w:r/>
-            <w:r>
-              <w:rPr>
-                <w:rFonts w:ascii="David" w:hAnsi="David" w:cs="David"/>
-                <w:b w:val="0"/>
-                <w:sz w:val="19"/>
-                <w:rtl/>
-              </w:rPr>
-              <w:t>הרב יעקב ישראל שטרן שליט״א</w:t>
-            </w:r>
-          </w:p>
-        </w:tc>
-        <w:tc>
-          <w:tcPr>
-            <w:tcW w:type="dxa" w:w="1757"/>
-          </w:tcPr>
-          <w:p>
-            <w:pPr>
-              <w:bidi/>
-              <w:jc w:val="right"/>
-            </w:pPr>
-            <w:r/>
-            <w:r>
-              <w:rPr>
-                <w:rFonts w:ascii="David" w:hAnsi="David" w:cs="David"/>
-                <w:b w:val="0"/>
-                <w:sz w:val="19"/>
-                <w:rtl/>
-              </w:rPr>
-              <w:t>מצוות צריכות כוונה (2).docx</w:t>
+              <w:t>סיכום משנ״ב סימן ס׳ סעיף ד׳</w:t>
+            </w:r>
+          </w:p>
+        </w:tc>
+        <w:tc>
+          <w:tcPr>
+            <w:tcW w:type="dxa" w:w="1757"/>
+          </w:tcPr>
+          <w:p>
+            <w:pPr>
+              <w:bidi/>
+              <w:jc w:val="right"/>
+            </w:pPr>
+            <w:r/>
+            <w:r>
+              <w:rPr>
+                <w:rFonts w:ascii="David" w:hAnsi="David" w:cs="David"/>
+                <w:b w:val="0"/>
+                <w:sz w:val="19"/>
+                <w:rtl/>
+              </w:rPr>
+              <w:t>הרב משה דוד הופט שליט״א</w:t>
+            </w:r>
+          </w:p>
+        </w:tc>
+        <w:tc>
+          <w:tcPr>
+            <w:tcW w:type="dxa" w:w="1757"/>
+          </w:tcPr>
+          <w:p>
+            <w:pPr>
+              <w:bidi/>
+              <w:jc w:val="right"/>
+            </w:pPr>
+            <w:r/>
+            <w:r>
+              <w:rPr>
+                <w:rFonts w:ascii="David" w:hAnsi="David" w:cs="David"/>
+                <w:b w:val="0"/>
+                <w:sz w:val="19"/>
+                <w:rtl/>
+              </w:rPr>
+              <w:t>משה דוד הופט סימן ס סעיף ד.docx</w:t>
             </w:r>
           </w:p>
         </w:tc>
@@ -5682,7 +5683,7 @@
                 <w:sz w:val="19"/>
                 <w:rtl/>
               </w:rPr>
-              <w:t>424</w:t>
+              <w:t>467</w:t>
             </w:r>
           </w:p>
         </w:tc>
@@ -5724,49 +5725,49 @@
                 <w:sz w:val="19"/>
                 <w:rtl/>
               </w:rPr>
-              <w:t>אם בעת עשיית המצוה מכוון בעיקר לדבר אחר</w:t>
-            </w:r>
-          </w:p>
-        </w:tc>
-        <w:tc>
-          <w:tcPr>
-            <w:tcW w:type="dxa" w:w="1757"/>
-          </w:tcPr>
-          <w:p>
-            <w:pPr>
-              <w:bidi/>
-              <w:jc w:val="right"/>
-            </w:pPr>
-            <w:r/>
-            <w:r>
-              <w:rPr>
-                <w:rFonts w:ascii="David" w:hAnsi="David" w:cs="David"/>
-                <w:b w:val="0"/>
-                <w:sz w:val="19"/>
-                <w:rtl/>
-              </w:rPr>
-              <w:t>הרב עזרא בטאט שליט״א</w:t>
-            </w:r>
-          </w:p>
-        </w:tc>
-        <w:tc>
-          <w:tcPr>
-            <w:tcW w:type="dxa" w:w="1757"/>
-          </w:tcPr>
-          <w:p>
-            <w:pPr>
-              <w:bidi/>
-              <w:jc w:val="right"/>
-            </w:pPr>
-            <w:r/>
-            <w:r>
-              <w:rPr>
-                <w:rFonts w:ascii="David" w:hAnsi="David" w:cs="David"/>
-                <w:b w:val="0"/>
-                <w:sz w:val="19"/>
-                <w:rtl/>
-              </w:rPr>
-              <w:t>עזרא בטאט סימן ס סעיף ד.docx</w:t>
+              <w:t>בענין אם השומע ברכה מאחר יש לו לחוש דיצא יד״ח</w:t>
+            </w:r>
+          </w:p>
+        </w:tc>
+        <w:tc>
+          <w:tcPr>
+            <w:tcW w:type="dxa" w:w="1757"/>
+          </w:tcPr>
+          <w:p>
+            <w:pPr>
+              <w:bidi/>
+              <w:jc w:val="right"/>
+            </w:pPr>
+            <w:r/>
+            <w:r>
+              <w:rPr>
+                <w:rFonts w:ascii="David" w:hAnsi="David" w:cs="David"/>
+                <w:b w:val="0"/>
+                <w:sz w:val="19"/>
+                <w:rtl/>
+              </w:rPr>
+              <w:t>הרב יעקב ישראל שטרן שליט״א</w:t>
+            </w:r>
+          </w:p>
+        </w:tc>
+        <w:tc>
+          <w:tcPr>
+            <w:tcW w:type="dxa" w:w="1757"/>
+          </w:tcPr>
+          <w:p>
+            <w:pPr>
+              <w:bidi/>
+              <w:jc w:val="right"/>
+            </w:pPr>
+            <w:r/>
+            <w:r>
+              <w:rPr>
+                <w:rFonts w:ascii="David" w:hAnsi="David" w:cs="David"/>
+                <w:b w:val="0"/>
+                <w:sz w:val="19"/>
+                <w:rtl/>
+              </w:rPr>
+              <w:t>מצוות צריכות כוונה (2).docx</w:t>
             </w:r>
           </w:p>
         </w:tc>
@@ -5809,7 +5810,7 @@
                 <w:sz w:val="19"/>
                 <w:rtl/>
               </w:rPr>
-              <w:t>428</w:t>
+              <w:t>480</w:t>
             </w:r>
           </w:p>
         </w:tc>
@@ -5851,70 +5852,69 @@
                 <w:sz w:val="19"/>
                 <w:rtl/>
               </w:rPr>
-              <w:t>עיקרי הדברים לספר בענין מצוות צריכות כוונה</w:t>
-            </w:r>
-          </w:p>
-        </w:tc>
-        <w:tc>
-          <w:tcPr>
-            <w:tcW w:type="dxa" w:w="1757"/>
-          </w:tcPr>
-          <w:p>
-            <w:pPr>
-              <w:bidi/>
-              <w:jc w:val="right"/>
-            </w:pPr>
-            <w:r/>
-            <w:r>
-              <w:rPr>
-                <w:rFonts w:ascii="David" w:hAnsi="David" w:cs="David"/>
-                <w:b w:val="0"/>
-                <w:sz w:val="19"/>
-                <w:rtl/>
-              </w:rPr>
-              <w:t>הרב משה זאדה שליט״א</w:t>
-            </w:r>
-          </w:p>
-        </w:tc>
-        <w:tc>
-          <w:tcPr>
-            <w:tcW w:type="dxa" w:w="1757"/>
-          </w:tcPr>
-          <w:p>
-            <w:pPr>
-              <w:bidi/>
-              <w:jc w:val="right"/>
-            </w:pPr>
-            <w:r/>
-            <w:r>
-              <w:rPr>
-                <w:rFonts w:ascii="David" w:hAnsi="David" w:cs="David"/>
-                <w:b w:val="0"/>
-                <w:sz w:val="19"/>
-                <w:rtl/>
-              </w:rPr>
-              <w:t>עיקרי הדברים לספר בענין מצות צריכות כוונה.docx</w:t>
-            </w:r>
-          </w:p>
-        </w:tc>
-        <w:tc>
-          <w:tcPr>
-            <w:tcW w:type="dxa" w:w="1757"/>
-          </w:tcPr>
-          <w:p>
-            <w:pPr>
-              <w:bidi/>
-              <w:jc w:val="right"/>
-            </w:pPr>
-            <w:r/>
-            <w:r>
-              <w:rPr>
-                <w:rFonts w:ascii="David" w:hAnsi="David" w:cs="David"/>
-                <w:b w:val="0"/>
-                <w:sz w:val="19"/>
-                <w:rtl/>
-              </w:rPr>
-              <w:t>טיוטת ספר (כ-21,000 מילים) – נכלל כי נמצא בתיקיית החבורות; קל להוציאו</w:t>
+              <w:t>אם בעת עשיית המצוה מכוון בעיקר לדבר אחר</w:t>
+            </w:r>
+          </w:p>
+        </w:tc>
+        <w:tc>
+          <w:tcPr>
+            <w:tcW w:type="dxa" w:w="1757"/>
+          </w:tcPr>
+          <w:p>
+            <w:pPr>
+              <w:bidi/>
+              <w:jc w:val="right"/>
+            </w:pPr>
+            <w:r/>
+            <w:r>
+              <w:rPr>
+                <w:rFonts w:ascii="David" w:hAnsi="David" w:cs="David"/>
+                <w:b w:val="0"/>
+                <w:sz w:val="19"/>
+                <w:rtl/>
+              </w:rPr>
+              <w:t>הרב עזרא בטאט שליט״א</w:t>
+            </w:r>
+          </w:p>
+        </w:tc>
+        <w:tc>
+          <w:tcPr>
+            <w:tcW w:type="dxa" w:w="1757"/>
+          </w:tcPr>
+          <w:p>
+            <w:pPr>
+              <w:bidi/>
+              <w:jc w:val="right"/>
+            </w:pPr>
+            <w:r/>
+            <w:r>
+              <w:rPr>
+                <w:rFonts w:ascii="David" w:hAnsi="David" w:cs="David"/>
+                <w:b w:val="0"/>
+                <w:sz w:val="19"/>
+                <w:rtl/>
+              </w:rPr>
+              <w:t>עזרא בטאט סימן ס סעיף ד.docx</w:t>
+            </w:r>
+          </w:p>
+        </w:tc>
+        <w:tc>
+          <w:tcPr>
+            <w:tcW w:type="dxa" w:w="1757"/>
+          </w:tcPr>
+          <w:p>
+            <w:pPr>
+              <w:bidi/>
+              <w:jc w:val="right"/>
+            </w:pPr>
+            <w:r/>
+            <w:r>
+              <w:rPr>
+                <w:rFonts w:ascii="David" w:hAnsi="David" w:cs="David"/>
+                <w:b w:val="0"/>
+                <w:sz w:val="19"/>
+                <w:rtl/>
+              </w:rPr>
             </w:r>
           </w:p>
         </w:tc>
@@ -5937,7 +5937,7 @@
                 <w:sz w:val="19"/>
                 <w:rtl/>
               </w:rPr>
-              <w:t>492</w:t>
+              <w:t>495</w:t>
             </w:r>
           </w:p>
         </w:tc>
@@ -6064,7 +6064,7 @@
                 <w:sz w:val="19"/>
                 <w:rtl/>
               </w:rPr>
-              <w:t>500</w:t>
+              <w:t>503</w:t>
             </w:r>
           </w:p>
         </w:tc>
@@ -6191,7 +6191,7 @@
                 <w:sz w:val="19"/>
                 <w:rtl/>
               </w:rPr>
-              <w:t>510</w:t>
+              <w:t>513</w:t>
             </w:r>
           </w:p>
         </w:tc>
@@ -6319,7 +6319,7 @@
                 <w:sz w:val="19"/>
                 <w:rtl/>
               </w:rPr>
-              <w:t>517</w:t>
+              <w:t>520</w:t>
             </w:r>
           </w:p>
         </w:tc>
@@ -6446,7 +6446,7 @@
                 <w:sz w:val="19"/>
                 <w:rtl/>
               </w:rPr>
-              <w:t>522</w:t>
+              <w:t>525</w:t>
             </w:r>
           </w:p>
         </w:tc>
@@ -6573,7 +6573,7 @@
                 <w:sz w:val="19"/>
                 <w:rtl/>
               </w:rPr>
-              <w:t>537</w:t>
+              <w:t>540</w:t>
             </w:r>
           </w:p>
         </w:tc>
@@ -6636,7 +6636,7 @@
                 <w:sz w:val="19"/>
                 <w:rtl/>
               </w:rPr>
-              <w:t>הרב משה זאדה שליט״א</w:t>
+              <w:t>ראש הכולל הרב ר׳ משה זאדה שליט״א</w:t>
             </w:r>
           </w:p>
         </w:tc>
@@ -6700,7 +6700,7 @@
                 <w:sz w:val="19"/>
                 <w:rtl/>
               </w:rPr>
-              <w:t>540</w:t>
+              <w:t>543</w:t>
             </w:r>
           </w:p>
         </w:tc>
@@ -6827,7 +6827,7 @@
                 <w:sz w:val="19"/>
                 <w:rtl/>
               </w:rPr>
-              <w:t>544</w:t>
+              <w:t>547</w:t>
             </w:r>
           </w:p>
         </w:tc>
@@ -6954,7 +6954,7 @@
                 <w:sz w:val="19"/>
                 <w:rtl/>
               </w:rPr>
-              <w:t>548</w:t>
+              <w:t>551</w:t>
             </w:r>
           </w:p>
         </w:tc>
@@ -7081,7 +7081,7 @@
                 <w:sz w:val="19"/>
                 <w:rtl/>
               </w:rPr>
-              <w:t>551</w:t>
+              <w:t>554</w:t>
             </w:r>
           </w:p>
         </w:tc>
@@ -7208,7 +7208,7 @@
                 <w:sz w:val="19"/>
                 <w:rtl/>
               </w:rPr>
-              <w:t>555</w:t>
+              <w:t>558</w:t>
             </w:r>
           </w:p>
         </w:tc>
@@ -7336,7 +7336,7 @@
                 <w:sz w:val="19"/>
                 <w:rtl/>
               </w:rPr>
-              <w:t>559</w:t>
+              <w:t>562</w:t>
             </w:r>
           </w:p>
         </w:tc>
@@ -7463,7 +7463,7 @@
                 <w:sz w:val="19"/>
                 <w:rtl/>
               </w:rPr>
-              <w:t>563</w:t>
+              <w:t>566</w:t>
             </w:r>
           </w:p>
         </w:tc>
@@ -7526,7 +7526,7 @@
                 <w:sz w:val="19"/>
                 <w:rtl/>
               </w:rPr>
-              <w:t>הרב משה זאדה שליט״א</w:t>
+              <w:t>ראש הכולל הרב ר׳ משה זאדה שליט״א</w:t>
             </w:r>
           </w:p>
         </w:tc>
@@ -7590,7 +7590,7 @@
                 <w:sz w:val="19"/>
                 <w:rtl/>
               </w:rPr>
-              <w:t>568</w:t>
+              <w:t>571</w:t>
             </w:r>
           </w:p>
         </w:tc>
@@ -7717,7 +7717,7 @@
                 <w:sz w:val="19"/>
                 <w:rtl/>
               </w:rPr>
-              <w:t>576</w:t>
+              <w:t>579</w:t>
             </w:r>
           </w:p>
         </w:tc>

</xml_diff>

<commit_message>
Add 5 new חבורות, newer book draft, ToC siman bands without ornament and page number
- new files: ביאור הסוגיה / כוונת טעם המצוה (סימן ס סעיף ד), משקרא ק״ש (סימן ס),
  סיכום השיטות בענין השלמת רמ״ח תיבות (סימן סא), בדין שהה לגמור את כולה (סימן סה)
- 6 files of the zip were already in the booklet in the same version (not added again)
- עיקרי הדברים לספר: newer version replaces the old one; author נאור רוזין (named in the file)
- ToC: siman bands are the plain grey band only; no ornament, no page number (Word: TOC \n 1-1)

Co-Authored-By: Claude Sonnet 5.5 <noreply@anthropic.com>
Claude-Session: https://claude.ai/code/session_0161ijXJJcwCxR7y44e5HXLU
</commit_message>
<xml_diff>
--- a/output/doch-shiluv-chavurot.docx
+++ b/output/doch-shiluv-chavurot.docx
@@ -29,7 +29,7 @@
           <w:sz w:val="22"/>
           <w:rtl/>
         </w:rPr>
-        <w:t>נסרקו כל קבצי התיקייה (69 קבצי Word, 4 קבצי PDF ו-3 קבצי zip; כל קובץ Word נכלל או סווג ככפילות). הכפילויות נבדקו לפי הטקסט עצמו (השוואת רצפים של 6 מילים), לא לפי שם הקובץ. בחוברת עכשיו 113 מאמרים, מהם 60 נוספו בסבב הזה.</w:t>
+        <w:t>נסרקו כל קבצי התיקייה (69 קבצי Word, 4 קבצי PDF ו-3 קבצי zip; כל קובץ Word נכלל או סווג ככפילות). הכפילויות נבדקו לפי הטקסט עצמו (השוואת רצפים של 6 מילים), לא לפי שם הקובץ. בחוברת עכשיו 118 מאמרים, מהם 65 נוספו בסבב הזה.</w:t>
       </w:r>
     </w:p>
     <w:p>
@@ -44,7 +44,7 @@
           <w:sz w:val="26"/>
           <w:rtl/>
         </w:rPr>
-        <w:t>מאמרים שנוספו (60)</w:t>
+        <w:t>מאמרים שנוספו (65)</w:t>
       </w:r>
     </w:p>
     <w:tbl>
@@ -5089,70 +5089,70 @@
                 <w:sz w:val="19"/>
                 <w:rtl/>
               </w:rPr>
-              <w:t>עיקרי הדברים לספר בענין מצוות צריכות כוונה</w:t>
-            </w:r>
-          </w:p>
-        </w:tc>
-        <w:tc>
-          <w:tcPr>
-            <w:tcW w:type="dxa" w:w="1757"/>
-          </w:tcPr>
-          <w:p>
-            <w:pPr>
-              <w:bidi/>
-              <w:jc w:val="right"/>
-            </w:pPr>
-            <w:r/>
-            <w:r>
-              <w:rPr>
-                <w:rFonts w:ascii="David" w:hAnsi="David" w:cs="David"/>
-                <w:b w:val="0"/>
-                <w:sz w:val="19"/>
-                <w:rtl/>
-              </w:rPr>
-              <w:t>ראש הכולל הרב ר׳ משה זאדה שליט״א</w:t>
-            </w:r>
-          </w:p>
-        </w:tc>
-        <w:tc>
-          <w:tcPr>
-            <w:tcW w:type="dxa" w:w="1757"/>
-          </w:tcPr>
-          <w:p>
-            <w:pPr>
-              <w:bidi/>
-              <w:jc w:val="right"/>
-            </w:pPr>
-            <w:r/>
-            <w:r>
-              <w:rPr>
-                <w:rFonts w:ascii="David" w:hAnsi="David" w:cs="David"/>
-                <w:b w:val="0"/>
-                <w:sz w:val="19"/>
-                <w:rtl/>
-              </w:rPr>
-              <w:t>עיקרי הדברים לספר בענין מצות צריכות כוונה.docx</w:t>
-            </w:r>
-          </w:p>
-        </w:tc>
-        <w:tc>
-          <w:tcPr>
-            <w:tcW w:type="dxa" w:w="1757"/>
-          </w:tcPr>
-          <w:p>
-            <w:pPr>
-              <w:bidi/>
-              <w:jc w:val="right"/>
-            </w:pPr>
-            <w:r/>
-            <w:r>
-              <w:rPr>
-                <w:rFonts w:ascii="David" w:hAnsi="David" w:cs="David"/>
-                <w:b w:val="0"/>
-                <w:sz w:val="19"/>
-                <w:rtl/>
-              </w:rPr>
-              <w:t>טיוטת ספר (כ-21,000 מילים) – נכלל כי נמצא בתיקיית החבורות; קל להוציאו</w:t>
+              <w:t>משקרא ק״ש אין צריך לברך שכבר נפטר באהבה רבה</w:t>
+            </w:r>
+          </w:p>
+        </w:tc>
+        <w:tc>
+          <w:tcPr>
+            <w:tcW w:type="dxa" w:w="1757"/>
+          </w:tcPr>
+          <w:p>
+            <w:pPr>
+              <w:bidi/>
+              <w:jc w:val="right"/>
+            </w:pPr>
+            <w:r/>
+            <w:r>
+              <w:rPr>
+                <w:rFonts w:ascii="David" w:hAnsi="David" w:cs="David"/>
+                <w:b w:val="0"/>
+                <w:sz w:val="19"/>
+                <w:rtl/>
+              </w:rPr>
+              <w:t>—</w:t>
+            </w:r>
+          </w:p>
+        </w:tc>
+        <w:tc>
+          <w:tcPr>
+            <w:tcW w:type="dxa" w:w="1757"/>
+          </w:tcPr>
+          <w:p>
+            <w:pPr>
+              <w:bidi/>
+              <w:jc w:val="right"/>
+            </w:pPr>
+            <w:r/>
+            <w:r>
+              <w:rPr>
+                <w:rFonts w:ascii="David" w:hAnsi="David" w:cs="David"/>
+                <w:b w:val="0"/>
+                <w:sz w:val="19"/>
+                <w:rtl/>
+              </w:rPr>
+              <w:t>סימן ס משקרא קש אין צריך לברך שכבר נפטר באהבה רבה.docx</w:t>
+            </w:r>
+          </w:p>
+        </w:tc>
+        <w:tc>
+          <w:tcPr>
+            <w:tcW w:type="dxa" w:w="1757"/>
+          </w:tcPr>
+          <w:p>
+            <w:pPr>
+              <w:bidi/>
+              <w:jc w:val="right"/>
+            </w:pPr>
+            <w:r/>
+            <w:r>
+              <w:rPr>
+                <w:rFonts w:ascii="David" w:hAnsi="David" w:cs="David"/>
+                <w:b w:val="0"/>
+                <w:sz w:val="19"/>
+                <w:rtl/>
+              </w:rPr>
+              <w:t>ללא מחבר בקובץ ובשמו; בראש הקובץ מופיעה הכותרת ״ברכת אברהם״ והיא הובאה כתת-כותרת; הכותרת נלקחה משם הקובץ; ללא סעיף בשם הקובץ – הוצב בתחילת הסימן</w:t>
             </w:r>
           </w:p>
         </w:tc>
@@ -5175,7 +5175,7 @@
                 <w:sz w:val="19"/>
                 <w:rtl/>
               </w:rPr>
-              <w:t>454</w:t>
+              <w:t>405</w:t>
             </w:r>
           </w:p>
         </w:tc>
@@ -5302,7 +5302,7 @@
                 <w:sz w:val="19"/>
                 <w:rtl/>
               </w:rPr>
-              <w:t>457</w:t>
+              <w:t>408</w:t>
             </w:r>
           </w:p>
         </w:tc>
@@ -5429,7 +5429,7 @@
                 <w:sz w:val="19"/>
                 <w:rtl/>
               </w:rPr>
-              <w:t>460</w:t>
+              <w:t>411</w:t>
             </w:r>
           </w:p>
         </w:tc>
@@ -5556,7 +5556,7 @@
                 <w:sz w:val="19"/>
                 <w:rtl/>
               </w:rPr>
-              <w:t>463</w:t>
+              <w:t>414</w:t>
             </w:r>
           </w:p>
         </w:tc>
@@ -5683,7 +5683,7 @@
                 <w:sz w:val="19"/>
                 <w:rtl/>
               </w:rPr>
-              <w:t>467</w:t>
+              <w:t>418</w:t>
             </w:r>
           </w:p>
         </w:tc>
@@ -5810,7 +5810,7 @@
                 <w:sz w:val="19"/>
                 <w:rtl/>
               </w:rPr>
-              <w:t>480</w:t>
+              <w:t>431</w:t>
             </w:r>
           </w:p>
         </w:tc>
@@ -5937,111 +5937,112 @@
                 <w:sz w:val="19"/>
                 <w:rtl/>
               </w:rPr>
-              <w:t>495</w:t>
-            </w:r>
-          </w:p>
-        </w:tc>
-        <w:tc>
-          <w:tcPr>
-            <w:tcW w:type="dxa" w:w="1757"/>
-          </w:tcPr>
-          <w:p>
-            <w:pPr>
-              <w:bidi/>
-              <w:jc w:val="right"/>
-            </w:pPr>
-            <w:r/>
-            <w:r>
-              <w:rPr>
-                <w:rFonts w:ascii="David" w:hAnsi="David" w:cs="David"/>
-                <w:b w:val="0"/>
-                <w:sz w:val="19"/>
-                <w:rtl/>
-              </w:rPr>
-              <w:t>סימן ס״א</w:t>
-            </w:r>
-          </w:p>
-        </w:tc>
-        <w:tc>
-          <w:tcPr>
-            <w:tcW w:type="dxa" w:w="1757"/>
-          </w:tcPr>
-          <w:p>
-            <w:pPr>
-              <w:bidi/>
-              <w:jc w:val="right"/>
-            </w:pPr>
-            <w:r/>
-            <w:r>
-              <w:rPr>
-                <w:rFonts w:ascii="David" w:hAnsi="David" w:cs="David"/>
-                <w:b w:val="0"/>
-                <w:sz w:val="19"/>
-                <w:rtl/>
-              </w:rPr>
-              <w:t>בענין קבלת עול מלכות שמים</w:t>
-            </w:r>
-          </w:p>
-        </w:tc>
-        <w:tc>
-          <w:tcPr>
-            <w:tcW w:type="dxa" w:w="1757"/>
-          </w:tcPr>
-          <w:p>
-            <w:pPr>
-              <w:bidi/>
-              <w:jc w:val="right"/>
-            </w:pPr>
-            <w:r/>
-            <w:r>
-              <w:rPr>
-                <w:rFonts w:ascii="David" w:hAnsi="David" w:cs="David"/>
-                <w:b w:val="0"/>
-                <w:sz w:val="19"/>
-                <w:rtl/>
-              </w:rPr>
-              <w:t>הרב יעקב ישראל שטרן שליט״א</w:t>
-            </w:r>
-          </w:p>
-        </w:tc>
-        <w:tc>
-          <w:tcPr>
-            <w:tcW w:type="dxa" w:w="1757"/>
-          </w:tcPr>
-          <w:p>
-            <w:pPr>
-              <w:bidi/>
-              <w:jc w:val="right"/>
-            </w:pPr>
-            <w:r/>
-            <w:r>
-              <w:rPr>
-                <w:rFonts w:ascii="David" w:hAnsi="David" w:cs="David"/>
-                <w:b w:val="0"/>
-                <w:sz w:val="19"/>
-                <w:rtl/>
-              </w:rPr>
-              <w:t>סימן סא (2).docx</w:t>
-            </w:r>
-          </w:p>
-        </w:tc>
-        <w:tc>
-          <w:tcPr>
-            <w:tcW w:type="dxa" w:w="1757"/>
-          </w:tcPr>
-          <w:p>
-            <w:pPr>
-              <w:bidi/>
-              <w:jc w:val="right"/>
-            </w:pPr>
-            <w:r/>
-            <w:r>
-              <w:rPr>
-                <w:rFonts w:ascii="David" w:hAnsi="David" w:cs="David"/>
-                <w:b w:val="0"/>
-                <w:sz w:val="19"/>
-                <w:rtl/>
-              </w:rPr>
+              <w:t>435</w:t>
+            </w:r>
+          </w:p>
+        </w:tc>
+        <w:tc>
+          <w:tcPr>
+            <w:tcW w:type="dxa" w:w="1757"/>
+          </w:tcPr>
+          <w:p>
+            <w:pPr>
+              <w:bidi/>
+              <w:jc w:val="right"/>
+            </w:pPr>
+            <w:r/>
+            <w:r>
+              <w:rPr>
+                <w:rFonts w:ascii="David" w:hAnsi="David" w:cs="David"/>
+                <w:b w:val="0"/>
+                <w:sz w:val="19"/>
+                <w:rtl/>
+              </w:rPr>
+              <w:t>סימן ס׳</w:t>
+            </w:r>
+          </w:p>
+        </w:tc>
+        <w:tc>
+          <w:tcPr>
+            <w:tcW w:type="dxa" w:w="1757"/>
+          </w:tcPr>
+          <w:p>
+            <w:pPr>
+              <w:bidi/>
+              <w:jc w:val="right"/>
+            </w:pPr>
+            <w:r/>
+            <w:r>
+              <w:rPr>
+                <w:rFonts w:ascii="David" w:hAnsi="David" w:cs="David"/>
+                <w:b w:val="0"/>
+                <w:sz w:val="19"/>
+                <w:rtl/>
+              </w:rPr>
+              <w:t>ביאור הסוגיה בענין מצוות צריכות כוונה</w:t>
+            </w:r>
+          </w:p>
+        </w:tc>
+        <w:tc>
+          <w:tcPr>
+            <w:tcW w:type="dxa" w:w="1757"/>
+          </w:tcPr>
+          <w:p>
+            <w:pPr>
+              <w:bidi/>
+              <w:jc w:val="right"/>
+            </w:pPr>
+            <w:r/>
+            <w:r>
+              <w:rPr>
+                <w:rFonts w:ascii="David" w:hAnsi="David" w:cs="David"/>
+                <w:b w:val="0"/>
+                <w:sz w:val="19"/>
+                <w:rtl/>
+              </w:rPr>
+              <w:t>הרב נאור רוזין שליט״א</w:t>
+            </w:r>
+          </w:p>
+        </w:tc>
+        <w:tc>
+          <w:tcPr>
+            <w:tcW w:type="dxa" w:w="1757"/>
+          </w:tcPr>
+          <w:p>
+            <w:pPr>
+              <w:bidi/>
+              <w:jc w:val="right"/>
+            </w:pPr>
+            <w:r/>
+            <w:r>
+              <w:rPr>
+                <w:rFonts w:ascii="David" w:hAnsi="David" w:cs="David"/>
+                <w:b w:val="0"/>
+                <w:sz w:val="19"/>
+                <w:rtl/>
+              </w:rPr>
+              <w:t>סימן ס סעיף ד ביאור הסוגיה בענין מצות צריכות כוונה.docx</w:t>
+            </w:r>
+          </w:p>
+        </w:tc>
+        <w:tc>
+          <w:tcPr>
+            <w:tcW w:type="dxa" w:w="1757"/>
+          </w:tcPr>
+          <w:p>
+            <w:pPr>
+              <w:bidi/>
+              <w:jc w:val="right"/>
+            </w:pPr>
+            <w:r/>
+            <w:r>
+              <w:rPr>
+                <w:rFonts w:ascii="David" w:hAnsi="David" w:cs="David"/>
+                <w:b w:val="0"/>
+                <w:sz w:val="19"/>
+                <w:rtl/>
+              </w:rPr>
+              <w:t>המחבר אינו מופיע בשם הקובץ או בגוף הטקסט – נקבע לפי מאפייני הקובץ (נאור רוזין) והמשכיות הסדרה בסימן ס׳ סעיף ד׳</w:t>
             </w:r>
           </w:p>
         </w:tc>
@@ -6064,49 +6065,49 @@
                 <w:sz w:val="19"/>
                 <w:rtl/>
               </w:rPr>
-              <w:t>503</w:t>
-            </w:r>
-          </w:p>
-        </w:tc>
-        <w:tc>
-          <w:tcPr>
-            <w:tcW w:type="dxa" w:w="1757"/>
-          </w:tcPr>
-          <w:p>
-            <w:pPr>
-              <w:bidi/>
-              <w:jc w:val="right"/>
-            </w:pPr>
-            <w:r/>
-            <w:r>
-              <w:rPr>
-                <w:rFonts w:ascii="David" w:hAnsi="David" w:cs="David"/>
-                <w:b w:val="0"/>
-                <w:sz w:val="19"/>
-                <w:rtl/>
-              </w:rPr>
-              <w:t>סימן ס״א</w:t>
-            </w:r>
-          </w:p>
-        </w:tc>
-        <w:tc>
-          <w:tcPr>
-            <w:tcW w:type="dxa" w:w="1757"/>
-          </w:tcPr>
-          <w:p>
-            <w:pPr>
-              <w:bidi/>
-              <w:jc w:val="right"/>
-            </w:pPr>
-            <w:r/>
-            <w:r>
-              <w:rPr>
-                <w:rFonts w:ascii="David" w:hAnsi="David" w:cs="David"/>
-                <w:b w:val="0"/>
-                <w:sz w:val="19"/>
-                <w:rtl/>
-              </w:rPr>
-              <w:t>בענין השלמת רמ״ח תיבות בקר״ש</w:t>
+              <w:t>448</w:t>
+            </w:r>
+          </w:p>
+        </w:tc>
+        <w:tc>
+          <w:tcPr>
+            <w:tcW w:type="dxa" w:w="1757"/>
+          </w:tcPr>
+          <w:p>
+            <w:pPr>
+              <w:bidi/>
+              <w:jc w:val="right"/>
+            </w:pPr>
+            <w:r/>
+            <w:r>
+              <w:rPr>
+                <w:rFonts w:ascii="David" w:hAnsi="David" w:cs="David"/>
+                <w:b w:val="0"/>
+                <w:sz w:val="19"/>
+                <w:rtl/>
+              </w:rPr>
+              <w:t>סימן ס׳</w:t>
+            </w:r>
+          </w:p>
+        </w:tc>
+        <w:tc>
+          <w:tcPr>
+            <w:tcW w:type="dxa" w:w="1757"/>
+          </w:tcPr>
+          <w:p>
+            <w:pPr>
+              <w:bidi/>
+              <w:jc w:val="right"/>
+            </w:pPr>
+            <w:r/>
+            <w:r>
+              <w:rPr>
+                <w:rFonts w:ascii="David" w:hAnsi="David" w:cs="David"/>
+                <w:b w:val="0"/>
+                <w:sz w:val="19"/>
+                <w:rtl/>
+              </w:rPr>
+              <w:t>בענין הכוונה של הטעם של המצוה</w:t>
             </w:r>
           </w:p>
         </w:tc>
@@ -6148,27 +6149,28 @@
                 <w:sz w:val="19"/>
                 <w:rtl/>
               </w:rPr>
-              <w:t>בענין השלמת רמח תיבות בקריאת שמע.docx</w:t>
-            </w:r>
-          </w:p>
-        </w:tc>
-        <w:tc>
-          <w:tcPr>
-            <w:tcW w:type="dxa" w:w="1757"/>
-          </w:tcPr>
-          <w:p>
-            <w:pPr>
-              <w:bidi/>
-              <w:jc w:val="right"/>
-            </w:pPr>
-            <w:r/>
-            <w:r>
-              <w:rPr>
-                <w:rFonts w:ascii="David" w:hAnsi="David" w:cs="David"/>
-                <w:b w:val="0"/>
-                <w:sz w:val="19"/>
-                <w:rtl/>
-              </w:rPr>
+              <w:t>סימן ס סעיף ד כוונת טעם המצוה.docx</w:t>
+            </w:r>
+          </w:p>
+        </w:tc>
+        <w:tc>
+          <w:tcPr>
+            <w:tcW w:type="dxa" w:w="1757"/>
+          </w:tcPr>
+          <w:p>
+            <w:pPr>
+              <w:bidi/>
+              <w:jc w:val="right"/>
+            </w:pPr>
+            <w:r/>
+            <w:r>
+              <w:rPr>
+                <w:rFonts w:ascii="David" w:hAnsi="David" w:cs="David"/>
+                <w:b w:val="0"/>
+                <w:sz w:val="19"/>
+                <w:rtl/>
+              </w:rPr>
+              <w:t>המחבר אינו מופיע בשם הקובץ או בגוף הטקסט – נקבע לפי מאפייני הקובץ (נאור רוזין); ממשיך את ״עיקרי הדברים״ (״התבאר עד כה בהרחבה״)</w:t>
             </w:r>
           </w:p>
         </w:tc>
@@ -6191,112 +6193,112 @@
                 <w:sz w:val="19"/>
                 <w:rtl/>
               </w:rPr>
-              <w:t>513</w:t>
-            </w:r>
-          </w:p>
-        </w:tc>
-        <w:tc>
-          <w:tcPr>
-            <w:tcW w:type="dxa" w:w="1757"/>
-          </w:tcPr>
-          <w:p>
-            <w:pPr>
-              <w:bidi/>
-              <w:jc w:val="right"/>
-            </w:pPr>
-            <w:r/>
-            <w:r>
-              <w:rPr>
-                <w:rFonts w:ascii="David" w:hAnsi="David" w:cs="David"/>
-                <w:b w:val="0"/>
-                <w:sz w:val="19"/>
-                <w:rtl/>
-              </w:rPr>
-              <w:t>סימן ס״א</w:t>
-            </w:r>
-          </w:p>
-        </w:tc>
-        <w:tc>
-          <w:tcPr>
-            <w:tcW w:type="dxa" w:w="1757"/>
-          </w:tcPr>
-          <w:p>
-            <w:pPr>
-              <w:bidi/>
-              <w:jc w:val="right"/>
-            </w:pPr>
-            <w:r/>
-            <w:r>
-              <w:rPr>
-                <w:rFonts w:ascii="David" w:hAnsi="David" w:cs="David"/>
-                <w:b w:val="0"/>
-                <w:sz w:val="19"/>
-                <w:rtl/>
-              </w:rPr>
-              <w:t>בענין השלמת רמ״ח תיבות בק״ש (סיכום)</w:t>
-            </w:r>
-          </w:p>
-        </w:tc>
-        <w:tc>
-          <w:tcPr>
-            <w:tcW w:type="dxa" w:w="1757"/>
-          </w:tcPr>
-          <w:p>
-            <w:pPr>
-              <w:bidi/>
-              <w:jc w:val="right"/>
-            </w:pPr>
-            <w:r/>
-            <w:r>
-              <w:rPr>
-                <w:rFonts w:ascii="David" w:hAnsi="David" w:cs="David"/>
-                <w:b w:val="0"/>
-                <w:sz w:val="19"/>
-                <w:rtl/>
-              </w:rPr>
-              <w:t>—</w:t>
-            </w:r>
-          </w:p>
-        </w:tc>
-        <w:tc>
-          <w:tcPr>
-            <w:tcW w:type="dxa" w:w="1757"/>
-          </w:tcPr>
-          <w:p>
-            <w:pPr>
-              <w:bidi/>
-              <w:jc w:val="right"/>
-            </w:pPr>
-            <w:r/>
-            <w:r>
-              <w:rPr>
-                <w:rFonts w:ascii="David" w:hAnsi="David" w:cs="David"/>
-                <w:b w:val="0"/>
-                <w:sz w:val="19"/>
-                <w:rtl/>
-              </w:rPr>
-              <w:t>סימן סא.docx</w:t>
-            </w:r>
-          </w:p>
-        </w:tc>
-        <w:tc>
-          <w:tcPr>
-            <w:tcW w:type="dxa" w:w="1757"/>
-          </w:tcPr>
-          <w:p>
-            <w:pPr>
-              <w:bidi/>
-              <w:jc w:val="right"/>
-            </w:pPr>
-            <w:r/>
-            <w:r>
-              <w:rPr>
-                <w:rFonts w:ascii="David" w:hAnsi="David" w:cs="David"/>
-                <w:b w:val="0"/>
-                <w:sz w:val="19"/>
-                <w:rtl/>
-              </w:rPr>
-              <w:t>סיכום קצר; נוסף ״(סיכום)״ לכותרת כדי להבדילו מהמאמר הארוך באותו נושא</w:t>
+              <w:t>456</w:t>
+            </w:r>
+          </w:p>
+        </w:tc>
+        <w:tc>
+          <w:tcPr>
+            <w:tcW w:type="dxa" w:w="1757"/>
+          </w:tcPr>
+          <w:p>
+            <w:pPr>
+              <w:bidi/>
+              <w:jc w:val="right"/>
+            </w:pPr>
+            <w:r/>
+            <w:r>
+              <w:rPr>
+                <w:rFonts w:ascii="David" w:hAnsi="David" w:cs="David"/>
+                <w:b w:val="0"/>
+                <w:sz w:val="19"/>
+                <w:rtl/>
+              </w:rPr>
+              <w:t>סימן ס׳</w:t>
+            </w:r>
+          </w:p>
+        </w:tc>
+        <w:tc>
+          <w:tcPr>
+            <w:tcW w:type="dxa" w:w="1757"/>
+          </w:tcPr>
+          <w:p>
+            <w:pPr>
+              <w:bidi/>
+              <w:jc w:val="right"/>
+            </w:pPr>
+            <w:r/>
+            <w:r>
+              <w:rPr>
+                <w:rFonts w:ascii="David" w:hAnsi="David" w:cs="David"/>
+                <w:b w:val="0"/>
+                <w:sz w:val="19"/>
+                <w:rtl/>
+              </w:rPr>
+              <w:t>עיקרי הדברים לספר בענין מצוות צריכות כוונה</w:t>
+            </w:r>
+          </w:p>
+        </w:tc>
+        <w:tc>
+          <w:tcPr>
+            <w:tcW w:type="dxa" w:w="1757"/>
+          </w:tcPr>
+          <w:p>
+            <w:pPr>
+              <w:bidi/>
+              <w:jc w:val="right"/>
+            </w:pPr>
+            <w:r/>
+            <w:r>
+              <w:rPr>
+                <w:rFonts w:ascii="David" w:hAnsi="David" w:cs="David"/>
+                <w:b w:val="0"/>
+                <w:sz w:val="19"/>
+                <w:rtl/>
+              </w:rPr>
+              <w:t>הרב נאור רוזין שליט״א</w:t>
+            </w:r>
+          </w:p>
+        </w:tc>
+        <w:tc>
+          <w:tcPr>
+            <w:tcW w:type="dxa" w:w="1757"/>
+          </w:tcPr>
+          <w:p>
+            <w:pPr>
+              <w:bidi/>
+              <w:jc w:val="right"/>
+            </w:pPr>
+            <w:r/>
+            <w:r>
+              <w:rPr>
+                <w:rFonts w:ascii="David" w:hAnsi="David" w:cs="David"/>
+                <w:b w:val="0"/>
+                <w:sz w:val="19"/>
+                <w:rtl/>
+              </w:rPr>
+              <w:t>סימן ס סעיף ד עיקרי הדברים לספר בענין מצות צריכות כוונה נהור רוזין.docx</w:t>
+            </w:r>
+          </w:p>
+        </w:tc>
+        <w:tc>
+          <w:tcPr>
+            <w:tcW w:type="dxa" w:w="1757"/>
+          </w:tcPr>
+          <w:p>
+            <w:pPr>
+              <w:bidi/>
+              <w:jc w:val="right"/>
+            </w:pPr>
+            <w:r/>
+            <w:r>
+              <w:rPr>
+                <w:rFonts w:ascii="David" w:hAnsi="David" w:cs="David"/>
+                <w:b w:val="0"/>
+                <w:sz w:val="19"/>
+                <w:rtl/>
+              </w:rPr>
+              <w:t>טיוטת ספר (כ-21,000 מילים); גרסה מעודכנת (אוקטובר 2026) במקום הגרסה הקודמת; המחבר לפי שם הקובץ (קודם יוחס בטעות לרב זאדה)</w:t>
             </w:r>
           </w:p>
         </w:tc>
@@ -6361,49 +6363,49 @@
                 <w:sz w:val="19"/>
                 <w:rtl/>
               </w:rPr>
-              <w:t>ש״ץ שלא כיון בפסוק ראשון דקריאת שמע, האם יחזור לאומרו</w:t>
-            </w:r>
-          </w:p>
-        </w:tc>
-        <w:tc>
-          <w:tcPr>
-            <w:tcW w:type="dxa" w:w="1757"/>
-          </w:tcPr>
-          <w:p>
-            <w:pPr>
-              <w:bidi/>
-              <w:jc w:val="right"/>
-            </w:pPr>
-            <w:r/>
-            <w:r>
-              <w:rPr>
-                <w:rFonts w:ascii="David" w:hAnsi="David" w:cs="David"/>
-                <w:b w:val="0"/>
-                <w:sz w:val="19"/>
-                <w:rtl/>
-              </w:rPr>
-              <w:t>הרב עזרא בטאט שליט״א</w:t>
-            </w:r>
-          </w:p>
-        </w:tc>
-        <w:tc>
-          <w:tcPr>
-            <w:tcW w:type="dxa" w:w="1757"/>
-          </w:tcPr>
-          <w:p>
-            <w:pPr>
-              <w:bidi/>
-              <w:jc w:val="right"/>
-            </w:pPr>
-            <w:r/>
-            <w:r>
-              <w:rPr>
-                <w:rFonts w:ascii="David" w:hAnsi="David" w:cs="David"/>
-                <w:b w:val="0"/>
-                <w:sz w:val="19"/>
-                <w:rtl/>
-              </w:rPr>
-              <w:t>עזרא בטאט סימן סא סעיף ט_2.docx</w:t>
+              <w:t>בענין קבלת עול מלכות שמים</w:t>
+            </w:r>
+          </w:p>
+        </w:tc>
+        <w:tc>
+          <w:tcPr>
+            <w:tcW w:type="dxa" w:w="1757"/>
+          </w:tcPr>
+          <w:p>
+            <w:pPr>
+              <w:bidi/>
+              <w:jc w:val="right"/>
+            </w:pPr>
+            <w:r/>
+            <w:r>
+              <w:rPr>
+                <w:rFonts w:ascii="David" w:hAnsi="David" w:cs="David"/>
+                <w:b w:val="0"/>
+                <w:sz w:val="19"/>
+                <w:rtl/>
+              </w:rPr>
+              <w:t>הרב יעקב ישראל שטרן שליט״א</w:t>
+            </w:r>
+          </w:p>
+        </w:tc>
+        <w:tc>
+          <w:tcPr>
+            <w:tcW w:type="dxa" w:w="1757"/>
+          </w:tcPr>
+          <w:p>
+            <w:pPr>
+              <w:bidi/>
+              <w:jc w:val="right"/>
+            </w:pPr>
+            <w:r/>
+            <w:r>
+              <w:rPr>
+                <w:rFonts w:ascii="David" w:hAnsi="David" w:cs="David"/>
+                <w:b w:val="0"/>
+                <w:sz w:val="19"/>
+                <w:rtl/>
+              </w:rPr>
+              <w:t>סימן סא (2).docx</w:t>
             </w:r>
           </w:p>
         </w:tc>
@@ -6446,91 +6448,91 @@
                 <w:sz w:val="19"/>
                 <w:rtl/>
               </w:rPr>
-              <w:t>525</w:t>
-            </w:r>
-          </w:p>
-        </w:tc>
-        <w:tc>
-          <w:tcPr>
-            <w:tcW w:type="dxa" w:w="1757"/>
-          </w:tcPr>
-          <w:p>
-            <w:pPr>
-              <w:bidi/>
-              <w:jc w:val="right"/>
-            </w:pPr>
-            <w:r/>
-            <w:r>
-              <w:rPr>
-                <w:rFonts w:ascii="David" w:hAnsi="David" w:cs="David"/>
-                <w:b w:val="0"/>
-                <w:sz w:val="19"/>
-                <w:rtl/>
-              </w:rPr>
-              <w:t>סימן ס״ב</w:t>
-            </w:r>
-          </w:p>
-        </w:tc>
-        <w:tc>
-          <w:tcPr>
-            <w:tcW w:type="dxa" w:w="1757"/>
-          </w:tcPr>
-          <w:p>
-            <w:pPr>
-              <w:bidi/>
-              <w:jc w:val="right"/>
-            </w:pPr>
-            <w:r/>
-            <w:r>
-              <w:rPr>
-                <w:rFonts w:ascii="David" w:hAnsi="David" w:cs="David"/>
-                <w:b w:val="0"/>
-                <w:sz w:val="19"/>
-                <w:rtl/>
-              </w:rPr>
-              <w:t>דקדוק באותיותיה מהו</w:t>
-            </w:r>
-          </w:p>
-        </w:tc>
-        <w:tc>
-          <w:tcPr>
-            <w:tcW w:type="dxa" w:w="1757"/>
-          </w:tcPr>
-          <w:p>
-            <w:pPr>
-              <w:bidi/>
-              <w:jc w:val="right"/>
-            </w:pPr>
-            <w:r/>
-            <w:r>
-              <w:rPr>
-                <w:rFonts w:ascii="David" w:hAnsi="David" w:cs="David"/>
-                <w:b w:val="0"/>
-                <w:sz w:val="19"/>
-                <w:rtl/>
-              </w:rPr>
-              <w:t>הרב עזרא בטאט שליט״א</w:t>
-            </w:r>
-          </w:p>
-        </w:tc>
-        <w:tc>
-          <w:tcPr>
-            <w:tcW w:type="dxa" w:w="1757"/>
-          </w:tcPr>
-          <w:p>
-            <w:pPr>
-              <w:bidi/>
-              <w:jc w:val="right"/>
-            </w:pPr>
-            <w:r/>
-            <w:r>
-              <w:rPr>
-                <w:rFonts w:ascii="David" w:hAnsi="David" w:cs="David"/>
-                <w:b w:val="0"/>
-                <w:sz w:val="19"/>
-                <w:rtl/>
-              </w:rPr>
-              <w:t>עזרא בטאט סימן סב סעיף א_3.docx</w:t>
+              <w:t>528</w:t>
+            </w:r>
+          </w:p>
+        </w:tc>
+        <w:tc>
+          <w:tcPr>
+            <w:tcW w:type="dxa" w:w="1757"/>
+          </w:tcPr>
+          <w:p>
+            <w:pPr>
+              <w:bidi/>
+              <w:jc w:val="right"/>
+            </w:pPr>
+            <w:r/>
+            <w:r>
+              <w:rPr>
+                <w:rFonts w:ascii="David" w:hAnsi="David" w:cs="David"/>
+                <w:b w:val="0"/>
+                <w:sz w:val="19"/>
+                <w:rtl/>
+              </w:rPr>
+              <w:t>סימן ס״א</w:t>
+            </w:r>
+          </w:p>
+        </w:tc>
+        <w:tc>
+          <w:tcPr>
+            <w:tcW w:type="dxa" w:w="1757"/>
+          </w:tcPr>
+          <w:p>
+            <w:pPr>
+              <w:bidi/>
+              <w:jc w:val="right"/>
+            </w:pPr>
+            <w:r/>
+            <w:r>
+              <w:rPr>
+                <w:rFonts w:ascii="David" w:hAnsi="David" w:cs="David"/>
+                <w:b w:val="0"/>
+                <w:sz w:val="19"/>
+                <w:rtl/>
+              </w:rPr>
+              <w:t>בענין השלמת רמ״ח תיבות בקר״ש</w:t>
+            </w:r>
+          </w:p>
+        </w:tc>
+        <w:tc>
+          <w:tcPr>
+            <w:tcW w:type="dxa" w:w="1757"/>
+          </w:tcPr>
+          <w:p>
+            <w:pPr>
+              <w:bidi/>
+              <w:jc w:val="right"/>
+            </w:pPr>
+            <w:r/>
+            <w:r>
+              <w:rPr>
+                <w:rFonts w:ascii="David" w:hAnsi="David" w:cs="David"/>
+                <w:b w:val="0"/>
+                <w:sz w:val="19"/>
+                <w:rtl/>
+              </w:rPr>
+              <w:t>הרב נאור רוזין שליט״א</w:t>
+            </w:r>
+          </w:p>
+        </w:tc>
+        <w:tc>
+          <w:tcPr>
+            <w:tcW w:type="dxa" w:w="1757"/>
+          </w:tcPr>
+          <w:p>
+            <w:pPr>
+              <w:bidi/>
+              <w:jc w:val="right"/>
+            </w:pPr>
+            <w:r/>
+            <w:r>
+              <w:rPr>
+                <w:rFonts w:ascii="David" w:hAnsi="David" w:cs="David"/>
+                <w:b w:val="0"/>
+                <w:sz w:val="19"/>
+                <w:rtl/>
+              </w:rPr>
+              <w:t>בענין השלמת רמח תיבות בקריאת שמע.docx</w:t>
             </w:r>
           </w:p>
         </w:tc>
@@ -6573,111 +6575,112 @@
                 <w:sz w:val="19"/>
                 <w:rtl/>
               </w:rPr>
-              <w:t>540</w:t>
-            </w:r>
-          </w:p>
-        </w:tc>
-        <w:tc>
-          <w:tcPr>
-            <w:tcW w:type="dxa" w:w="1757"/>
-          </w:tcPr>
-          <w:p>
-            <w:pPr>
-              <w:bidi/>
-              <w:jc w:val="right"/>
-            </w:pPr>
-            <w:r/>
-            <w:r>
-              <w:rPr>
-                <w:rFonts w:ascii="David" w:hAnsi="David" w:cs="David"/>
-                <w:b w:val="0"/>
-                <w:sz w:val="19"/>
-                <w:rtl/>
-              </w:rPr>
-              <w:t>סימן ס״ג</w:t>
-            </w:r>
-          </w:p>
-        </w:tc>
-        <w:tc>
-          <w:tcPr>
-            <w:tcW w:type="dxa" w:w="1757"/>
-          </w:tcPr>
-          <w:p>
-            <w:pPr>
-              <w:bidi/>
-              <w:jc w:val="right"/>
-            </w:pPr>
-            <w:r/>
-            <w:r>
-              <w:rPr>
-                <w:rFonts w:ascii="David" w:hAnsi="David" w:cs="David"/>
-                <w:b w:val="0"/>
-                <w:sz w:val="19"/>
-                <w:rtl/>
-              </w:rPr>
-              <w:t>בעניין עקירת חכמים מצוה דאורייתא</w:t>
-            </w:r>
-          </w:p>
-        </w:tc>
-        <w:tc>
-          <w:tcPr>
-            <w:tcW w:type="dxa" w:w="1757"/>
-          </w:tcPr>
-          <w:p>
-            <w:pPr>
-              <w:bidi/>
-              <w:jc w:val="right"/>
-            </w:pPr>
-            <w:r/>
-            <w:r>
-              <w:rPr>
-                <w:rFonts w:ascii="David" w:hAnsi="David" w:cs="David"/>
-                <w:b w:val="0"/>
-                <w:sz w:val="19"/>
-                <w:rtl/>
-              </w:rPr>
-              <w:t>ראש הכולל הרב ר׳ משה זאדה שליט״א</w:t>
-            </w:r>
-          </w:p>
-        </w:tc>
-        <w:tc>
-          <w:tcPr>
-            <w:tcW w:type="dxa" w:w="1757"/>
-          </w:tcPr>
-          <w:p>
-            <w:pPr>
-              <w:bidi/>
-              <w:jc w:val="right"/>
-            </w:pPr>
-            <w:r/>
-            <w:r>
-              <w:rPr>
-                <w:rFonts w:ascii="David" w:hAnsi="David" w:cs="David"/>
-                <w:b w:val="0"/>
-                <w:sz w:val="19"/>
-                <w:rtl/>
-              </w:rPr>
-              <w:t>__-סימן סג-קריאת   משה זאדה שמע.docx</w:t>
-            </w:r>
-          </w:p>
-        </w:tc>
-        <w:tc>
-          <w:tcPr>
-            <w:tcW w:type="dxa" w:w="1757"/>
-          </w:tcPr>
-          <w:p>
-            <w:pPr>
-              <w:bidi/>
-              <w:jc w:val="right"/>
-            </w:pPr>
-            <w:r/>
-            <w:r>
-              <w:rPr>
-                <w:rFonts w:ascii="David" w:hAnsi="David" w:cs="David"/>
-                <w:b w:val="0"/>
-                <w:sz w:val="19"/>
-                <w:rtl/>
-              </w:rPr>
+              <w:t>538</w:t>
+            </w:r>
+          </w:p>
+        </w:tc>
+        <w:tc>
+          <w:tcPr>
+            <w:tcW w:type="dxa" w:w="1757"/>
+          </w:tcPr>
+          <w:p>
+            <w:pPr>
+              <w:bidi/>
+              <w:jc w:val="right"/>
+            </w:pPr>
+            <w:r/>
+            <w:r>
+              <w:rPr>
+                <w:rFonts w:ascii="David" w:hAnsi="David" w:cs="David"/>
+                <w:b w:val="0"/>
+                <w:sz w:val="19"/>
+                <w:rtl/>
+              </w:rPr>
+              <w:t>סימן ס״א</w:t>
+            </w:r>
+          </w:p>
+        </w:tc>
+        <w:tc>
+          <w:tcPr>
+            <w:tcW w:type="dxa" w:w="1757"/>
+          </w:tcPr>
+          <w:p>
+            <w:pPr>
+              <w:bidi/>
+              <w:jc w:val="right"/>
+            </w:pPr>
+            <w:r/>
+            <w:r>
+              <w:rPr>
+                <w:rFonts w:ascii="David" w:hAnsi="David" w:cs="David"/>
+                <w:b w:val="0"/>
+                <w:sz w:val="19"/>
+                <w:rtl/>
+              </w:rPr>
+              <w:t>בענין השלמת רמ״ח תיבות בק״ש (סיכום)</w:t>
+            </w:r>
+          </w:p>
+        </w:tc>
+        <w:tc>
+          <w:tcPr>
+            <w:tcW w:type="dxa" w:w="1757"/>
+          </w:tcPr>
+          <w:p>
+            <w:pPr>
+              <w:bidi/>
+              <w:jc w:val="right"/>
+            </w:pPr>
+            <w:r/>
+            <w:r>
+              <w:rPr>
+                <w:rFonts w:ascii="David" w:hAnsi="David" w:cs="David"/>
+                <w:b w:val="0"/>
+                <w:sz w:val="19"/>
+                <w:rtl/>
+              </w:rPr>
+              <w:t>—</w:t>
+            </w:r>
+          </w:p>
+        </w:tc>
+        <w:tc>
+          <w:tcPr>
+            <w:tcW w:type="dxa" w:w="1757"/>
+          </w:tcPr>
+          <w:p>
+            <w:pPr>
+              <w:bidi/>
+              <w:jc w:val="right"/>
+            </w:pPr>
+            <w:r/>
+            <w:r>
+              <w:rPr>
+                <w:rFonts w:ascii="David" w:hAnsi="David" w:cs="David"/>
+                <w:b w:val="0"/>
+                <w:sz w:val="19"/>
+                <w:rtl/>
+              </w:rPr>
+              <w:t>סימן סא.docx</w:t>
+            </w:r>
+          </w:p>
+        </w:tc>
+        <w:tc>
+          <w:tcPr>
+            <w:tcW w:type="dxa" w:w="1757"/>
+          </w:tcPr>
+          <w:p>
+            <w:pPr>
+              <w:bidi/>
+              <w:jc w:val="right"/>
+            </w:pPr>
+            <w:r/>
+            <w:r>
+              <w:rPr>
+                <w:rFonts w:ascii="David" w:hAnsi="David" w:cs="David"/>
+                <w:b w:val="0"/>
+                <w:sz w:val="19"/>
+                <w:rtl/>
+              </w:rPr>
+              <w:t>סיכום קצר; נוסף ״(סיכום)״ לכותרת כדי להבדילו מהמאמר הארוך באותו נושא</w:t>
             </w:r>
           </w:p>
         </w:tc>
@@ -6700,111 +6703,112 @@
                 <w:sz w:val="19"/>
                 <w:rtl/>
               </w:rPr>
-              <w:t>543</w:t>
-            </w:r>
-          </w:p>
-        </w:tc>
-        <w:tc>
-          <w:tcPr>
-            <w:tcW w:type="dxa" w:w="1757"/>
-          </w:tcPr>
-          <w:p>
-            <w:pPr>
-              <w:bidi/>
-              <w:jc w:val="right"/>
-            </w:pPr>
-            <w:r/>
-            <w:r>
-              <w:rPr>
-                <w:rFonts w:ascii="David" w:hAnsi="David" w:cs="David"/>
-                <w:b w:val="0"/>
-                <w:sz w:val="19"/>
-                <w:rtl/>
-              </w:rPr>
-              <w:t>סימן ס״ג</w:t>
-            </w:r>
-          </w:p>
-        </w:tc>
-        <w:tc>
-          <w:tcPr>
-            <w:tcW w:type="dxa" w:w="1757"/>
-          </w:tcPr>
-          <w:p>
-            <w:pPr>
-              <w:bidi/>
-              <w:jc w:val="right"/>
-            </w:pPr>
-            <w:r/>
-            <w:r>
-              <w:rPr>
-                <w:rFonts w:ascii="David" w:hAnsi="David" w:cs="David"/>
-                <w:b w:val="0"/>
-                <w:sz w:val="19"/>
-                <w:rtl/>
-              </w:rPr>
-              <w:t>לעמוד בקריאת שמע דערבית</w:t>
-            </w:r>
-          </w:p>
-        </w:tc>
-        <w:tc>
-          <w:tcPr>
-            <w:tcW w:type="dxa" w:w="1757"/>
-          </w:tcPr>
-          <w:p>
-            <w:pPr>
-              <w:bidi/>
-              <w:jc w:val="right"/>
-            </w:pPr>
-            <w:r/>
-            <w:r>
-              <w:rPr>
-                <w:rFonts w:ascii="David" w:hAnsi="David" w:cs="David"/>
-                <w:b w:val="0"/>
-                <w:sz w:val="19"/>
-                <w:rtl/>
-              </w:rPr>
-              <w:t>הרב עזרא בטאט שליט״א</w:t>
-            </w:r>
-          </w:p>
-        </w:tc>
-        <w:tc>
-          <w:tcPr>
-            <w:tcW w:type="dxa" w:w="1757"/>
-          </w:tcPr>
-          <w:p>
-            <w:pPr>
-              <w:bidi/>
-              <w:jc w:val="right"/>
-            </w:pPr>
-            <w:r/>
-            <w:r>
-              <w:rPr>
-                <w:rFonts w:ascii="David" w:hAnsi="David" w:cs="David"/>
-                <w:b w:val="0"/>
-                <w:sz w:val="19"/>
-                <w:rtl/>
-              </w:rPr>
-              <w:t>עזרא בטאט סימן סג סעיף א .docx</w:t>
-            </w:r>
-          </w:p>
-        </w:tc>
-        <w:tc>
-          <w:tcPr>
-            <w:tcW w:type="dxa" w:w="1757"/>
-          </w:tcPr>
-          <w:p>
-            <w:pPr>
-              <w:bidi/>
-              <w:jc w:val="right"/>
-            </w:pPr>
-            <w:r/>
-            <w:r>
-              <w:rPr>
-                <w:rFonts w:ascii="David" w:hAnsi="David" w:cs="David"/>
-                <w:b w:val="0"/>
-                <w:sz w:val="19"/>
-                <w:rtl/>
-              </w:rPr>
+              <w:t>540</w:t>
+            </w:r>
+          </w:p>
+        </w:tc>
+        <w:tc>
+          <w:tcPr>
+            <w:tcW w:type="dxa" w:w="1757"/>
+          </w:tcPr>
+          <w:p>
+            <w:pPr>
+              <w:bidi/>
+              <w:jc w:val="right"/>
+            </w:pPr>
+            <w:r/>
+            <w:r>
+              <w:rPr>
+                <w:rFonts w:ascii="David" w:hAnsi="David" w:cs="David"/>
+                <w:b w:val="0"/>
+                <w:sz w:val="19"/>
+                <w:rtl/>
+              </w:rPr>
+              <w:t>סימן ס״א</w:t>
+            </w:r>
+          </w:p>
+        </w:tc>
+        <w:tc>
+          <w:tcPr>
+            <w:tcW w:type="dxa" w:w="1757"/>
+          </w:tcPr>
+          <w:p>
+            <w:pPr>
+              <w:bidi/>
+              <w:jc w:val="right"/>
+            </w:pPr>
+            <w:r/>
+            <w:r>
+              <w:rPr>
+                <w:rFonts w:ascii="David" w:hAnsi="David" w:cs="David"/>
+                <w:b w:val="0"/>
+                <w:sz w:val="19"/>
+                <w:rtl/>
+              </w:rPr>
+              <w:t>סיכום השיטות בענין השלמת הרמ״ח תיבות שבק״ש</w:t>
+            </w:r>
+          </w:p>
+        </w:tc>
+        <w:tc>
+          <w:tcPr>
+            <w:tcW w:type="dxa" w:w="1757"/>
+          </w:tcPr>
+          <w:p>
+            <w:pPr>
+              <w:bidi/>
+              <w:jc w:val="right"/>
+            </w:pPr>
+            <w:r/>
+            <w:r>
+              <w:rPr>
+                <w:rFonts w:ascii="David" w:hAnsi="David" w:cs="David"/>
+                <w:b w:val="0"/>
+                <w:sz w:val="19"/>
+                <w:rtl/>
+              </w:rPr>
+              <w:t>—</w:t>
+            </w:r>
+          </w:p>
+        </w:tc>
+        <w:tc>
+          <w:tcPr>
+            <w:tcW w:type="dxa" w:w="1757"/>
+          </w:tcPr>
+          <w:p>
+            <w:pPr>
+              <w:bidi/>
+              <w:jc w:val="right"/>
+            </w:pPr>
+            <w:r/>
+            <w:r>
+              <w:rPr>
+                <w:rFonts w:ascii="David" w:hAnsi="David" w:cs="David"/>
+                <w:b w:val="0"/>
+                <w:sz w:val="19"/>
+                <w:rtl/>
+              </w:rPr>
+              <w:t>סימן סא סיכום השיטות בענין השלמת הרמח תיבות שבקש.docx</w:t>
+            </w:r>
+          </w:p>
+        </w:tc>
+        <w:tc>
+          <w:tcPr>
+            <w:tcW w:type="dxa" w:w="1757"/>
+          </w:tcPr>
+          <w:p>
+            <w:pPr>
+              <w:bidi/>
+              <w:jc w:val="right"/>
+            </w:pPr>
+            <w:r/>
+            <w:r>
+              <w:rPr>
+                <w:rFonts w:ascii="David" w:hAnsi="David" w:cs="David"/>
+                <w:b w:val="0"/>
+                <w:sz w:val="19"/>
+                <w:rtl/>
+              </w:rPr>
+              <w:t>ללא מחבר בקובץ ובשמו; טקסט שונה מ״סימן סא.docx״ באותו נושא – נכללו שניהם</w:t>
             </w:r>
           </w:p>
         </w:tc>
@@ -6827,49 +6831,49 @@
                 <w:sz w:val="19"/>
                 <w:rtl/>
               </w:rPr>
-              <w:t>547</w:t>
-            </w:r>
-          </w:p>
-        </w:tc>
-        <w:tc>
-          <w:tcPr>
-            <w:tcW w:type="dxa" w:w="1757"/>
-          </w:tcPr>
-          <w:p>
-            <w:pPr>
-              <w:bidi/>
-              <w:jc w:val="right"/>
-            </w:pPr>
-            <w:r/>
-            <w:r>
-              <w:rPr>
-                <w:rFonts w:ascii="David" w:hAnsi="David" w:cs="David"/>
-                <w:b w:val="0"/>
-                <w:sz w:val="19"/>
-                <w:rtl/>
-              </w:rPr>
-              <w:t>סימן ס״ה</w:t>
-            </w:r>
-          </w:p>
-        </w:tc>
-        <w:tc>
-          <w:tcPr>
-            <w:tcW w:type="dxa" w:w="1757"/>
-          </w:tcPr>
-          <w:p>
-            <w:pPr>
-              <w:bidi/>
-              <w:jc w:val="right"/>
-            </w:pPr>
-            <w:r/>
-            <w:r>
-              <w:rPr>
-                <w:rFonts w:ascii="David" w:hAnsi="David" w:cs="David"/>
-                <w:b w:val="0"/>
-                <w:sz w:val="19"/>
-                <w:rtl/>
-              </w:rPr>
-              <w:t>בדברי ביאור הלכה סימן סה ס״א ד״ה ׳קראה׳</w:t>
+              <w:t>548</w:t>
+            </w:r>
+          </w:p>
+        </w:tc>
+        <w:tc>
+          <w:tcPr>
+            <w:tcW w:type="dxa" w:w="1757"/>
+          </w:tcPr>
+          <w:p>
+            <w:pPr>
+              <w:bidi/>
+              <w:jc w:val="right"/>
+            </w:pPr>
+            <w:r/>
+            <w:r>
+              <w:rPr>
+                <w:rFonts w:ascii="David" w:hAnsi="David" w:cs="David"/>
+                <w:b w:val="0"/>
+                <w:sz w:val="19"/>
+                <w:rtl/>
+              </w:rPr>
+              <w:t>סימן ס״א</w:t>
+            </w:r>
+          </w:p>
+        </w:tc>
+        <w:tc>
+          <w:tcPr>
+            <w:tcW w:type="dxa" w:w="1757"/>
+          </w:tcPr>
+          <w:p>
+            <w:pPr>
+              <w:bidi/>
+              <w:jc w:val="right"/>
+            </w:pPr>
+            <w:r/>
+            <w:r>
+              <w:rPr>
+                <w:rFonts w:ascii="David" w:hAnsi="David" w:cs="David"/>
+                <w:b w:val="0"/>
+                <w:sz w:val="19"/>
+                <w:rtl/>
+              </w:rPr>
+              <w:t>ש״ץ שלא כיון בפסוק ראשון דקריאת שמע, האם יחזור לאומרו</w:t>
             </w:r>
           </w:p>
         </w:tc>
@@ -6911,7 +6915,7 @@
                 <w:sz w:val="19"/>
                 <w:rtl/>
               </w:rPr>
-              <w:t>עזרא בטאט סימן סה סעיף א_4.docx</w:t>
+              <w:t>עזרא בטאט סימן סא סעיף ט_2.docx</w:t>
             </w:r>
           </w:p>
         </w:tc>
@@ -6954,49 +6958,49 @@
                 <w:sz w:val="19"/>
                 <w:rtl/>
               </w:rPr>
-              <w:t>551</w:t>
-            </w:r>
-          </w:p>
-        </w:tc>
-        <w:tc>
-          <w:tcPr>
-            <w:tcW w:type="dxa" w:w="1757"/>
-          </w:tcPr>
-          <w:p>
-            <w:pPr>
-              <w:bidi/>
-              <w:jc w:val="right"/>
-            </w:pPr>
-            <w:r/>
-            <w:r>
-              <w:rPr>
-                <w:rFonts w:ascii="David" w:hAnsi="David" w:cs="David"/>
-                <w:b w:val="0"/>
-                <w:sz w:val="19"/>
-                <w:rtl/>
-              </w:rPr>
-              <w:t>סימן ס״ו</w:t>
-            </w:r>
-          </w:p>
-        </w:tc>
-        <w:tc>
-          <w:tcPr>
-            <w:tcW w:type="dxa" w:w="1757"/>
-          </w:tcPr>
-          <w:p>
-            <w:pPr>
-              <w:bidi/>
-              <w:jc w:val="right"/>
-            </w:pPr>
-            <w:r/>
-            <w:r>
-              <w:rPr>
-                <w:rFonts w:ascii="David" w:hAnsi="David" w:cs="David"/>
-                <w:b w:val="0"/>
-                <w:sz w:val="19"/>
-                <w:rtl/>
-              </w:rPr>
-              <w:t>קראוהו לעלות לתורה שלא בפרהסיא בשעה שעוסק בקריאת שמע וברכותיה, האם יעלה או שאין לחוש בזה לכבוד התורה</w:t>
+              <w:t>553</w:t>
+            </w:r>
+          </w:p>
+        </w:tc>
+        <w:tc>
+          <w:tcPr>
+            <w:tcW w:type="dxa" w:w="1757"/>
+          </w:tcPr>
+          <w:p>
+            <w:pPr>
+              <w:bidi/>
+              <w:jc w:val="right"/>
+            </w:pPr>
+            <w:r/>
+            <w:r>
+              <w:rPr>
+                <w:rFonts w:ascii="David" w:hAnsi="David" w:cs="David"/>
+                <w:b w:val="0"/>
+                <w:sz w:val="19"/>
+                <w:rtl/>
+              </w:rPr>
+              <w:t>סימן ס״ב</w:t>
+            </w:r>
+          </w:p>
+        </w:tc>
+        <w:tc>
+          <w:tcPr>
+            <w:tcW w:type="dxa" w:w="1757"/>
+          </w:tcPr>
+          <w:p>
+            <w:pPr>
+              <w:bidi/>
+              <w:jc w:val="right"/>
+            </w:pPr>
+            <w:r/>
+            <w:r>
+              <w:rPr>
+                <w:rFonts w:ascii="David" w:hAnsi="David" w:cs="David"/>
+                <w:b w:val="0"/>
+                <w:sz w:val="19"/>
+                <w:rtl/>
+              </w:rPr>
+              <w:t>דקדוק באותיותיה מהו</w:t>
             </w:r>
           </w:p>
         </w:tc>
@@ -7038,7 +7042,7 @@
                 <w:sz w:val="19"/>
                 <w:rtl/>
               </w:rPr>
-              <w:t>עזרא בטאט - סימן סו סעיף ד.docx</w:t>
+              <w:t>עזרא בטאט סימן סב סעיף א_3.docx</w:t>
             </w:r>
           </w:p>
         </w:tc>
@@ -7081,91 +7085,91 @@
                 <w:sz w:val="19"/>
                 <w:rtl/>
               </w:rPr>
-              <w:t>554</w:t>
-            </w:r>
-          </w:p>
-        </w:tc>
-        <w:tc>
-          <w:tcPr>
-            <w:tcW w:type="dxa" w:w="1757"/>
-          </w:tcPr>
-          <w:p>
-            <w:pPr>
-              <w:bidi/>
-              <w:jc w:val="right"/>
-            </w:pPr>
-            <w:r/>
-            <w:r>
-              <w:rPr>
-                <w:rFonts w:ascii="David" w:hAnsi="David" w:cs="David"/>
-                <w:b w:val="0"/>
-                <w:sz w:val="19"/>
-                <w:rtl/>
-              </w:rPr>
-              <w:t>סימן ס״ז</w:t>
-            </w:r>
-          </w:p>
-        </w:tc>
-        <w:tc>
-          <w:tcPr>
-            <w:tcW w:type="dxa" w:w="1757"/>
-          </w:tcPr>
-          <w:p>
-            <w:pPr>
-              <w:bidi/>
-              <w:jc w:val="right"/>
-            </w:pPr>
-            <w:r/>
-            <w:r>
-              <w:rPr>
-                <w:rFonts w:ascii="David" w:hAnsi="David" w:cs="David"/>
-                <w:b w:val="0"/>
-                <w:sz w:val="19"/>
-                <w:rtl/>
-              </w:rPr>
-              <w:t>בענין חיוב זכירת יציאת מצרים אי מן התורה או מדרבנן</w:t>
-            </w:r>
-          </w:p>
-        </w:tc>
-        <w:tc>
-          <w:tcPr>
-            <w:tcW w:type="dxa" w:w="1757"/>
-          </w:tcPr>
-          <w:p>
-            <w:pPr>
-              <w:bidi/>
-              <w:jc w:val="right"/>
-            </w:pPr>
-            <w:r/>
-            <w:r>
-              <w:rPr>
-                <w:rFonts w:ascii="David" w:hAnsi="David" w:cs="David"/>
-                <w:b w:val="0"/>
-                <w:sz w:val="19"/>
-                <w:rtl/>
-              </w:rPr>
-              <w:t>הרב עזרא בטאט שליט״א</w:t>
-            </w:r>
-          </w:p>
-        </w:tc>
-        <w:tc>
-          <w:tcPr>
-            <w:tcW w:type="dxa" w:w="1757"/>
-          </w:tcPr>
-          <w:p>
-            <w:pPr>
-              <w:bidi/>
-              <w:jc w:val="right"/>
-            </w:pPr>
-            <w:r/>
-            <w:r>
-              <w:rPr>
-                <w:rFonts w:ascii="David" w:hAnsi="David" w:cs="David"/>
-                <w:b w:val="0"/>
-                <w:sz w:val="19"/>
-                <w:rtl/>
-              </w:rPr>
-              <w:t>עזרא בטאט סימן סז.docx</w:t>
+              <w:t>568</w:t>
+            </w:r>
+          </w:p>
+        </w:tc>
+        <w:tc>
+          <w:tcPr>
+            <w:tcW w:type="dxa" w:w="1757"/>
+          </w:tcPr>
+          <w:p>
+            <w:pPr>
+              <w:bidi/>
+              <w:jc w:val="right"/>
+            </w:pPr>
+            <w:r/>
+            <w:r>
+              <w:rPr>
+                <w:rFonts w:ascii="David" w:hAnsi="David" w:cs="David"/>
+                <w:b w:val="0"/>
+                <w:sz w:val="19"/>
+                <w:rtl/>
+              </w:rPr>
+              <w:t>סימן ס״ג</w:t>
+            </w:r>
+          </w:p>
+        </w:tc>
+        <w:tc>
+          <w:tcPr>
+            <w:tcW w:type="dxa" w:w="1757"/>
+          </w:tcPr>
+          <w:p>
+            <w:pPr>
+              <w:bidi/>
+              <w:jc w:val="right"/>
+            </w:pPr>
+            <w:r/>
+            <w:r>
+              <w:rPr>
+                <w:rFonts w:ascii="David" w:hAnsi="David" w:cs="David"/>
+                <w:b w:val="0"/>
+                <w:sz w:val="19"/>
+                <w:rtl/>
+              </w:rPr>
+              <w:t>בעניין עקירת חכמים מצוה דאורייתא</w:t>
+            </w:r>
+          </w:p>
+        </w:tc>
+        <w:tc>
+          <w:tcPr>
+            <w:tcW w:type="dxa" w:w="1757"/>
+          </w:tcPr>
+          <w:p>
+            <w:pPr>
+              <w:bidi/>
+              <w:jc w:val="right"/>
+            </w:pPr>
+            <w:r/>
+            <w:r>
+              <w:rPr>
+                <w:rFonts w:ascii="David" w:hAnsi="David" w:cs="David"/>
+                <w:b w:val="0"/>
+                <w:sz w:val="19"/>
+                <w:rtl/>
+              </w:rPr>
+              <w:t>ראש הכולל הרב ר׳ משה זאדה שליט״א</w:t>
+            </w:r>
+          </w:p>
+        </w:tc>
+        <w:tc>
+          <w:tcPr>
+            <w:tcW w:type="dxa" w:w="1757"/>
+          </w:tcPr>
+          <w:p>
+            <w:pPr>
+              <w:bidi/>
+              <w:jc w:val="right"/>
+            </w:pPr>
+            <w:r/>
+            <w:r>
+              <w:rPr>
+                <w:rFonts w:ascii="David" w:hAnsi="David" w:cs="David"/>
+                <w:b w:val="0"/>
+                <w:sz w:val="19"/>
+                <w:rtl/>
+              </w:rPr>
+              <w:t>__-סימן סג-קריאת   משה זאדה שמע.docx</w:t>
             </w:r>
           </w:p>
         </w:tc>
@@ -7208,49 +7212,49 @@
                 <w:sz w:val="19"/>
                 <w:rtl/>
               </w:rPr>
-              <w:t>558</w:t>
-            </w:r>
-          </w:p>
-        </w:tc>
-        <w:tc>
-          <w:tcPr>
-            <w:tcW w:type="dxa" w:w="1757"/>
-          </w:tcPr>
-          <w:p>
-            <w:pPr>
-              <w:bidi/>
-              <w:jc w:val="right"/>
-            </w:pPr>
-            <w:r/>
-            <w:r>
-              <w:rPr>
-                <w:rFonts w:ascii="David" w:hAnsi="David" w:cs="David"/>
-                <w:b w:val="0"/>
-                <w:sz w:val="19"/>
-                <w:rtl/>
-              </w:rPr>
-              <w:t>סימן ס״ט</w:t>
-            </w:r>
-          </w:p>
-        </w:tc>
-        <w:tc>
-          <w:tcPr>
-            <w:tcW w:type="dxa" w:w="1757"/>
-          </w:tcPr>
-          <w:p>
-            <w:pPr>
-              <w:bidi/>
-              <w:jc w:val="right"/>
-            </w:pPr>
-            <w:r/>
-            <w:r>
-              <w:rPr>
-                <w:rFonts w:ascii="David" w:hAnsi="David" w:cs="David"/>
-                <w:b w:val="0"/>
-                <w:sz w:val="19"/>
-                <w:rtl/>
-              </w:rPr>
-              <w:t>בדין רובו ככולו לצירוף מנין</w:t>
+              <w:t>571</w:t>
+            </w:r>
+          </w:p>
+        </w:tc>
+        <w:tc>
+          <w:tcPr>
+            <w:tcW w:type="dxa" w:w="1757"/>
+          </w:tcPr>
+          <w:p>
+            <w:pPr>
+              <w:bidi/>
+              <w:jc w:val="right"/>
+            </w:pPr>
+            <w:r/>
+            <w:r>
+              <w:rPr>
+                <w:rFonts w:ascii="David" w:hAnsi="David" w:cs="David"/>
+                <w:b w:val="0"/>
+                <w:sz w:val="19"/>
+                <w:rtl/>
+              </w:rPr>
+              <w:t>סימן ס״ג</w:t>
+            </w:r>
+          </w:p>
+        </w:tc>
+        <w:tc>
+          <w:tcPr>
+            <w:tcW w:type="dxa" w:w="1757"/>
+          </w:tcPr>
+          <w:p>
+            <w:pPr>
+              <w:bidi/>
+              <w:jc w:val="right"/>
+            </w:pPr>
+            <w:r/>
+            <w:r>
+              <w:rPr>
+                <w:rFonts w:ascii="David" w:hAnsi="David" w:cs="David"/>
+                <w:b w:val="0"/>
+                <w:sz w:val="19"/>
+                <w:rtl/>
+              </w:rPr>
+              <w:t>לעמוד בקריאת שמע דערבית</w:t>
             </w:r>
           </w:p>
         </w:tc>
@@ -7292,28 +7296,27 @@
                 <w:sz w:val="19"/>
                 <w:rtl/>
               </w:rPr>
-              <w:t>עזרא בטאט - סימן סט.docx</w:t>
-            </w:r>
-          </w:p>
-        </w:tc>
-        <w:tc>
-          <w:tcPr>
-            <w:tcW w:type="dxa" w:w="1757"/>
-          </w:tcPr>
-          <w:p>
-            <w:pPr>
-              <w:bidi/>
-              <w:jc w:val="right"/>
-            </w:pPr>
-            <w:r/>
-            <w:r>
-              <w:rPr>
-                <w:rFonts w:ascii="David" w:hAnsi="David" w:cs="David"/>
-                <w:b w:val="0"/>
-                <w:sz w:val="19"/>
-                <w:rtl/>
-              </w:rPr>
-              <w:t>הוסרו שורות הכותרת: חודש החבורה ומספר טלפון</w:t>
+              <w:t>עזרא בטאט סימן סג סעיף א .docx</w:t>
+            </w:r>
+          </w:p>
+        </w:tc>
+        <w:tc>
+          <w:tcPr>
+            <w:tcW w:type="dxa" w:w="1757"/>
+          </w:tcPr>
+          <w:p>
+            <w:pPr>
+              <w:bidi/>
+              <w:jc w:val="right"/>
+            </w:pPr>
+            <w:r/>
+            <w:r>
+              <w:rPr>
+                <w:rFonts w:ascii="David" w:hAnsi="David" w:cs="David"/>
+                <w:b w:val="0"/>
+                <w:sz w:val="19"/>
+                <w:rtl/>
+              </w:rPr>
             </w:r>
           </w:p>
         </w:tc>
@@ -7336,111 +7339,112 @@
                 <w:sz w:val="19"/>
                 <w:rtl/>
               </w:rPr>
-              <w:t>562</w:t>
-            </w:r>
-          </w:p>
-        </w:tc>
-        <w:tc>
-          <w:tcPr>
-            <w:tcW w:type="dxa" w:w="1757"/>
-          </w:tcPr>
-          <w:p>
-            <w:pPr>
-              <w:bidi/>
-              <w:jc w:val="right"/>
-            </w:pPr>
-            <w:r/>
-            <w:r>
-              <w:rPr>
-                <w:rFonts w:ascii="David" w:hAnsi="David" w:cs="David"/>
-                <w:b w:val="0"/>
-                <w:sz w:val="19"/>
-                <w:rtl/>
-              </w:rPr>
-              <w:t>סימן ע׳</w:t>
-            </w:r>
-          </w:p>
-        </w:tc>
-        <w:tc>
-          <w:tcPr>
-            <w:tcW w:type="dxa" w:w="1757"/>
-          </w:tcPr>
-          <w:p>
-            <w:pPr>
-              <w:bidi/>
-              <w:jc w:val="right"/>
-            </w:pPr>
-            <w:r/>
-            <w:r>
-              <w:rPr>
-                <w:rFonts w:ascii="David" w:hAnsi="David" w:cs="David"/>
-                <w:b w:val="0"/>
-                <w:sz w:val="19"/>
-                <w:rtl/>
-              </w:rPr>
-              <w:t>העוסק במלאכה או בשאר דברים האם צריך לפסוק לקריאת שמע?</w:t>
-            </w:r>
-          </w:p>
-        </w:tc>
-        <w:tc>
-          <w:tcPr>
-            <w:tcW w:type="dxa" w:w="1757"/>
-          </w:tcPr>
-          <w:p>
-            <w:pPr>
-              <w:bidi/>
-              <w:jc w:val="right"/>
-            </w:pPr>
-            <w:r/>
-            <w:r>
-              <w:rPr>
-                <w:rFonts w:ascii="David" w:hAnsi="David" w:cs="David"/>
-                <w:b w:val="0"/>
-                <w:sz w:val="19"/>
-                <w:rtl/>
-              </w:rPr>
-              <w:t>הרב עזרא בטאט שליט״א</w:t>
-            </w:r>
-          </w:p>
-        </w:tc>
-        <w:tc>
-          <w:tcPr>
-            <w:tcW w:type="dxa" w:w="1757"/>
-          </w:tcPr>
-          <w:p>
-            <w:pPr>
-              <w:bidi/>
-              <w:jc w:val="right"/>
-            </w:pPr>
-            <w:r/>
-            <w:r>
-              <w:rPr>
-                <w:rFonts w:ascii="David" w:hAnsi="David" w:cs="David"/>
-                <w:b w:val="0"/>
-                <w:sz w:val="19"/>
-                <w:rtl/>
-              </w:rPr>
-              <w:t>עזרא בטאט - חבורה סימן ע.docx</w:t>
-            </w:r>
-          </w:p>
-        </w:tc>
-        <w:tc>
-          <w:tcPr>
-            <w:tcW w:type="dxa" w:w="1757"/>
-          </w:tcPr>
-          <w:p>
-            <w:pPr>
-              <w:bidi/>
-              <w:jc w:val="right"/>
-            </w:pPr>
-            <w:r/>
-            <w:r>
-              <w:rPr>
-                <w:rFonts w:ascii="David" w:hAnsi="David" w:cs="David"/>
-                <w:b w:val="0"/>
-                <w:sz w:val="19"/>
-                <w:rtl/>
-              </w:rPr>
+              <w:t>575</w:t>
+            </w:r>
+          </w:p>
+        </w:tc>
+        <w:tc>
+          <w:tcPr>
+            <w:tcW w:type="dxa" w:w="1757"/>
+          </w:tcPr>
+          <w:p>
+            <w:pPr>
+              <w:bidi/>
+              <w:jc w:val="right"/>
+            </w:pPr>
+            <w:r/>
+            <w:r>
+              <w:rPr>
+                <w:rFonts w:ascii="David" w:hAnsi="David" w:cs="David"/>
+                <w:b w:val="0"/>
+                <w:sz w:val="19"/>
+                <w:rtl/>
+              </w:rPr>
+              <w:t>סימן ס״ה</w:t>
+            </w:r>
+          </w:p>
+        </w:tc>
+        <w:tc>
+          <w:tcPr>
+            <w:tcW w:type="dxa" w:w="1757"/>
+          </w:tcPr>
+          <w:p>
+            <w:pPr>
+              <w:bidi/>
+              <w:jc w:val="right"/>
+            </w:pPr>
+            <w:r/>
+            <w:r>
+              <w:rPr>
+                <w:rFonts w:ascii="David" w:hAnsi="David" w:cs="David"/>
+                <w:b w:val="0"/>
+                <w:sz w:val="19"/>
+                <w:rtl/>
+              </w:rPr>
+              <w:t>בדין שהה לגמור את כולה</w:t>
+            </w:r>
+          </w:p>
+        </w:tc>
+        <w:tc>
+          <w:tcPr>
+            <w:tcW w:type="dxa" w:w="1757"/>
+          </w:tcPr>
+          <w:p>
+            <w:pPr>
+              <w:bidi/>
+              <w:jc w:val="right"/>
+            </w:pPr>
+            <w:r/>
+            <w:r>
+              <w:rPr>
+                <w:rFonts w:ascii="David" w:hAnsi="David" w:cs="David"/>
+                <w:b w:val="0"/>
+                <w:sz w:val="19"/>
+                <w:rtl/>
+              </w:rPr>
+              <w:t>—</w:t>
+            </w:r>
+          </w:p>
+        </w:tc>
+        <w:tc>
+          <w:tcPr>
+            <w:tcW w:type="dxa" w:w="1757"/>
+          </w:tcPr>
+          <w:p>
+            <w:pPr>
+              <w:bidi/>
+              <w:jc w:val="right"/>
+            </w:pPr>
+            <w:r/>
+            <w:r>
+              <w:rPr>
+                <w:rFonts w:ascii="David" w:hAnsi="David" w:cs="David"/>
+                <w:b w:val="0"/>
+                <w:sz w:val="19"/>
+                <w:rtl/>
+              </w:rPr>
+              <w:t>סימן סה בדין שהה לגמור את כולה.docx</w:t>
+            </w:r>
+          </w:p>
+        </w:tc>
+        <w:tc>
+          <w:tcPr>
+            <w:tcW w:type="dxa" w:w="1757"/>
+          </w:tcPr>
+          <w:p>
+            <w:pPr>
+              <w:bidi/>
+              <w:jc w:val="right"/>
+            </w:pPr>
+            <w:r/>
+            <w:r>
+              <w:rPr>
+                <w:rFonts w:ascii="David" w:hAnsi="David" w:cs="David"/>
+                <w:b w:val="0"/>
+                <w:sz w:val="19"/>
+                <w:rtl/>
+              </w:rPr>
+              <w:t>ללא מחבר בקובץ ובשמו; ללא סעיף בשם הקובץ – הוצב בתחילת הסימן</w:t>
             </w:r>
           </w:p>
         </w:tc>
@@ -7463,91 +7467,91 @@
                 <w:sz w:val="19"/>
                 <w:rtl/>
               </w:rPr>
-              <w:t>566</w:t>
-            </w:r>
-          </w:p>
-        </w:tc>
-        <w:tc>
-          <w:tcPr>
-            <w:tcW w:type="dxa" w:w="1757"/>
-          </w:tcPr>
-          <w:p>
-            <w:pPr>
-              <w:bidi/>
-              <w:jc w:val="right"/>
-            </w:pPr>
-            <w:r/>
-            <w:r>
-              <w:rPr>
-                <w:rFonts w:ascii="David" w:hAnsi="David" w:cs="David"/>
-                <w:b w:val="0"/>
-                <w:sz w:val="19"/>
-                <w:rtl/>
-              </w:rPr>
-              <w:t>סימן ק״ח</w:t>
-            </w:r>
-          </w:p>
-        </w:tc>
-        <w:tc>
-          <w:tcPr>
-            <w:tcW w:type="dxa" w:w="1757"/>
-          </w:tcPr>
-          <w:p>
-            <w:pPr>
-              <w:bidi/>
-              <w:jc w:val="right"/>
-            </w:pPr>
-            <w:r/>
-            <w:r>
-              <w:rPr>
-                <w:rFonts w:ascii="David" w:hAnsi="David" w:cs="David"/>
-                <w:b w:val="0"/>
-                <w:sz w:val="19"/>
-                <w:rtl/>
-              </w:rPr>
-              <w:t>בענין תפילת תשלומין</w:t>
-            </w:r>
-          </w:p>
-        </w:tc>
-        <w:tc>
-          <w:tcPr>
-            <w:tcW w:type="dxa" w:w="1757"/>
-          </w:tcPr>
-          <w:p>
-            <w:pPr>
-              <w:bidi/>
-              <w:jc w:val="right"/>
-            </w:pPr>
-            <w:r/>
-            <w:r>
-              <w:rPr>
-                <w:rFonts w:ascii="David" w:hAnsi="David" w:cs="David"/>
-                <w:b w:val="0"/>
-                <w:sz w:val="19"/>
-                <w:rtl/>
-              </w:rPr>
-              <w:t>ראש הכולל הרב ר׳ משה זאדה שליט״א</w:t>
-            </w:r>
-          </w:p>
-        </w:tc>
-        <w:tc>
-          <w:tcPr>
-            <w:tcW w:type="dxa" w:w="1757"/>
-          </w:tcPr>
-          <w:p>
-            <w:pPr>
-              <w:bidi/>
-              <w:jc w:val="right"/>
-            </w:pPr>
-            <w:r/>
-            <w:r>
-              <w:rPr>
-                <w:rFonts w:ascii="David" w:hAnsi="David" w:cs="David"/>
-                <w:b w:val="0"/>
-                <w:sz w:val="19"/>
-                <w:rtl/>
-              </w:rPr>
-              <w:t>סימן קח - משה זאדה.docx</w:t>
+              <w:t>579</w:t>
+            </w:r>
+          </w:p>
+        </w:tc>
+        <w:tc>
+          <w:tcPr>
+            <w:tcW w:type="dxa" w:w="1757"/>
+          </w:tcPr>
+          <w:p>
+            <w:pPr>
+              <w:bidi/>
+              <w:jc w:val="right"/>
+            </w:pPr>
+            <w:r/>
+            <w:r>
+              <w:rPr>
+                <w:rFonts w:ascii="David" w:hAnsi="David" w:cs="David"/>
+                <w:b w:val="0"/>
+                <w:sz w:val="19"/>
+                <w:rtl/>
+              </w:rPr>
+              <w:t>סימן ס״ה</w:t>
+            </w:r>
+          </w:p>
+        </w:tc>
+        <w:tc>
+          <w:tcPr>
+            <w:tcW w:type="dxa" w:w="1757"/>
+          </w:tcPr>
+          <w:p>
+            <w:pPr>
+              <w:bidi/>
+              <w:jc w:val="right"/>
+            </w:pPr>
+            <w:r/>
+            <w:r>
+              <w:rPr>
+                <w:rFonts w:ascii="David" w:hAnsi="David" w:cs="David"/>
+                <w:b w:val="0"/>
+                <w:sz w:val="19"/>
+                <w:rtl/>
+              </w:rPr>
+              <w:t>בדברי ביאור הלכה סימן סה ס״א ד״ה ׳קראה׳</w:t>
+            </w:r>
+          </w:p>
+        </w:tc>
+        <w:tc>
+          <w:tcPr>
+            <w:tcW w:type="dxa" w:w="1757"/>
+          </w:tcPr>
+          <w:p>
+            <w:pPr>
+              <w:bidi/>
+              <w:jc w:val="right"/>
+            </w:pPr>
+            <w:r/>
+            <w:r>
+              <w:rPr>
+                <w:rFonts w:ascii="David" w:hAnsi="David" w:cs="David"/>
+                <w:b w:val="0"/>
+                <w:sz w:val="19"/>
+                <w:rtl/>
+              </w:rPr>
+              <w:t>הרב עזרא בטאט שליט״א</w:t>
+            </w:r>
+          </w:p>
+        </w:tc>
+        <w:tc>
+          <w:tcPr>
+            <w:tcW w:type="dxa" w:w="1757"/>
+          </w:tcPr>
+          <w:p>
+            <w:pPr>
+              <w:bidi/>
+              <w:jc w:val="right"/>
+            </w:pPr>
+            <w:r/>
+            <w:r>
+              <w:rPr>
+                <w:rFonts w:ascii="David" w:hAnsi="David" w:cs="David"/>
+                <w:b w:val="0"/>
+                <w:sz w:val="19"/>
+                <w:rtl/>
+              </w:rPr>
+              <w:t>עזרא בטאט סימן סה סעיף א_4.docx</w:t>
             </w:r>
           </w:p>
         </w:tc>
@@ -7590,49 +7594,49 @@
                 <w:sz w:val="19"/>
                 <w:rtl/>
               </w:rPr>
-              <w:t>571</w:t>
-            </w:r>
-          </w:p>
-        </w:tc>
-        <w:tc>
-          <w:tcPr>
-            <w:tcW w:type="dxa" w:w="1757"/>
-          </w:tcPr>
-          <w:p>
-            <w:pPr>
-              <w:bidi/>
-              <w:jc w:val="right"/>
-            </w:pPr>
-            <w:r/>
-            <w:r>
-              <w:rPr>
-                <w:rFonts w:ascii="David" w:hAnsi="David" w:cs="David"/>
-                <w:b w:val="0"/>
-                <w:sz w:val="19"/>
-                <w:rtl/>
-              </w:rPr>
-              <w:t>יורה דעה סימן של״ד</w:t>
-            </w:r>
-          </w:p>
-        </w:tc>
-        <w:tc>
-          <w:tcPr>
-            <w:tcW w:type="dxa" w:w="1757"/>
-          </w:tcPr>
-          <w:p>
-            <w:pPr>
-              <w:bidi/>
-              <w:jc w:val="right"/>
-            </w:pPr>
-            <w:r/>
-            <w:r>
-              <w:rPr>
-                <w:rFonts w:ascii="David" w:hAnsi="David" w:cs="David"/>
-                <w:b w:val="0"/>
-                <w:sz w:val="19"/>
-                <w:rtl/>
-              </w:rPr>
-              <w:t>צירוף מנודה לדבר שבקדושה ולמגילה [ובעניין נידוי בזמן הזה]</w:t>
+              <w:t>583</w:t>
+            </w:r>
+          </w:p>
+        </w:tc>
+        <w:tc>
+          <w:tcPr>
+            <w:tcW w:type="dxa" w:w="1757"/>
+          </w:tcPr>
+          <w:p>
+            <w:pPr>
+              <w:bidi/>
+              <w:jc w:val="right"/>
+            </w:pPr>
+            <w:r/>
+            <w:r>
+              <w:rPr>
+                <w:rFonts w:ascii="David" w:hAnsi="David" w:cs="David"/>
+                <w:b w:val="0"/>
+                <w:sz w:val="19"/>
+                <w:rtl/>
+              </w:rPr>
+              <w:t>סימן ס״ו</w:t>
+            </w:r>
+          </w:p>
+        </w:tc>
+        <w:tc>
+          <w:tcPr>
+            <w:tcW w:type="dxa" w:w="1757"/>
+          </w:tcPr>
+          <w:p>
+            <w:pPr>
+              <w:bidi/>
+              <w:jc w:val="right"/>
+            </w:pPr>
+            <w:r/>
+            <w:r>
+              <w:rPr>
+                <w:rFonts w:ascii="David" w:hAnsi="David" w:cs="David"/>
+                <w:b w:val="0"/>
+                <w:sz w:val="19"/>
+                <w:rtl/>
+              </w:rPr>
+              <w:t>קראוהו לעלות לתורה שלא בפרהסיא בשעה שעוסק בקריאת שמע וברכותיה, האם יעלה או שאין לחוש בזה לכבוד התורה</w:t>
             </w:r>
           </w:p>
         </w:tc>
@@ -7674,7 +7678,7 @@
                 <w:sz w:val="19"/>
                 <w:rtl/>
               </w:rPr>
-              <w:t>חוברת מתוקנת.docx</w:t>
+              <w:t>עזרא בטאט - סימן סו סעיף ד.docx</w:t>
             </w:r>
           </w:p>
         </w:tc>
@@ -7717,7 +7721,643 @@
                 <w:sz w:val="19"/>
                 <w:rtl/>
               </w:rPr>
-              <w:t>579</w:t>
+              <w:t>586</w:t>
+            </w:r>
+          </w:p>
+        </w:tc>
+        <w:tc>
+          <w:tcPr>
+            <w:tcW w:type="dxa" w:w="1757"/>
+          </w:tcPr>
+          <w:p>
+            <w:pPr>
+              <w:bidi/>
+              <w:jc w:val="right"/>
+            </w:pPr>
+            <w:r/>
+            <w:r>
+              <w:rPr>
+                <w:rFonts w:ascii="David" w:hAnsi="David" w:cs="David"/>
+                <w:b w:val="0"/>
+                <w:sz w:val="19"/>
+                <w:rtl/>
+              </w:rPr>
+              <w:t>סימן ס״ז</w:t>
+            </w:r>
+          </w:p>
+        </w:tc>
+        <w:tc>
+          <w:tcPr>
+            <w:tcW w:type="dxa" w:w="1757"/>
+          </w:tcPr>
+          <w:p>
+            <w:pPr>
+              <w:bidi/>
+              <w:jc w:val="right"/>
+            </w:pPr>
+            <w:r/>
+            <w:r>
+              <w:rPr>
+                <w:rFonts w:ascii="David" w:hAnsi="David" w:cs="David"/>
+                <w:b w:val="0"/>
+                <w:sz w:val="19"/>
+                <w:rtl/>
+              </w:rPr>
+              <w:t>בענין חיוב זכירת יציאת מצרים אי מן התורה או מדרבנן</w:t>
+            </w:r>
+          </w:p>
+        </w:tc>
+        <w:tc>
+          <w:tcPr>
+            <w:tcW w:type="dxa" w:w="1757"/>
+          </w:tcPr>
+          <w:p>
+            <w:pPr>
+              <w:bidi/>
+              <w:jc w:val="right"/>
+            </w:pPr>
+            <w:r/>
+            <w:r>
+              <w:rPr>
+                <w:rFonts w:ascii="David" w:hAnsi="David" w:cs="David"/>
+                <w:b w:val="0"/>
+                <w:sz w:val="19"/>
+                <w:rtl/>
+              </w:rPr>
+              <w:t>הרב עזרא בטאט שליט״א</w:t>
+            </w:r>
+          </w:p>
+        </w:tc>
+        <w:tc>
+          <w:tcPr>
+            <w:tcW w:type="dxa" w:w="1757"/>
+          </w:tcPr>
+          <w:p>
+            <w:pPr>
+              <w:bidi/>
+              <w:jc w:val="right"/>
+            </w:pPr>
+            <w:r/>
+            <w:r>
+              <w:rPr>
+                <w:rFonts w:ascii="David" w:hAnsi="David" w:cs="David"/>
+                <w:b w:val="0"/>
+                <w:sz w:val="19"/>
+                <w:rtl/>
+              </w:rPr>
+              <w:t>עזרא בטאט סימן סז.docx</w:t>
+            </w:r>
+          </w:p>
+        </w:tc>
+        <w:tc>
+          <w:tcPr>
+            <w:tcW w:type="dxa" w:w="1757"/>
+          </w:tcPr>
+          <w:p>
+            <w:pPr>
+              <w:bidi/>
+              <w:jc w:val="right"/>
+            </w:pPr>
+            <w:r/>
+            <w:r>
+              <w:rPr>
+                <w:rFonts w:ascii="David" w:hAnsi="David" w:cs="David"/>
+                <w:b w:val="0"/>
+                <w:sz w:val="19"/>
+                <w:rtl/>
+              </w:rPr>
+            </w:r>
+          </w:p>
+        </w:tc>
+      </w:tr>
+      <w:tr>
+        <w:tc>
+          <w:tcPr>
+            <w:tcW w:type="dxa" w:w="1757"/>
+          </w:tcPr>
+          <w:p>
+            <w:pPr>
+              <w:bidi/>
+              <w:jc w:val="right"/>
+            </w:pPr>
+            <w:r/>
+            <w:r>
+              <w:rPr>
+                <w:rFonts w:ascii="David" w:hAnsi="David" w:cs="David"/>
+                <w:b w:val="0"/>
+                <w:sz w:val="19"/>
+                <w:rtl/>
+              </w:rPr>
+              <w:t>590</w:t>
+            </w:r>
+          </w:p>
+        </w:tc>
+        <w:tc>
+          <w:tcPr>
+            <w:tcW w:type="dxa" w:w="1757"/>
+          </w:tcPr>
+          <w:p>
+            <w:pPr>
+              <w:bidi/>
+              <w:jc w:val="right"/>
+            </w:pPr>
+            <w:r/>
+            <w:r>
+              <w:rPr>
+                <w:rFonts w:ascii="David" w:hAnsi="David" w:cs="David"/>
+                <w:b w:val="0"/>
+                <w:sz w:val="19"/>
+                <w:rtl/>
+              </w:rPr>
+              <w:t>סימן ס״ט</w:t>
+            </w:r>
+          </w:p>
+        </w:tc>
+        <w:tc>
+          <w:tcPr>
+            <w:tcW w:type="dxa" w:w="1757"/>
+          </w:tcPr>
+          <w:p>
+            <w:pPr>
+              <w:bidi/>
+              <w:jc w:val="right"/>
+            </w:pPr>
+            <w:r/>
+            <w:r>
+              <w:rPr>
+                <w:rFonts w:ascii="David" w:hAnsi="David" w:cs="David"/>
+                <w:b w:val="0"/>
+                <w:sz w:val="19"/>
+                <w:rtl/>
+              </w:rPr>
+              <w:t>בדין רובו ככולו לצירוף מנין</w:t>
+            </w:r>
+          </w:p>
+        </w:tc>
+        <w:tc>
+          <w:tcPr>
+            <w:tcW w:type="dxa" w:w="1757"/>
+          </w:tcPr>
+          <w:p>
+            <w:pPr>
+              <w:bidi/>
+              <w:jc w:val="right"/>
+            </w:pPr>
+            <w:r/>
+            <w:r>
+              <w:rPr>
+                <w:rFonts w:ascii="David" w:hAnsi="David" w:cs="David"/>
+                <w:b w:val="0"/>
+                <w:sz w:val="19"/>
+                <w:rtl/>
+              </w:rPr>
+              <w:t>הרב עזרא בטאט שליט״א</w:t>
+            </w:r>
+          </w:p>
+        </w:tc>
+        <w:tc>
+          <w:tcPr>
+            <w:tcW w:type="dxa" w:w="1757"/>
+          </w:tcPr>
+          <w:p>
+            <w:pPr>
+              <w:bidi/>
+              <w:jc w:val="right"/>
+            </w:pPr>
+            <w:r/>
+            <w:r>
+              <w:rPr>
+                <w:rFonts w:ascii="David" w:hAnsi="David" w:cs="David"/>
+                <w:b w:val="0"/>
+                <w:sz w:val="19"/>
+                <w:rtl/>
+              </w:rPr>
+              <w:t>עזרא בטאט - סימן סט.docx</w:t>
+            </w:r>
+          </w:p>
+        </w:tc>
+        <w:tc>
+          <w:tcPr>
+            <w:tcW w:type="dxa" w:w="1757"/>
+          </w:tcPr>
+          <w:p>
+            <w:pPr>
+              <w:bidi/>
+              <w:jc w:val="right"/>
+            </w:pPr>
+            <w:r/>
+            <w:r>
+              <w:rPr>
+                <w:rFonts w:ascii="David" w:hAnsi="David" w:cs="David"/>
+                <w:b w:val="0"/>
+                <w:sz w:val="19"/>
+                <w:rtl/>
+              </w:rPr>
+              <w:t>הוסרו שורות הכותרת: חודש החבורה ומספר טלפון</w:t>
+            </w:r>
+          </w:p>
+        </w:tc>
+      </w:tr>
+      <w:tr>
+        <w:tc>
+          <w:tcPr>
+            <w:tcW w:type="dxa" w:w="1757"/>
+          </w:tcPr>
+          <w:p>
+            <w:pPr>
+              <w:bidi/>
+              <w:jc w:val="right"/>
+            </w:pPr>
+            <w:r/>
+            <w:r>
+              <w:rPr>
+                <w:rFonts w:ascii="David" w:hAnsi="David" w:cs="David"/>
+                <w:b w:val="0"/>
+                <w:sz w:val="19"/>
+                <w:rtl/>
+              </w:rPr>
+              <w:t>594</w:t>
+            </w:r>
+          </w:p>
+        </w:tc>
+        <w:tc>
+          <w:tcPr>
+            <w:tcW w:type="dxa" w:w="1757"/>
+          </w:tcPr>
+          <w:p>
+            <w:pPr>
+              <w:bidi/>
+              <w:jc w:val="right"/>
+            </w:pPr>
+            <w:r/>
+            <w:r>
+              <w:rPr>
+                <w:rFonts w:ascii="David" w:hAnsi="David" w:cs="David"/>
+                <w:b w:val="0"/>
+                <w:sz w:val="19"/>
+                <w:rtl/>
+              </w:rPr>
+              <w:t>סימן ע׳</w:t>
+            </w:r>
+          </w:p>
+        </w:tc>
+        <w:tc>
+          <w:tcPr>
+            <w:tcW w:type="dxa" w:w="1757"/>
+          </w:tcPr>
+          <w:p>
+            <w:pPr>
+              <w:bidi/>
+              <w:jc w:val="right"/>
+            </w:pPr>
+            <w:r/>
+            <w:r>
+              <w:rPr>
+                <w:rFonts w:ascii="David" w:hAnsi="David" w:cs="David"/>
+                <w:b w:val="0"/>
+                <w:sz w:val="19"/>
+                <w:rtl/>
+              </w:rPr>
+              <w:t>העוסק במלאכה או בשאר דברים האם צריך לפסוק לקריאת שמע?</w:t>
+            </w:r>
+          </w:p>
+        </w:tc>
+        <w:tc>
+          <w:tcPr>
+            <w:tcW w:type="dxa" w:w="1757"/>
+          </w:tcPr>
+          <w:p>
+            <w:pPr>
+              <w:bidi/>
+              <w:jc w:val="right"/>
+            </w:pPr>
+            <w:r/>
+            <w:r>
+              <w:rPr>
+                <w:rFonts w:ascii="David" w:hAnsi="David" w:cs="David"/>
+                <w:b w:val="0"/>
+                <w:sz w:val="19"/>
+                <w:rtl/>
+              </w:rPr>
+              <w:t>הרב עזרא בטאט שליט״א</w:t>
+            </w:r>
+          </w:p>
+        </w:tc>
+        <w:tc>
+          <w:tcPr>
+            <w:tcW w:type="dxa" w:w="1757"/>
+          </w:tcPr>
+          <w:p>
+            <w:pPr>
+              <w:bidi/>
+              <w:jc w:val="right"/>
+            </w:pPr>
+            <w:r/>
+            <w:r>
+              <w:rPr>
+                <w:rFonts w:ascii="David" w:hAnsi="David" w:cs="David"/>
+                <w:b w:val="0"/>
+                <w:sz w:val="19"/>
+                <w:rtl/>
+              </w:rPr>
+              <w:t>עזרא בטאט - חבורה סימן ע.docx</w:t>
+            </w:r>
+          </w:p>
+        </w:tc>
+        <w:tc>
+          <w:tcPr>
+            <w:tcW w:type="dxa" w:w="1757"/>
+          </w:tcPr>
+          <w:p>
+            <w:pPr>
+              <w:bidi/>
+              <w:jc w:val="right"/>
+            </w:pPr>
+            <w:r/>
+            <w:r>
+              <w:rPr>
+                <w:rFonts w:ascii="David" w:hAnsi="David" w:cs="David"/>
+                <w:b w:val="0"/>
+                <w:sz w:val="19"/>
+                <w:rtl/>
+              </w:rPr>
+            </w:r>
+          </w:p>
+        </w:tc>
+      </w:tr>
+      <w:tr>
+        <w:tc>
+          <w:tcPr>
+            <w:tcW w:type="dxa" w:w="1757"/>
+          </w:tcPr>
+          <w:p>
+            <w:pPr>
+              <w:bidi/>
+              <w:jc w:val="right"/>
+            </w:pPr>
+            <w:r/>
+            <w:r>
+              <w:rPr>
+                <w:rFonts w:ascii="David" w:hAnsi="David" w:cs="David"/>
+                <w:b w:val="0"/>
+                <w:sz w:val="19"/>
+                <w:rtl/>
+              </w:rPr>
+              <w:t>598</w:t>
+            </w:r>
+          </w:p>
+        </w:tc>
+        <w:tc>
+          <w:tcPr>
+            <w:tcW w:type="dxa" w:w="1757"/>
+          </w:tcPr>
+          <w:p>
+            <w:pPr>
+              <w:bidi/>
+              <w:jc w:val="right"/>
+            </w:pPr>
+            <w:r/>
+            <w:r>
+              <w:rPr>
+                <w:rFonts w:ascii="David" w:hAnsi="David" w:cs="David"/>
+                <w:b w:val="0"/>
+                <w:sz w:val="19"/>
+                <w:rtl/>
+              </w:rPr>
+              <w:t>סימן ק״ח</w:t>
+            </w:r>
+          </w:p>
+        </w:tc>
+        <w:tc>
+          <w:tcPr>
+            <w:tcW w:type="dxa" w:w="1757"/>
+          </w:tcPr>
+          <w:p>
+            <w:pPr>
+              <w:bidi/>
+              <w:jc w:val="right"/>
+            </w:pPr>
+            <w:r/>
+            <w:r>
+              <w:rPr>
+                <w:rFonts w:ascii="David" w:hAnsi="David" w:cs="David"/>
+                <w:b w:val="0"/>
+                <w:sz w:val="19"/>
+                <w:rtl/>
+              </w:rPr>
+              <w:t>בענין תפילת תשלומין</w:t>
+            </w:r>
+          </w:p>
+        </w:tc>
+        <w:tc>
+          <w:tcPr>
+            <w:tcW w:type="dxa" w:w="1757"/>
+          </w:tcPr>
+          <w:p>
+            <w:pPr>
+              <w:bidi/>
+              <w:jc w:val="right"/>
+            </w:pPr>
+            <w:r/>
+            <w:r>
+              <w:rPr>
+                <w:rFonts w:ascii="David" w:hAnsi="David" w:cs="David"/>
+                <w:b w:val="0"/>
+                <w:sz w:val="19"/>
+                <w:rtl/>
+              </w:rPr>
+              <w:t>ראש הכולל הרב ר׳ משה זאדה שליט״א</w:t>
+            </w:r>
+          </w:p>
+        </w:tc>
+        <w:tc>
+          <w:tcPr>
+            <w:tcW w:type="dxa" w:w="1757"/>
+          </w:tcPr>
+          <w:p>
+            <w:pPr>
+              <w:bidi/>
+              <w:jc w:val="right"/>
+            </w:pPr>
+            <w:r/>
+            <w:r>
+              <w:rPr>
+                <w:rFonts w:ascii="David" w:hAnsi="David" w:cs="David"/>
+                <w:b w:val="0"/>
+                <w:sz w:val="19"/>
+                <w:rtl/>
+              </w:rPr>
+              <w:t>סימן קח - משה זאדה.docx</w:t>
+            </w:r>
+          </w:p>
+        </w:tc>
+        <w:tc>
+          <w:tcPr>
+            <w:tcW w:type="dxa" w:w="1757"/>
+          </w:tcPr>
+          <w:p>
+            <w:pPr>
+              <w:bidi/>
+              <w:jc w:val="right"/>
+            </w:pPr>
+            <w:r/>
+            <w:r>
+              <w:rPr>
+                <w:rFonts w:ascii="David" w:hAnsi="David" w:cs="David"/>
+                <w:b w:val="0"/>
+                <w:sz w:val="19"/>
+                <w:rtl/>
+              </w:rPr>
+            </w:r>
+          </w:p>
+        </w:tc>
+      </w:tr>
+      <w:tr>
+        <w:tc>
+          <w:tcPr>
+            <w:tcW w:type="dxa" w:w="1757"/>
+          </w:tcPr>
+          <w:p>
+            <w:pPr>
+              <w:bidi/>
+              <w:jc w:val="right"/>
+            </w:pPr>
+            <w:r/>
+            <w:r>
+              <w:rPr>
+                <w:rFonts w:ascii="David" w:hAnsi="David" w:cs="David"/>
+                <w:b w:val="0"/>
+                <w:sz w:val="19"/>
+                <w:rtl/>
+              </w:rPr>
+              <w:t>603</w:t>
+            </w:r>
+          </w:p>
+        </w:tc>
+        <w:tc>
+          <w:tcPr>
+            <w:tcW w:type="dxa" w:w="1757"/>
+          </w:tcPr>
+          <w:p>
+            <w:pPr>
+              <w:bidi/>
+              <w:jc w:val="right"/>
+            </w:pPr>
+            <w:r/>
+            <w:r>
+              <w:rPr>
+                <w:rFonts w:ascii="David" w:hAnsi="David" w:cs="David"/>
+                <w:b w:val="0"/>
+                <w:sz w:val="19"/>
+                <w:rtl/>
+              </w:rPr>
+              <w:t>יורה דעה סימן של״ד</w:t>
+            </w:r>
+          </w:p>
+        </w:tc>
+        <w:tc>
+          <w:tcPr>
+            <w:tcW w:type="dxa" w:w="1757"/>
+          </w:tcPr>
+          <w:p>
+            <w:pPr>
+              <w:bidi/>
+              <w:jc w:val="right"/>
+            </w:pPr>
+            <w:r/>
+            <w:r>
+              <w:rPr>
+                <w:rFonts w:ascii="David" w:hAnsi="David" w:cs="David"/>
+                <w:b w:val="0"/>
+                <w:sz w:val="19"/>
+                <w:rtl/>
+              </w:rPr>
+              <w:t>צירוף מנודה לדבר שבקדושה ולמגילה [ובעניין נידוי בזמן הזה]</w:t>
+            </w:r>
+          </w:p>
+        </w:tc>
+        <w:tc>
+          <w:tcPr>
+            <w:tcW w:type="dxa" w:w="1757"/>
+          </w:tcPr>
+          <w:p>
+            <w:pPr>
+              <w:bidi/>
+              <w:jc w:val="right"/>
+            </w:pPr>
+            <w:r/>
+            <w:r>
+              <w:rPr>
+                <w:rFonts w:ascii="David" w:hAnsi="David" w:cs="David"/>
+                <w:b w:val="0"/>
+                <w:sz w:val="19"/>
+                <w:rtl/>
+              </w:rPr>
+              <w:t>הרב עזרא בטאט שליט״א</w:t>
+            </w:r>
+          </w:p>
+        </w:tc>
+        <w:tc>
+          <w:tcPr>
+            <w:tcW w:type="dxa" w:w="1757"/>
+          </w:tcPr>
+          <w:p>
+            <w:pPr>
+              <w:bidi/>
+              <w:jc w:val="right"/>
+            </w:pPr>
+            <w:r/>
+            <w:r>
+              <w:rPr>
+                <w:rFonts w:ascii="David" w:hAnsi="David" w:cs="David"/>
+                <w:b w:val="0"/>
+                <w:sz w:val="19"/>
+                <w:rtl/>
+              </w:rPr>
+              <w:t>חוברת מתוקנת.docx</w:t>
+            </w:r>
+          </w:p>
+        </w:tc>
+        <w:tc>
+          <w:tcPr>
+            <w:tcW w:type="dxa" w:w="1757"/>
+          </w:tcPr>
+          <w:p>
+            <w:pPr>
+              <w:bidi/>
+              <w:jc w:val="right"/>
+            </w:pPr>
+            <w:r/>
+            <w:r>
+              <w:rPr>
+                <w:rFonts w:ascii="David" w:hAnsi="David" w:cs="David"/>
+                <w:b w:val="0"/>
+                <w:sz w:val="19"/>
+                <w:rtl/>
+              </w:rPr>
+            </w:r>
+          </w:p>
+        </w:tc>
+      </w:tr>
+      <w:tr>
+        <w:tc>
+          <w:tcPr>
+            <w:tcW w:type="dxa" w:w="1757"/>
+          </w:tcPr>
+          <w:p>
+            <w:pPr>
+              <w:bidi/>
+              <w:jc w:val="right"/>
+            </w:pPr>
+            <w:r/>
+            <w:r>
+              <w:rPr>
+                <w:rFonts w:ascii="David" w:hAnsi="David" w:cs="David"/>
+                <w:b w:val="0"/>
+                <w:sz w:val="19"/>
+                <w:rtl/>
+              </w:rPr>
+              <w:t>611</w:t>
             </w:r>
           </w:p>
         </w:tc>

</xml_diff>

<commit_message>
Final booklet: editor's decisions applied (ברכת אברהם title; two summaries by the Rosh HaKollel), print files, reports
Co-Authored-By: Claude Sonnet 5.5 <noreply@anthropic.com>
Claude-Session: https://claude.ai/code/session_0161ijXJJcwCxR7y44e5HXLU
</commit_message>
<xml_diff>
--- a/output/doch-shiluv-chavurot.docx
+++ b/output/doch-shiluv-chavurot.docx
@@ -208,7 +208,7 @@
                 <w:sz w:val="19"/>
                 <w:rtl/>
               </w:rPr>
-              <w:t>23</w:t>
+              <w:t>24</w:t>
             </w:r>
           </w:p>
         </w:tc>
@@ -335,7 +335,7 @@
                 <w:sz w:val="19"/>
                 <w:rtl/>
               </w:rPr>
-              <w:t>78</w:t>
+              <w:t>80</w:t>
             </w:r>
           </w:p>
         </w:tc>
@@ -463,7 +463,7 @@
                 <w:sz w:val="19"/>
                 <w:rtl/>
               </w:rPr>
-              <w:t>152</w:t>
+              <w:t>155</w:t>
             </w:r>
           </w:p>
         </w:tc>
@@ -590,7 +590,7 @@
                 <w:sz w:val="19"/>
                 <w:rtl/>
               </w:rPr>
-              <w:t>155</w:t>
+              <w:t>158</w:t>
             </w:r>
           </w:p>
         </w:tc>
@@ -717,7 +717,7 @@
                 <w:sz w:val="19"/>
                 <w:rtl/>
               </w:rPr>
-              <w:t>159</w:t>
+              <w:t>162</w:t>
             </w:r>
           </w:p>
         </w:tc>
@@ -844,7 +844,7 @@
                 <w:sz w:val="19"/>
                 <w:rtl/>
               </w:rPr>
-              <w:t>161</w:t>
+              <w:t>164</w:t>
             </w:r>
           </w:p>
         </w:tc>
@@ -971,7 +971,7 @@
                 <w:sz w:val="19"/>
                 <w:rtl/>
               </w:rPr>
-              <w:t>164</w:t>
+              <w:t>167</w:t>
             </w:r>
           </w:p>
         </w:tc>
@@ -1099,7 +1099,7 @@
                 <w:sz w:val="19"/>
                 <w:rtl/>
               </w:rPr>
-              <w:t>178</w:t>
+              <w:t>181</w:t>
             </w:r>
           </w:p>
         </w:tc>
@@ -1227,7 +1227,7 @@
                 <w:sz w:val="19"/>
                 <w:rtl/>
               </w:rPr>
-              <w:t>180</w:t>
+              <w:t>183</w:t>
             </w:r>
           </w:p>
         </w:tc>
@@ -1354,7 +1354,7 @@
                 <w:sz w:val="19"/>
                 <w:rtl/>
               </w:rPr>
-              <w:t>183</w:t>
+              <w:t>186</w:t>
             </w:r>
           </w:p>
         </w:tc>
@@ -1481,7 +1481,7 @@
                 <w:sz w:val="19"/>
                 <w:rtl/>
               </w:rPr>
-              <w:t>185</w:t>
+              <w:t>188</w:t>
             </w:r>
           </w:p>
         </w:tc>
@@ -1608,7 +1608,7 @@
                 <w:sz w:val="19"/>
                 <w:rtl/>
               </w:rPr>
-              <w:t>188</w:t>
+              <w:t>192</w:t>
             </w:r>
           </w:p>
         </w:tc>
@@ -1736,7 +1736,7 @@
                 <w:sz w:val="19"/>
                 <w:rtl/>
               </w:rPr>
-              <w:t>193</w:t>
+              <w:t>197</w:t>
             </w:r>
           </w:p>
         </w:tc>
@@ -1863,7 +1863,7 @@
                 <w:sz w:val="19"/>
                 <w:rtl/>
               </w:rPr>
-              <w:t>195</w:t>
+              <w:t>199</w:t>
             </w:r>
           </w:p>
         </w:tc>
@@ -1990,7 +1990,7 @@
                 <w:sz w:val="19"/>
                 <w:rtl/>
               </w:rPr>
-              <w:t>196</w:t>
+              <w:t>200</w:t>
             </w:r>
           </w:p>
         </w:tc>
@@ -2117,7 +2117,7 @@
                 <w:sz w:val="19"/>
                 <w:rtl/>
               </w:rPr>
-              <w:t>269</w:t>
+              <w:t>275</w:t>
             </w:r>
           </w:p>
         </w:tc>
@@ -2245,7 +2245,7 @@
                 <w:sz w:val="19"/>
                 <w:rtl/>
               </w:rPr>
-              <w:t>273</w:t>
+              <w:t>279</w:t>
             </w:r>
           </w:p>
         </w:tc>
@@ -2373,7 +2373,7 @@
                 <w:sz w:val="19"/>
                 <w:rtl/>
               </w:rPr>
-              <w:t>277</w:t>
+              <w:t>283</w:t>
             </w:r>
           </w:p>
         </w:tc>
@@ -2501,7 +2501,7 @@
                 <w:sz w:val="19"/>
                 <w:rtl/>
               </w:rPr>
-              <w:t>280</w:t>
+              <w:t>286</w:t>
             </w:r>
           </w:p>
         </w:tc>
@@ -2629,7 +2629,7 @@
                 <w:sz w:val="19"/>
                 <w:rtl/>
               </w:rPr>
-              <w:t>292</w:t>
+              <w:t>298</w:t>
             </w:r>
           </w:p>
         </w:tc>
@@ -2757,7 +2757,7 @@
                 <w:sz w:val="19"/>
                 <w:rtl/>
               </w:rPr>
-              <w:t>297</w:t>
+              <w:t>304</w:t>
             </w:r>
           </w:p>
         </w:tc>
@@ -2884,7 +2884,7 @@
                 <w:sz w:val="19"/>
                 <w:rtl/>
               </w:rPr>
-              <w:t>301</w:t>
+              <w:t>308</w:t>
             </w:r>
           </w:p>
         </w:tc>
@@ -3011,7 +3011,7 @@
                 <w:sz w:val="19"/>
                 <w:rtl/>
               </w:rPr>
-              <w:t>315</w:t>
+              <w:t>322</w:t>
             </w:r>
           </w:p>
         </w:tc>
@@ -3138,7 +3138,7 @@
                 <w:sz w:val="19"/>
                 <w:rtl/>
               </w:rPr>
-              <w:t>320</w:t>
+              <w:t>327</w:t>
             </w:r>
           </w:p>
         </w:tc>
@@ -3265,7 +3265,7 @@
                 <w:sz w:val="19"/>
                 <w:rtl/>
               </w:rPr>
-              <w:t>326</w:t>
+              <w:t>333</w:t>
             </w:r>
           </w:p>
         </w:tc>
@@ -3392,7 +3392,7 @@
                 <w:sz w:val="19"/>
                 <w:rtl/>
               </w:rPr>
-              <w:t>328</w:t>
+              <w:t>335</w:t>
             </w:r>
           </w:p>
         </w:tc>
@@ -3519,7 +3519,7 @@
                 <w:sz w:val="19"/>
                 <w:rtl/>
               </w:rPr>
-              <w:t>334</w:t>
+              <w:t>342</w:t>
             </w:r>
           </w:p>
         </w:tc>
@@ -3646,7 +3646,7 @@
                 <w:sz w:val="19"/>
                 <w:rtl/>
               </w:rPr>
-              <w:t>345</w:t>
+              <w:t>354</w:t>
             </w:r>
           </w:p>
         </w:tc>
@@ -3773,7 +3773,7 @@
                 <w:sz w:val="19"/>
                 <w:rtl/>
               </w:rPr>
-              <w:t>356</w:t>
+              <w:t>365</w:t>
             </w:r>
           </w:p>
         </w:tc>
@@ -3900,7 +3900,7 @@
                 <w:sz w:val="19"/>
                 <w:rtl/>
               </w:rPr>
-              <w:t>359</w:t>
+              <w:t>368</w:t>
             </w:r>
           </w:p>
         </w:tc>
@@ -4028,7 +4028,7 @@
                 <w:sz w:val="19"/>
                 <w:rtl/>
               </w:rPr>
-              <w:t>373</w:t>
+              <w:t>382</w:t>
             </w:r>
           </w:p>
         </w:tc>
@@ -4155,7 +4155,7 @@
                 <w:sz w:val="19"/>
                 <w:rtl/>
               </w:rPr>
-              <w:t>376</w:t>
+              <w:t>385</w:t>
             </w:r>
           </w:p>
         </w:tc>
@@ -4283,7 +4283,7 @@
                 <w:sz w:val="19"/>
                 <w:rtl/>
               </w:rPr>
-              <w:t>379</w:t>
+              <w:t>388</w:t>
             </w:r>
           </w:p>
         </w:tc>
@@ -4410,7 +4410,7 @@
                 <w:sz w:val="19"/>
                 <w:rtl/>
               </w:rPr>
-              <w:t>383</w:t>
+              <w:t>392</w:t>
             </w:r>
           </w:p>
         </w:tc>
@@ -4538,7 +4538,7 @@
                 <w:sz w:val="19"/>
                 <w:rtl/>
               </w:rPr>
-              <w:t>386</w:t>
+              <w:t>396</w:t>
             </w:r>
           </w:p>
         </w:tc>
@@ -4665,7 +4665,7 @@
                 <w:sz w:val="19"/>
                 <w:rtl/>
               </w:rPr>
-              <w:t>389</w:t>
+              <w:t>399</w:t>
             </w:r>
           </w:p>
         </w:tc>
@@ -4793,7 +4793,7 @@
                 <w:sz w:val="19"/>
                 <w:rtl/>
               </w:rPr>
-              <w:t>392</w:t>
+              <w:t>402</w:t>
             </w:r>
           </w:p>
         </w:tc>
@@ -4920,7 +4920,7 @@
                 <w:sz w:val="19"/>
                 <w:rtl/>
               </w:rPr>
-              <w:t>395</w:t>
+              <w:t>405</w:t>
             </w:r>
           </w:p>
         </w:tc>
@@ -5047,7 +5047,7 @@
                 <w:sz w:val="19"/>
                 <w:rtl/>
               </w:rPr>
-              <w:t>401</w:t>
+              <w:t>412</w:t>
             </w:r>
           </w:p>
         </w:tc>
@@ -5089,7 +5089,7 @@
                 <w:sz w:val="19"/>
                 <w:rtl/>
               </w:rPr>
-              <w:t>משקרא ק״ש אין צריך לברך שכבר נפטר באהבה רבה</w:t>
+              <w:t>ברכת אברהם</w:t>
             </w:r>
           </w:p>
         </w:tc>
@@ -5152,7 +5152,7 @@
                 <w:sz w:val="19"/>
                 <w:rtl/>
               </w:rPr>
-              <w:t>ללא מחבר בקובץ ובשמו; בראש הקובץ מופיעה הכותרת ״ברכת אברהם״ והיא הובאה כתת-כותרת; הכותרת נלקחה משם הקובץ; ללא סעיף בשם הקובץ – הוצב בתחילת הסימן</w:t>
+              <w:t>ללא מחבר בקובץ ובשמו (נשאר ללא מחבר, לפי הנחיית העורך); בראש הקובץ מופיעה הכותרת ״ברכת אברהם״ - היא כותרת המאמר, והשורה הראשונה של הטקסט נשארה בגוף המאמר</w:t>
             </w:r>
           </w:p>
         </w:tc>
@@ -5175,7 +5175,7 @@
                 <w:sz w:val="19"/>
                 <w:rtl/>
               </w:rPr>
-              <w:t>405</w:t>
+              <w:t>416</w:t>
             </w:r>
           </w:p>
         </w:tc>
@@ -5302,7 +5302,7 @@
                 <w:sz w:val="19"/>
                 <w:rtl/>
               </w:rPr>
-              <w:t>408</w:t>
+              <w:t>419</w:t>
             </w:r>
           </w:p>
         </w:tc>
@@ -5429,7 +5429,7 @@
                 <w:sz w:val="19"/>
                 <w:rtl/>
               </w:rPr>
-              <w:t>411</w:t>
+              <w:t>422</w:t>
             </w:r>
           </w:p>
         </w:tc>
@@ -5556,7 +5556,7 @@
                 <w:sz w:val="19"/>
                 <w:rtl/>
               </w:rPr>
-              <w:t>414</w:t>
+              <w:t>425</w:t>
             </w:r>
           </w:p>
         </w:tc>
@@ -5683,7 +5683,7 @@
                 <w:sz w:val="19"/>
                 <w:rtl/>
               </w:rPr>
-              <w:t>418</w:t>
+              <w:t>429</w:t>
             </w:r>
           </w:p>
         </w:tc>
@@ -5810,7 +5810,7 @@
                 <w:sz w:val="19"/>
                 <w:rtl/>
               </w:rPr>
-              <w:t>431</w:t>
+              <w:t>442</w:t>
             </w:r>
           </w:p>
         </w:tc>
@@ -5937,7 +5937,7 @@
                 <w:sz w:val="19"/>
                 <w:rtl/>
               </w:rPr>
-              <w:t>435</w:t>
+              <w:t>446</w:t>
             </w:r>
           </w:p>
         </w:tc>
@@ -6042,7 +6042,7 @@
                 <w:sz w:val="19"/>
                 <w:rtl/>
               </w:rPr>
-              <w:t>המחבר אינו מופיע בשם הקובץ או בגוף הטקסט – נקבע לפי מאפייני הקובץ (נאור רוזין) והמשכיות הסדרה בסימן ס׳ סעיף ד׳</w:t>
+              <w:t>המחבר אינו מופיע בשם הקובץ או בגוף הטקסט – נקבע לפי מאפייני הקובץ (נאור רוזין) והמשכיות הסדרה בסימן ס׳ סעיף ד׳; השיוך אושר על ידי העורך</w:t>
             </w:r>
           </w:p>
         </w:tc>
@@ -6065,7 +6065,7 @@
                 <w:sz w:val="19"/>
                 <w:rtl/>
               </w:rPr>
-              <w:t>448</w:t>
+              <w:t>459</w:t>
             </w:r>
           </w:p>
         </w:tc>
@@ -6170,7 +6170,7 @@
                 <w:sz w:val="19"/>
                 <w:rtl/>
               </w:rPr>
-              <w:t>המחבר אינו מופיע בשם הקובץ או בגוף הטקסט – נקבע לפי מאפייני הקובץ (נאור רוזין); ממשיך את ״עיקרי הדברים״ (״התבאר עד כה בהרחבה״)</w:t>
+              <w:t>המחבר אינו מופיע בשם הקובץ או בגוף הטקסט – נקבע לפי מאפייני הקובץ (נאור רוזין); ממשיך את ״עיקרי הדברים״ (״התבאר עד כה בהרחבה״); השיוך אושר על ידי העורך</w:t>
             </w:r>
           </w:p>
         </w:tc>
@@ -6193,7 +6193,7 @@
                 <w:sz w:val="19"/>
                 <w:rtl/>
               </w:rPr>
-              <w:t>456</w:t>
+              <w:t>467</w:t>
             </w:r>
           </w:p>
         </w:tc>
@@ -6321,7 +6321,7 @@
                 <w:sz w:val="19"/>
                 <w:rtl/>
               </w:rPr>
-              <w:t>520</w:t>
+              <w:t>522</w:t>
             </w:r>
           </w:p>
         </w:tc>
@@ -6363,69 +6363,70 @@
                 <w:sz w:val="19"/>
                 <w:rtl/>
               </w:rPr>
-              <w:t>בענין קבלת עול מלכות שמים</w:t>
-            </w:r>
-          </w:p>
-        </w:tc>
-        <w:tc>
-          <w:tcPr>
-            <w:tcW w:type="dxa" w:w="1757"/>
-          </w:tcPr>
-          <w:p>
-            <w:pPr>
-              <w:bidi/>
-              <w:jc w:val="right"/>
-            </w:pPr>
-            <w:r/>
-            <w:r>
-              <w:rPr>
-                <w:rFonts w:ascii="David" w:hAnsi="David" w:cs="David"/>
-                <w:b w:val="0"/>
-                <w:sz w:val="19"/>
-                <w:rtl/>
-              </w:rPr>
-              <w:t>הרב יעקב ישראל שטרן שליט״א</w:t>
-            </w:r>
-          </w:p>
-        </w:tc>
-        <w:tc>
-          <w:tcPr>
-            <w:tcW w:type="dxa" w:w="1757"/>
-          </w:tcPr>
-          <w:p>
-            <w:pPr>
-              <w:bidi/>
-              <w:jc w:val="right"/>
-            </w:pPr>
-            <w:r/>
-            <w:r>
-              <w:rPr>
-                <w:rFonts w:ascii="David" w:hAnsi="David" w:cs="David"/>
-                <w:b w:val="0"/>
-                <w:sz w:val="19"/>
-                <w:rtl/>
-              </w:rPr>
-              <w:t>סימן סא (2).docx</w:t>
-            </w:r>
-          </w:p>
-        </w:tc>
-        <w:tc>
-          <w:tcPr>
-            <w:tcW w:type="dxa" w:w="1757"/>
-          </w:tcPr>
-          <w:p>
-            <w:pPr>
-              <w:bidi/>
-              <w:jc w:val="right"/>
-            </w:pPr>
-            <w:r/>
-            <w:r>
-              <w:rPr>
-                <w:rFonts w:ascii="David" w:hAnsi="David" w:cs="David"/>
-                <w:b w:val="0"/>
-                <w:sz w:val="19"/>
-                <w:rtl/>
-              </w:rPr>
+              <w:t>סיכום השיטות בענין השלמת הרמ״ח תיבות שבק״ש</w:t>
+            </w:r>
+          </w:p>
+        </w:tc>
+        <w:tc>
+          <w:tcPr>
+            <w:tcW w:type="dxa" w:w="1757"/>
+          </w:tcPr>
+          <w:p>
+            <w:pPr>
+              <w:bidi/>
+              <w:jc w:val="right"/>
+            </w:pPr>
+            <w:r/>
+            <w:r>
+              <w:rPr>
+                <w:rFonts w:ascii="David" w:hAnsi="David" w:cs="David"/>
+                <w:b w:val="0"/>
+                <w:sz w:val="19"/>
+                <w:rtl/>
+              </w:rPr>
+              <w:t>ראש הכולל הרב ר׳ משה זאדה שליט״א</w:t>
+            </w:r>
+          </w:p>
+        </w:tc>
+        <w:tc>
+          <w:tcPr>
+            <w:tcW w:type="dxa" w:w="1757"/>
+          </w:tcPr>
+          <w:p>
+            <w:pPr>
+              <w:bidi/>
+              <w:jc w:val="right"/>
+            </w:pPr>
+            <w:r/>
+            <w:r>
+              <w:rPr>
+                <w:rFonts w:ascii="David" w:hAnsi="David" w:cs="David"/>
+                <w:b w:val="0"/>
+                <w:sz w:val="19"/>
+                <w:rtl/>
+              </w:rPr>
+              <w:t>סימן סא סיכום השיטות בענין השלמת הרמח תיבות שבקש.docx</w:t>
+            </w:r>
+          </w:p>
+        </w:tc>
+        <w:tc>
+          <w:tcPr>
+            <w:tcW w:type="dxa" w:w="1757"/>
+          </w:tcPr>
+          <w:p>
+            <w:pPr>
+              <w:bidi/>
+              <w:jc w:val="right"/>
+            </w:pPr>
+            <w:r/>
+            <w:r>
+              <w:rPr>
+                <w:rFonts w:ascii="David" w:hAnsi="David" w:cs="David"/>
+                <w:b w:val="0"/>
+                <w:sz w:val="19"/>
+                <w:rtl/>
+              </w:rPr>
+              <w:t>ללא מחבר בקובץ ובשמו; המחבר - ראש הכולל הרב משה זאדה (לפי הנחיית העורך); טקסט שונה מ״סימן סא.docx״ באותו נושא – נכללו שניהם</w:t>
             </w:r>
           </w:p>
         </w:tc>
@@ -6448,7 +6449,7 @@
                 <w:sz w:val="19"/>
                 <w:rtl/>
               </w:rPr>
-              <w:t>528</w:t>
+              <w:t>535</w:t>
             </w:r>
           </w:p>
         </w:tc>
@@ -6490,49 +6491,49 @@
                 <w:sz w:val="19"/>
                 <w:rtl/>
               </w:rPr>
-              <w:t>בענין השלמת רמ״ח תיבות בקר״ש</w:t>
-            </w:r>
-          </w:p>
-        </w:tc>
-        <w:tc>
-          <w:tcPr>
-            <w:tcW w:type="dxa" w:w="1757"/>
-          </w:tcPr>
-          <w:p>
-            <w:pPr>
-              <w:bidi/>
-              <w:jc w:val="right"/>
-            </w:pPr>
-            <w:r/>
-            <w:r>
-              <w:rPr>
-                <w:rFonts w:ascii="David" w:hAnsi="David" w:cs="David"/>
-                <w:b w:val="0"/>
-                <w:sz w:val="19"/>
-                <w:rtl/>
-              </w:rPr>
-              <w:t>הרב נאור רוזין שליט״א</w:t>
-            </w:r>
-          </w:p>
-        </w:tc>
-        <w:tc>
-          <w:tcPr>
-            <w:tcW w:type="dxa" w:w="1757"/>
-          </w:tcPr>
-          <w:p>
-            <w:pPr>
-              <w:bidi/>
-              <w:jc w:val="right"/>
-            </w:pPr>
-            <w:r/>
-            <w:r>
-              <w:rPr>
-                <w:rFonts w:ascii="David" w:hAnsi="David" w:cs="David"/>
-                <w:b w:val="0"/>
-                <w:sz w:val="19"/>
-                <w:rtl/>
-              </w:rPr>
-              <w:t>בענין השלמת רמח תיבות בקריאת שמע.docx</w:t>
+              <w:t>בענין קבלת עול מלכות שמים</w:t>
+            </w:r>
+          </w:p>
+        </w:tc>
+        <w:tc>
+          <w:tcPr>
+            <w:tcW w:type="dxa" w:w="1757"/>
+          </w:tcPr>
+          <w:p>
+            <w:pPr>
+              <w:bidi/>
+              <w:jc w:val="right"/>
+            </w:pPr>
+            <w:r/>
+            <w:r>
+              <w:rPr>
+                <w:rFonts w:ascii="David" w:hAnsi="David" w:cs="David"/>
+                <w:b w:val="0"/>
+                <w:sz w:val="19"/>
+                <w:rtl/>
+              </w:rPr>
+              <w:t>הרב יעקב ישראל שטרן שליט״א</w:t>
+            </w:r>
+          </w:p>
+        </w:tc>
+        <w:tc>
+          <w:tcPr>
+            <w:tcW w:type="dxa" w:w="1757"/>
+          </w:tcPr>
+          <w:p>
+            <w:pPr>
+              <w:bidi/>
+              <w:jc w:val="right"/>
+            </w:pPr>
+            <w:r/>
+            <w:r>
+              <w:rPr>
+                <w:rFonts w:ascii="David" w:hAnsi="David" w:cs="David"/>
+                <w:b w:val="0"/>
+                <w:sz w:val="19"/>
+                <w:rtl/>
+              </w:rPr>
+              <w:t>סימן סא (2).docx</w:t>
             </w:r>
           </w:p>
         </w:tc>
@@ -6575,7 +6576,7 @@
                 <w:sz w:val="19"/>
                 <w:rtl/>
               </w:rPr>
-              <w:t>538</w:t>
+              <w:t>543</w:t>
             </w:r>
           </w:p>
         </w:tc>
@@ -6617,70 +6618,69 @@
                 <w:sz w:val="19"/>
                 <w:rtl/>
               </w:rPr>
-              <w:t>בענין השלמת רמ״ח תיבות בק״ש (סיכום)</w:t>
-            </w:r>
-          </w:p>
-        </w:tc>
-        <w:tc>
-          <w:tcPr>
-            <w:tcW w:type="dxa" w:w="1757"/>
-          </w:tcPr>
-          <w:p>
-            <w:pPr>
-              <w:bidi/>
-              <w:jc w:val="right"/>
-            </w:pPr>
-            <w:r/>
-            <w:r>
-              <w:rPr>
-                <w:rFonts w:ascii="David" w:hAnsi="David" w:cs="David"/>
-                <w:b w:val="0"/>
-                <w:sz w:val="19"/>
-                <w:rtl/>
-              </w:rPr>
-              <w:t>—</w:t>
-            </w:r>
-          </w:p>
-        </w:tc>
-        <w:tc>
-          <w:tcPr>
-            <w:tcW w:type="dxa" w:w="1757"/>
-          </w:tcPr>
-          <w:p>
-            <w:pPr>
-              <w:bidi/>
-              <w:jc w:val="right"/>
-            </w:pPr>
-            <w:r/>
-            <w:r>
-              <w:rPr>
-                <w:rFonts w:ascii="David" w:hAnsi="David" w:cs="David"/>
-                <w:b w:val="0"/>
-                <w:sz w:val="19"/>
-                <w:rtl/>
-              </w:rPr>
-              <w:t>סימן סא.docx</w:t>
-            </w:r>
-          </w:p>
-        </w:tc>
-        <w:tc>
-          <w:tcPr>
-            <w:tcW w:type="dxa" w:w="1757"/>
-          </w:tcPr>
-          <w:p>
-            <w:pPr>
-              <w:bidi/>
-              <w:jc w:val="right"/>
-            </w:pPr>
-            <w:r/>
-            <w:r>
-              <w:rPr>
-                <w:rFonts w:ascii="David" w:hAnsi="David" w:cs="David"/>
-                <w:b w:val="0"/>
-                <w:sz w:val="19"/>
-                <w:rtl/>
-              </w:rPr>
-              <w:t>סיכום קצר; נוסף ״(סיכום)״ לכותרת כדי להבדילו מהמאמר הארוך באותו נושא</w:t>
+              <w:t>בענין השלמת רמ״ח תיבות בקר״ש</w:t>
+            </w:r>
+          </w:p>
+        </w:tc>
+        <w:tc>
+          <w:tcPr>
+            <w:tcW w:type="dxa" w:w="1757"/>
+          </w:tcPr>
+          <w:p>
+            <w:pPr>
+              <w:bidi/>
+              <w:jc w:val="right"/>
+            </w:pPr>
+            <w:r/>
+            <w:r>
+              <w:rPr>
+                <w:rFonts w:ascii="David" w:hAnsi="David" w:cs="David"/>
+                <w:b w:val="0"/>
+                <w:sz w:val="19"/>
+                <w:rtl/>
+              </w:rPr>
+              <w:t>הרב נאור רוזין שליט״א</w:t>
+            </w:r>
+          </w:p>
+        </w:tc>
+        <w:tc>
+          <w:tcPr>
+            <w:tcW w:type="dxa" w:w="1757"/>
+          </w:tcPr>
+          <w:p>
+            <w:pPr>
+              <w:bidi/>
+              <w:jc w:val="right"/>
+            </w:pPr>
+            <w:r/>
+            <w:r>
+              <w:rPr>
+                <w:rFonts w:ascii="David" w:hAnsi="David" w:cs="David"/>
+                <w:b w:val="0"/>
+                <w:sz w:val="19"/>
+                <w:rtl/>
+              </w:rPr>
+              <w:t>בענין השלמת רמח תיבות בקריאת שמע.docx</w:t>
+            </w:r>
+          </w:p>
+        </w:tc>
+        <w:tc>
+          <w:tcPr>
+            <w:tcW w:type="dxa" w:w="1757"/>
+          </w:tcPr>
+          <w:p>
+            <w:pPr>
+              <w:bidi/>
+              <w:jc w:val="right"/>
+            </w:pPr>
+            <w:r/>
+            <w:r>
+              <w:rPr>
+                <w:rFonts w:ascii="David" w:hAnsi="David" w:cs="David"/>
+                <w:b w:val="0"/>
+                <w:sz w:val="19"/>
+                <w:rtl/>
+              </w:rPr>
             </w:r>
           </w:p>
         </w:tc>
@@ -6703,7 +6703,7 @@
                 <w:sz w:val="19"/>
                 <w:rtl/>
               </w:rPr>
-              <w:t>540</w:t>
+              <w:t>553</w:t>
             </w:r>
           </w:p>
         </w:tc>
@@ -6745,7 +6745,7 @@
                 <w:sz w:val="19"/>
                 <w:rtl/>
               </w:rPr>
-              <w:t>סיכום השיטות בענין השלמת הרמ״ח תיבות שבק״ש</w:t>
+              <w:t>בענין השלמת רמ״ח תיבות בק״ש (סיכום)</w:t>
             </w:r>
           </w:p>
         </w:tc>
@@ -6787,28 +6787,28 @@
                 <w:sz w:val="19"/>
                 <w:rtl/>
               </w:rPr>
-              <w:t>סימן סא סיכום השיטות בענין השלמת הרמח תיבות שבקש.docx</w:t>
-            </w:r>
-          </w:p>
-        </w:tc>
-        <w:tc>
-          <w:tcPr>
-            <w:tcW w:type="dxa" w:w="1757"/>
-          </w:tcPr>
-          <w:p>
-            <w:pPr>
-              <w:bidi/>
-              <w:jc w:val="right"/>
-            </w:pPr>
-            <w:r/>
-            <w:r>
-              <w:rPr>
-                <w:rFonts w:ascii="David" w:hAnsi="David" w:cs="David"/>
-                <w:b w:val="0"/>
-                <w:sz w:val="19"/>
-                <w:rtl/>
-              </w:rPr>
-              <w:t>ללא מחבר בקובץ ובשמו; טקסט שונה מ״סימן סא.docx״ באותו נושא – נכללו שניהם</w:t>
+              <w:t>סימן סא.docx</w:t>
+            </w:r>
+          </w:p>
+        </w:tc>
+        <w:tc>
+          <w:tcPr>
+            <w:tcW w:type="dxa" w:w="1757"/>
+          </w:tcPr>
+          <w:p>
+            <w:pPr>
+              <w:bidi/>
+              <w:jc w:val="right"/>
+            </w:pPr>
+            <w:r/>
+            <w:r>
+              <w:rPr>
+                <w:rFonts w:ascii="David" w:hAnsi="David" w:cs="David"/>
+                <w:b w:val="0"/>
+                <w:sz w:val="19"/>
+                <w:rtl/>
+              </w:rPr>
+              <w:t>סיכום קצר; נוסף ״(סיכום)״ לכותרת כדי להבדילו מהמאמר הארוך באותו נושא</w:t>
             </w:r>
           </w:p>
         </w:tc>
@@ -6831,7 +6831,7 @@
                 <w:sz w:val="19"/>
                 <w:rtl/>
               </w:rPr>
-              <w:t>548</w:t>
+              <w:t>560</w:t>
             </w:r>
           </w:p>
         </w:tc>
@@ -6958,7 +6958,7 @@
                 <w:sz w:val="19"/>
                 <w:rtl/>
               </w:rPr>
-              <w:t>553</w:t>
+              <w:t>566</w:t>
             </w:r>
           </w:p>
         </w:tc>
@@ -7085,7 +7085,7 @@
                 <w:sz w:val="19"/>
                 <w:rtl/>
               </w:rPr>
-              <w:t>568</w:t>
+              <w:t>582</w:t>
             </w:r>
           </w:p>
         </w:tc>
@@ -7212,7 +7212,7 @@
                 <w:sz w:val="19"/>
                 <w:rtl/>
               </w:rPr>
-              <w:t>571</w:t>
+              <w:t>585</w:t>
             </w:r>
           </w:p>
         </w:tc>
@@ -7339,7 +7339,7 @@
                 <w:sz w:val="19"/>
                 <w:rtl/>
               </w:rPr>
-              <w:t>575</w:t>
+              <w:t>590</w:t>
             </w:r>
           </w:p>
         </w:tc>
@@ -7402,7 +7402,7 @@
                 <w:sz w:val="19"/>
                 <w:rtl/>
               </w:rPr>
-              <w:t>—</w:t>
+              <w:t>ראש הכולל הרב ר׳ משה זאדה שליט״א</w:t>
             </w:r>
           </w:p>
         </w:tc>
@@ -7444,7 +7444,7 @@
                 <w:sz w:val="19"/>
                 <w:rtl/>
               </w:rPr>
-              <w:t>ללא מחבר בקובץ ובשמו; ללא סעיף בשם הקובץ – הוצב בתחילת הסימן</w:t>
+              <w:t>ללא מחבר בקובץ ובשמו; המחבר - ראש הכולל הרב משה זאדה (לפי הנחיית העורך); ללא סעיף בשם הקובץ – הוצב בתחילת הסימן</w:t>
             </w:r>
           </w:p>
         </w:tc>
@@ -7467,7 +7467,7 @@
                 <w:sz w:val="19"/>
                 <w:rtl/>
               </w:rPr>
-              <w:t>579</w:t>
+              <w:t>594</w:t>
             </w:r>
           </w:p>
         </w:tc>
@@ -7594,7 +7594,7 @@
                 <w:sz w:val="19"/>
                 <w:rtl/>
               </w:rPr>
-              <w:t>583</w:t>
+              <w:t>598</w:t>
             </w:r>
           </w:p>
         </w:tc>
@@ -7721,7 +7721,7 @@
                 <w:sz w:val="19"/>
                 <w:rtl/>
               </w:rPr>
-              <w:t>586</w:t>
+              <w:t>602</w:t>
             </w:r>
           </w:p>
         </w:tc>
@@ -7848,7 +7848,7 @@
                 <w:sz w:val="19"/>
                 <w:rtl/>
               </w:rPr>
-              <w:t>590</w:t>
+              <w:t>606</w:t>
             </w:r>
           </w:p>
         </w:tc>
@@ -7976,7 +7976,7 @@
                 <w:sz w:val="19"/>
                 <w:rtl/>
               </w:rPr>
-              <w:t>594</w:t>
+              <w:t>610</w:t>
             </w:r>
           </w:p>
         </w:tc>
@@ -8103,7 +8103,7 @@
                 <w:sz w:val="19"/>
                 <w:rtl/>
               </w:rPr>
-              <w:t>598</w:t>
+              <w:t>614</w:t>
             </w:r>
           </w:p>
         </w:tc>
@@ -8230,7 +8230,7 @@
                 <w:sz w:val="19"/>
                 <w:rtl/>
               </w:rPr>
-              <w:t>603</w:t>
+              <w:t>620</w:t>
             </w:r>
           </w:p>
         </w:tc>
@@ -8357,7 +8357,7 @@
                 <w:sz w:val="19"/>
                 <w:rtl/>
               </w:rPr>
-              <w:t>611</w:t>
+              <w:t>628</w:t>
             </w:r>
           </w:p>
         </w:tc>

</xml_diff>